<commit_message>
docs: standardize document typography to black
</commit_message>
<xml_diff>
--- a/docs/软件测试报告.docx
+++ b/docs/软件测试报告.docx
@@ -10,7 +10,6 @@
         <w:rPr>
           <w:rFonts w:ascii="Calibri" w:eastAsia="黑体" w:hAnsi="Calibri"/>
           <w:b/>
-          <w:color w:val="000000"/>
           <w:sz w:val="48"/>
         </w:rPr>
         <w:t>软件测试报告</w:t>
@@ -268,7 +267,6 @@
         <w:rPr>
           <w:rFonts w:asciiTheme="minorHAnsi" w:eastAsiaTheme="minorEastAsia" w:hAnsiTheme="minorHAnsi"/>
           <w:noProof/>
-          <w:color w:val="auto"/>
           <w:kern w:val="2"/>
           <w:szCs w:val="24"/>
           <w:lang w:eastAsia="zh-CN"/>
@@ -284,7 +282,7 @@
       <w:r>
         <w:fldChar w:fldCharType="separate"/>
       </w:r>
-      <w:hyperlink w:anchor="_Toc241948518" w:history="1">
+      <w:hyperlink w:anchor="_Toc242037367" w:history="1">
         <w:r>
           <w:rPr>
             <w:rStyle w:val="aff9"/>
@@ -318,7 +316,7 @@
             <w:noProof/>
             <w:webHidden/>
           </w:rPr>
-          <w:instrText xml:space="preserve"> PAGEREF _Toc241948518 \h </w:instrText>
+          <w:instrText xml:space="preserve"> PAGEREF _Toc242037367 \h </w:instrText>
         </w:r>
         <w:r>
           <w:rPr>
@@ -358,14 +356,13 @@
         <w:rPr>
           <w:rFonts w:asciiTheme="minorHAnsi" w:eastAsiaTheme="minorEastAsia" w:hAnsiTheme="minorHAnsi"/>
           <w:noProof/>
-          <w:color w:val="auto"/>
           <w:kern w:val="2"/>
           <w:szCs w:val="24"/>
           <w:lang w:eastAsia="zh-CN"/>
           <w14:ligatures w14:val="standardContextual"/>
         </w:rPr>
       </w:pPr>
-      <w:hyperlink w:anchor="_Toc241948519" w:history="1">
+      <w:hyperlink w:anchor="_Toc242037368" w:history="1">
         <w:r>
           <w:rPr>
             <w:rStyle w:val="aff9"/>
@@ -399,7 +396,7 @@
             <w:noProof/>
             <w:webHidden/>
           </w:rPr>
-          <w:instrText xml:space="preserve"> PAGEREF _Toc241948519 \h </w:instrText>
+          <w:instrText xml:space="preserve"> PAGEREF _Toc242037368 \h </w:instrText>
         </w:r>
         <w:r>
           <w:rPr>
@@ -439,14 +436,13 @@
         <w:rPr>
           <w:rFonts w:asciiTheme="minorHAnsi" w:eastAsiaTheme="minorEastAsia" w:hAnsiTheme="minorHAnsi"/>
           <w:noProof/>
-          <w:color w:val="auto"/>
           <w:kern w:val="2"/>
           <w:szCs w:val="24"/>
           <w:lang w:eastAsia="zh-CN"/>
           <w14:ligatures w14:val="standardContextual"/>
         </w:rPr>
       </w:pPr>
-      <w:hyperlink w:anchor="_Toc241948520" w:history="1">
+      <w:hyperlink w:anchor="_Toc242037369" w:history="1">
         <w:r>
           <w:rPr>
             <w:rStyle w:val="aff9"/>
@@ -480,7 +476,7 @@
             <w:noProof/>
             <w:webHidden/>
           </w:rPr>
-          <w:instrText xml:space="preserve"> PAGEREF _Toc241948520 \h </w:instrText>
+          <w:instrText xml:space="preserve"> PAGEREF _Toc242037369 \h </w:instrText>
         </w:r>
         <w:r>
           <w:rPr>
@@ -520,14 +516,13 @@
         <w:rPr>
           <w:rFonts w:asciiTheme="minorHAnsi" w:eastAsiaTheme="minorEastAsia" w:hAnsiTheme="minorHAnsi"/>
           <w:noProof/>
-          <w:color w:val="auto"/>
           <w:kern w:val="2"/>
           <w:szCs w:val="24"/>
           <w:lang w:eastAsia="zh-CN"/>
           <w14:ligatures w14:val="standardContextual"/>
         </w:rPr>
       </w:pPr>
-      <w:hyperlink w:anchor="_Toc241948521" w:history="1">
+      <w:hyperlink w:anchor="_Toc242037370" w:history="1">
         <w:r>
           <w:rPr>
             <w:rStyle w:val="aff9"/>
@@ -561,7 +556,7 @@
             <w:noProof/>
             <w:webHidden/>
           </w:rPr>
-          <w:instrText xml:space="preserve"> PAGEREF _Toc241948521 \h </w:instrText>
+          <w:instrText xml:space="preserve"> PAGEREF _Toc242037370 \h </w:instrText>
         </w:r>
         <w:r>
           <w:rPr>
@@ -601,14 +596,13 @@
         <w:rPr>
           <w:rFonts w:asciiTheme="minorHAnsi" w:eastAsiaTheme="minorEastAsia" w:hAnsiTheme="minorHAnsi"/>
           <w:noProof/>
-          <w:color w:val="auto"/>
           <w:kern w:val="2"/>
           <w:szCs w:val="24"/>
           <w:lang w:eastAsia="zh-CN"/>
           <w14:ligatures w14:val="standardContextual"/>
         </w:rPr>
       </w:pPr>
-      <w:hyperlink w:anchor="_Toc241948522" w:history="1">
+      <w:hyperlink w:anchor="_Toc242037371" w:history="1">
         <w:r>
           <w:rPr>
             <w:rStyle w:val="aff9"/>
@@ -642,7 +636,7 @@
             <w:noProof/>
             <w:webHidden/>
           </w:rPr>
-          <w:instrText xml:space="preserve"> PAGEREF _Toc241948522 \h </w:instrText>
+          <w:instrText xml:space="preserve"> PAGEREF _Toc242037371 \h </w:instrText>
         </w:r>
         <w:r>
           <w:rPr>
@@ -682,14 +676,13 @@
         <w:rPr>
           <w:rFonts w:asciiTheme="minorHAnsi" w:eastAsiaTheme="minorEastAsia" w:hAnsiTheme="minorHAnsi"/>
           <w:noProof/>
-          <w:color w:val="auto"/>
           <w:kern w:val="2"/>
           <w:szCs w:val="24"/>
           <w:lang w:eastAsia="zh-CN"/>
           <w14:ligatures w14:val="standardContextual"/>
         </w:rPr>
       </w:pPr>
-      <w:hyperlink w:anchor="_Toc241948523" w:history="1">
+      <w:hyperlink w:anchor="_Toc242037372" w:history="1">
         <w:r>
           <w:rPr>
             <w:rStyle w:val="aff9"/>
@@ -723,7 +716,7 @@
             <w:noProof/>
             <w:webHidden/>
           </w:rPr>
-          <w:instrText xml:space="preserve"> PAGEREF _Toc241948523 \h </w:instrText>
+          <w:instrText xml:space="preserve"> PAGEREF _Toc242037372 \h </w:instrText>
         </w:r>
         <w:r>
           <w:rPr>
@@ -763,14 +756,13 @@
         <w:rPr>
           <w:rFonts w:asciiTheme="minorHAnsi" w:eastAsiaTheme="minorEastAsia" w:hAnsiTheme="minorHAnsi"/>
           <w:noProof/>
-          <w:color w:val="auto"/>
           <w:kern w:val="2"/>
           <w:szCs w:val="24"/>
           <w:lang w:eastAsia="zh-CN"/>
           <w14:ligatures w14:val="standardContextual"/>
         </w:rPr>
       </w:pPr>
-      <w:hyperlink w:anchor="_Toc241948524" w:history="1">
+      <w:hyperlink w:anchor="_Toc242037373" w:history="1">
         <w:r>
           <w:rPr>
             <w:rStyle w:val="aff9"/>
@@ -804,7 +796,7 @@
             <w:noProof/>
             <w:webHidden/>
           </w:rPr>
-          <w:instrText xml:space="preserve"> PAGEREF _Toc241948524 \h </w:instrText>
+          <w:instrText xml:space="preserve"> PAGEREF _Toc242037373 \h </w:instrText>
         </w:r>
         <w:r>
           <w:rPr>
@@ -844,14 +836,13 @@
         <w:rPr>
           <w:rFonts w:asciiTheme="minorHAnsi" w:eastAsiaTheme="minorEastAsia" w:hAnsiTheme="minorHAnsi"/>
           <w:noProof/>
-          <w:color w:val="auto"/>
           <w:kern w:val="2"/>
           <w:szCs w:val="24"/>
           <w:lang w:eastAsia="zh-CN"/>
           <w14:ligatures w14:val="standardContextual"/>
         </w:rPr>
       </w:pPr>
-      <w:hyperlink w:anchor="_Toc241948525" w:history="1">
+      <w:hyperlink w:anchor="_Toc242037374" w:history="1">
         <w:r>
           <w:rPr>
             <w:rStyle w:val="aff9"/>
@@ -885,7 +876,7 @@
             <w:noProof/>
             <w:webHidden/>
           </w:rPr>
-          <w:instrText xml:space="preserve"> PAGEREF _Toc241948525 \h </w:instrText>
+          <w:instrText xml:space="preserve"> PAGEREF _Toc242037374 \h </w:instrText>
         </w:r>
         <w:r>
           <w:rPr>
@@ -925,14 +916,13 @@
         <w:rPr>
           <w:rFonts w:asciiTheme="minorHAnsi" w:eastAsiaTheme="minorEastAsia" w:hAnsiTheme="minorHAnsi"/>
           <w:noProof/>
-          <w:color w:val="auto"/>
           <w:kern w:val="2"/>
           <w:szCs w:val="24"/>
           <w:lang w:eastAsia="zh-CN"/>
           <w14:ligatures w14:val="standardContextual"/>
         </w:rPr>
       </w:pPr>
-      <w:hyperlink w:anchor="_Toc241948526" w:history="1">
+      <w:hyperlink w:anchor="_Toc242037375" w:history="1">
         <w:r>
           <w:rPr>
             <w:rStyle w:val="aff9"/>
@@ -966,7 +956,7 @@
             <w:noProof/>
             <w:webHidden/>
           </w:rPr>
-          <w:instrText xml:space="preserve"> PAGEREF _Toc241948526 \h </w:instrText>
+          <w:instrText xml:space="preserve"> PAGEREF _Toc242037375 \h </w:instrText>
         </w:r>
         <w:r>
           <w:rPr>
@@ -1006,14 +996,13 @@
         <w:rPr>
           <w:rFonts w:asciiTheme="minorHAnsi" w:eastAsiaTheme="minorEastAsia" w:hAnsiTheme="minorHAnsi"/>
           <w:noProof/>
-          <w:color w:val="auto"/>
           <w:kern w:val="2"/>
           <w:szCs w:val="24"/>
           <w:lang w:eastAsia="zh-CN"/>
           <w14:ligatures w14:val="standardContextual"/>
         </w:rPr>
       </w:pPr>
-      <w:hyperlink w:anchor="_Toc241948527" w:history="1">
+      <w:hyperlink w:anchor="_Toc242037376" w:history="1">
         <w:r>
           <w:rPr>
             <w:rStyle w:val="aff9"/>
@@ -1047,7 +1036,7 @@
             <w:noProof/>
             <w:webHidden/>
           </w:rPr>
-          <w:instrText xml:space="preserve"> PAGEREF _Toc241948527 \h </w:instrText>
+          <w:instrText xml:space="preserve"> PAGEREF _Toc242037376 \h </w:instrText>
         </w:r>
         <w:r>
           <w:rPr>
@@ -1092,7 +1081,7 @@
       <w:pPr>
         <w:pStyle w:val="1"/>
       </w:pPr>
-      <w:bookmarkStart w:id="0" w:name="_Toc241948518"/>
+      <w:bookmarkStart w:id="0" w:name="_Toc242037367"/>
       <w:r>
         <w:lastRenderedPageBreak/>
         <w:t xml:space="preserve">1 </w:t>
@@ -1153,7 +1142,7 @@
       <w:pPr>
         <w:pStyle w:val="1"/>
       </w:pPr>
-      <w:bookmarkStart w:id="1" w:name="_Toc241948519"/>
+      <w:bookmarkStart w:id="1" w:name="_Toc242037368"/>
       <w:r>
         <w:t xml:space="preserve">2 </w:t>
       </w:r>
@@ -1871,7 +1860,7 @@
       <w:pPr>
         <w:pStyle w:val="1"/>
       </w:pPr>
-      <w:bookmarkStart w:id="2" w:name="_Toc241948520"/>
+      <w:bookmarkStart w:id="2" w:name="_Toc242037369"/>
       <w:r>
         <w:t xml:space="preserve">3 </w:t>
       </w:r>
@@ -4307,7 +4296,7 @@
       <w:pPr>
         <w:pStyle w:val="1"/>
       </w:pPr>
-      <w:bookmarkStart w:id="3" w:name="_Toc241948521"/>
+      <w:bookmarkStart w:id="3" w:name="_Toc242037370"/>
       <w:r>
         <w:t xml:space="preserve">4 </w:t>
       </w:r>
@@ -5788,7 +5777,7 @@
       <w:pPr>
         <w:pStyle w:val="1"/>
       </w:pPr>
-      <w:bookmarkStart w:id="4" w:name="_Toc241948522"/>
+      <w:bookmarkStart w:id="4" w:name="_Toc242037371"/>
       <w:r>
         <w:t xml:space="preserve">5 </w:t>
       </w:r>
@@ -7267,7 +7256,7 @@
       <w:pPr>
         <w:pStyle w:val="1"/>
       </w:pPr>
-      <w:bookmarkStart w:id="5" w:name="_Toc241948523"/>
+      <w:bookmarkStart w:id="5" w:name="_Toc242037372"/>
       <w:r>
         <w:t xml:space="preserve">6 </w:t>
       </w:r>
@@ -8121,7 +8110,7 @@
       <w:pPr>
         <w:pStyle w:val="1"/>
       </w:pPr>
-      <w:bookmarkStart w:id="6" w:name="_Toc241948524"/>
+      <w:bookmarkStart w:id="6" w:name="_Toc242037373"/>
       <w:r>
         <w:t xml:space="preserve">7 </w:t>
       </w:r>
@@ -8772,7 +8761,7 @@
       <w:pPr>
         <w:pStyle w:val="1"/>
       </w:pPr>
-      <w:bookmarkStart w:id="7" w:name="_Toc241948525"/>
+      <w:bookmarkStart w:id="7" w:name="_Toc242037374"/>
       <w:r>
         <w:t xml:space="preserve">8 </w:t>
       </w:r>
@@ -9489,7 +9478,7 @@
       <w:pPr>
         <w:pStyle w:val="1"/>
       </w:pPr>
-      <w:bookmarkStart w:id="8" w:name="_Toc241948526"/>
+      <w:bookmarkStart w:id="8" w:name="_Toc242037375"/>
       <w:r>
         <w:t xml:space="preserve">9 </w:t>
       </w:r>
@@ -9605,7 +9594,7 @@
       <w:pPr>
         <w:pStyle w:val="1"/>
       </w:pPr>
-      <w:bookmarkStart w:id="9" w:name="_Toc241948527"/>
+      <w:bookmarkStart w:id="9" w:name="_Toc242037376"/>
       <w:r>
         <w:t xml:space="preserve">10 </w:t>
       </w:r>
@@ -10764,6 +10753,7 @@
       </w:pPr>
       <w:rPr>
         <w:rFonts w:ascii="Symbol" w:hAnsi="Symbol" w:hint="default"/>
+        <w:color w:val="000000"/>
       </w:rPr>
     </w:lvl>
   </w:abstractNum>
@@ -10785,6 +10775,7 @@
       </w:pPr>
       <w:rPr>
         <w:rFonts w:ascii="Symbol" w:hAnsi="Symbol" w:hint="default"/>
+        <w:color w:val="000000"/>
       </w:rPr>
     </w:lvl>
   </w:abstractNum>
@@ -10806,6 +10797,7 @@
       </w:pPr>
       <w:rPr>
         <w:rFonts w:ascii="Symbol" w:hAnsi="Symbol" w:hint="default"/>
+        <w:color w:val="000000"/>
       </w:rPr>
     </w:lvl>
   </w:abstractNum>
@@ -10845,6 +10837,7 @@
       </w:pPr>
       <w:rPr>
         <w:rFonts w:ascii="Symbol" w:hAnsi="Symbol" w:hint="default"/>
+        <w:color w:val="000000"/>
       </w:rPr>
     </w:lvl>
   </w:abstractNum>
@@ -10884,6 +10877,7 @@
     <w:rPrDefault>
       <w:rPr>
         <w:rFonts w:asciiTheme="minorHAnsi" w:eastAsiaTheme="minorEastAsia" w:hAnsiTheme="minorHAnsi" w:cstheme="minorBidi"/>
+        <w:color w:val="000000"/>
         <w:sz w:val="22"/>
         <w:szCs w:val="22"/>
         <w:lang w:val="en-US" w:eastAsia="en-US" w:bidi="ar-SA"/>
@@ -11273,7 +11267,6 @@
     </w:pPr>
     <w:rPr>
       <w:rFonts w:ascii="Calibri" w:eastAsia="宋体" w:hAnsi="Calibri"/>
-      <w:color w:val="000000"/>
     </w:rPr>
   </w:style>
   <w:style w:type="paragraph" w:styleId="1">
@@ -11364,7 +11357,6 @@
       <w:bCs/>
       <w:i/>
       <w:iCs/>
-      <w:color w:val="4F81BD" w:themeColor="accent1"/>
     </w:rPr>
   </w:style>
   <w:style w:type="paragraph" w:styleId="5">
@@ -11385,7 +11377,6 @@
     </w:pPr>
     <w:rPr>
       <w:rFonts w:asciiTheme="majorHAnsi" w:eastAsiaTheme="majorEastAsia" w:hAnsiTheme="majorHAnsi" w:cstheme="majorBidi"/>
-      <w:color w:val="243F60" w:themeColor="accent1" w:themeShade="7F"/>
     </w:rPr>
   </w:style>
   <w:style w:type="paragraph" w:styleId="6">
@@ -11408,7 +11399,6 @@
       <w:rFonts w:asciiTheme="majorHAnsi" w:eastAsiaTheme="majorEastAsia" w:hAnsiTheme="majorHAnsi" w:cstheme="majorBidi"/>
       <w:i/>
       <w:iCs/>
-      <w:color w:val="243F60" w:themeColor="accent1" w:themeShade="7F"/>
     </w:rPr>
   </w:style>
   <w:style w:type="paragraph" w:styleId="7">
@@ -11431,7 +11421,6 @@
       <w:rFonts w:asciiTheme="majorHAnsi" w:eastAsiaTheme="majorEastAsia" w:hAnsiTheme="majorHAnsi" w:cstheme="majorBidi"/>
       <w:i/>
       <w:iCs/>
-      <w:color w:val="404040" w:themeColor="text1" w:themeTint="BF"/>
     </w:rPr>
   </w:style>
   <w:style w:type="paragraph" w:styleId="8">
@@ -11452,7 +11441,6 @@
     </w:pPr>
     <w:rPr>
       <w:rFonts w:asciiTheme="majorHAnsi" w:eastAsiaTheme="majorEastAsia" w:hAnsiTheme="majorHAnsi" w:cstheme="majorBidi"/>
-      <w:color w:val="4F81BD" w:themeColor="accent1"/>
       <w:sz w:val="20"/>
       <w:szCs w:val="20"/>
     </w:rPr>
@@ -11477,7 +11465,6 @@
       <w:rFonts w:asciiTheme="majorHAnsi" w:eastAsiaTheme="majorEastAsia" w:hAnsiTheme="majorHAnsi" w:cstheme="majorBidi"/>
       <w:i/>
       <w:iCs/>
-      <w:color w:val="404040" w:themeColor="text1" w:themeTint="BF"/>
       <w:sz w:val="20"/>
       <w:szCs w:val="20"/>
     </w:rPr>
@@ -11530,6 +11517,9 @@
     <w:link w:val="a5"/>
     <w:uiPriority w:val="99"/>
     <w:rsid w:val="00E618BF"/>
+    <w:rPr>
+      <w:color w:val="000000"/>
+    </w:rPr>
   </w:style>
   <w:style w:type="paragraph" w:styleId="a7">
     <w:name w:val="footer"/>
@@ -11552,6 +11542,9 @@
     <w:link w:val="a7"/>
     <w:uiPriority w:val="99"/>
     <w:rsid w:val="00E618BF"/>
+    <w:rPr>
+      <w:color w:val="000000"/>
+    </w:rPr>
   </w:style>
   <w:style w:type="paragraph" w:styleId="a9">
     <w:name w:val="No Spacing"/>
@@ -11572,7 +11565,7 @@
       <w:rFonts w:asciiTheme="majorHAnsi" w:eastAsiaTheme="majorEastAsia" w:hAnsiTheme="majorHAnsi" w:cstheme="majorBidi"/>
       <w:b/>
       <w:bCs/>
-      <w:color w:val="365F91" w:themeColor="accent1" w:themeShade="BF"/>
+      <w:color w:val="000000"/>
       <w:sz w:val="28"/>
       <w:szCs w:val="28"/>
     </w:rPr>
@@ -11587,7 +11580,7 @@
       <w:rFonts w:asciiTheme="majorHAnsi" w:eastAsiaTheme="majorEastAsia" w:hAnsiTheme="majorHAnsi" w:cstheme="majorBidi"/>
       <w:b/>
       <w:bCs/>
-      <w:color w:val="4F81BD" w:themeColor="accent1"/>
+      <w:color w:val="000000"/>
       <w:sz w:val="26"/>
       <w:szCs w:val="26"/>
     </w:rPr>
@@ -11602,7 +11595,7 @@
       <w:rFonts w:asciiTheme="majorHAnsi" w:eastAsiaTheme="majorEastAsia" w:hAnsiTheme="majorHAnsi" w:cstheme="majorBidi"/>
       <w:b/>
       <w:bCs/>
-      <w:color w:val="4F81BD" w:themeColor="accent1"/>
+      <w:color w:val="000000"/>
     </w:rPr>
   </w:style>
   <w:style w:type="paragraph" w:styleId="aa">
@@ -11619,7 +11612,6 @@
     </w:pPr>
     <w:rPr>
       <w:rFonts w:asciiTheme="majorHAnsi" w:eastAsiaTheme="majorEastAsia" w:hAnsiTheme="majorHAnsi" w:cstheme="majorBidi"/>
-      <w:color w:val="17365D" w:themeColor="text2" w:themeShade="BF"/>
       <w:spacing w:val="5"/>
       <w:kern w:val="28"/>
       <w:sz w:val="52"/>
@@ -11634,7 +11626,7 @@
     <w:rsid w:val="00FC693F"/>
     <w:rPr>
       <w:rFonts w:asciiTheme="majorHAnsi" w:eastAsiaTheme="majorEastAsia" w:hAnsiTheme="majorHAnsi" w:cstheme="majorBidi"/>
-      <w:color w:val="17365D" w:themeColor="text2" w:themeShade="BF"/>
+      <w:color w:val="000000"/>
       <w:spacing w:val="5"/>
       <w:kern w:val="28"/>
       <w:sz w:val="52"/>
@@ -11658,7 +11650,6 @@
       <w:rFonts w:asciiTheme="majorHAnsi" w:eastAsiaTheme="majorEastAsia" w:hAnsiTheme="majorHAnsi" w:cstheme="majorBidi"/>
       <w:i/>
       <w:iCs/>
-      <w:color w:val="4F81BD" w:themeColor="accent1"/>
       <w:spacing w:val="15"/>
       <w:sz w:val="24"/>
       <w:szCs w:val="24"/>
@@ -11674,7 +11665,7 @@
       <w:rFonts w:asciiTheme="majorHAnsi" w:eastAsiaTheme="majorEastAsia" w:hAnsiTheme="majorHAnsi" w:cstheme="majorBidi"/>
       <w:i/>
       <w:iCs/>
-      <w:color w:val="4F81BD" w:themeColor="accent1"/>
+      <w:color w:val="000000"/>
       <w:spacing w:val="15"/>
       <w:sz w:val="24"/>
       <w:szCs w:val="24"/>
@@ -11705,6 +11696,9 @@
     <w:link w:val="af"/>
     <w:uiPriority w:val="99"/>
     <w:rsid w:val="00AA1D8D"/>
+    <w:rPr>
+      <w:color w:val="000000"/>
+    </w:rPr>
   </w:style>
   <w:style w:type="paragraph" w:styleId="23">
     <w:name w:val="Body Text 2"/>
@@ -11723,6 +11717,9 @@
     <w:link w:val="23"/>
     <w:uiPriority w:val="99"/>
     <w:rsid w:val="00AA1D8D"/>
+    <w:rPr>
+      <w:color w:val="000000"/>
+    </w:rPr>
   </w:style>
   <w:style w:type="paragraph" w:styleId="33">
     <w:name w:val="Body Text 3"/>
@@ -11746,6 +11743,7 @@
     <w:uiPriority w:val="99"/>
     <w:rsid w:val="00AA1D8D"/>
     <w:rPr>
+      <w:color w:val="000000"/>
       <w:sz w:val="16"/>
       <w:szCs w:val="16"/>
     </w:rPr>
@@ -11928,6 +11926,7 @@
     <w:rsid w:val="0029639D"/>
     <w:rPr>
       <w:rFonts w:ascii="Courier" w:hAnsi="Courier"/>
+      <w:color w:val="000000"/>
       <w:sz w:val="20"/>
       <w:szCs w:val="20"/>
     </w:rPr>
@@ -11943,7 +11942,6 @@
     <w:rPr>
       <w:i/>
       <w:iCs/>
-      <w:color w:val="000000" w:themeColor="text1"/>
     </w:rPr>
   </w:style>
   <w:style w:type="character" w:customStyle="1" w:styleId="af6">
@@ -11955,7 +11953,7 @@
     <w:rPr>
       <w:i/>
       <w:iCs/>
-      <w:color w:val="000000" w:themeColor="text1"/>
+      <w:color w:val="000000"/>
     </w:rPr>
   </w:style>
   <w:style w:type="character" w:customStyle="1" w:styleId="40">
@@ -11971,7 +11969,7 @@
       <w:bCs/>
       <w:i/>
       <w:iCs/>
-      <w:color w:val="4F81BD" w:themeColor="accent1"/>
+      <w:color w:val="000000"/>
     </w:rPr>
   </w:style>
   <w:style w:type="character" w:customStyle="1" w:styleId="50">
@@ -11983,7 +11981,7 @@
     <w:rsid w:val="00FC693F"/>
     <w:rPr>
       <w:rFonts w:asciiTheme="majorHAnsi" w:eastAsiaTheme="majorEastAsia" w:hAnsiTheme="majorHAnsi" w:cstheme="majorBidi"/>
-      <w:color w:val="243F60" w:themeColor="accent1" w:themeShade="7F"/>
+      <w:color w:val="000000"/>
     </w:rPr>
   </w:style>
   <w:style w:type="character" w:customStyle="1" w:styleId="60">
@@ -11997,7 +11995,7 @@
       <w:rFonts w:asciiTheme="majorHAnsi" w:eastAsiaTheme="majorEastAsia" w:hAnsiTheme="majorHAnsi" w:cstheme="majorBidi"/>
       <w:i/>
       <w:iCs/>
-      <w:color w:val="243F60" w:themeColor="accent1" w:themeShade="7F"/>
+      <w:color w:val="000000"/>
     </w:rPr>
   </w:style>
   <w:style w:type="character" w:customStyle="1" w:styleId="70">
@@ -12011,7 +12009,7 @@
       <w:rFonts w:asciiTheme="majorHAnsi" w:eastAsiaTheme="majorEastAsia" w:hAnsiTheme="majorHAnsi" w:cstheme="majorBidi"/>
       <w:i/>
       <w:iCs/>
-      <w:color w:val="404040" w:themeColor="text1" w:themeTint="BF"/>
+      <w:color w:val="000000"/>
     </w:rPr>
   </w:style>
   <w:style w:type="character" w:customStyle="1" w:styleId="80">
@@ -12023,7 +12021,7 @@
     <w:rsid w:val="00FC693F"/>
     <w:rPr>
       <w:rFonts w:asciiTheme="majorHAnsi" w:eastAsiaTheme="majorEastAsia" w:hAnsiTheme="majorHAnsi" w:cstheme="majorBidi"/>
-      <w:color w:val="4F81BD" w:themeColor="accent1"/>
+      <w:color w:val="000000"/>
       <w:sz w:val="20"/>
       <w:szCs w:val="20"/>
     </w:rPr>
@@ -12039,7 +12037,7 @@
       <w:rFonts w:asciiTheme="majorHAnsi" w:eastAsiaTheme="majorEastAsia" w:hAnsiTheme="majorHAnsi" w:cstheme="majorBidi"/>
       <w:i/>
       <w:iCs/>
-      <w:color w:val="404040" w:themeColor="text1" w:themeTint="BF"/>
+      <w:color w:val="000000"/>
       <w:sz w:val="20"/>
       <w:szCs w:val="20"/>
     </w:rPr>
@@ -12059,7 +12057,6 @@
     <w:rPr>
       <w:b/>
       <w:bCs/>
-      <w:color w:val="4F81BD" w:themeColor="accent1"/>
       <w:sz w:val="18"/>
       <w:szCs w:val="18"/>
     </w:rPr>
@@ -12073,6 +12070,7 @@
     <w:rPr>
       <w:b/>
       <w:bCs/>
+      <w:color w:val="000000"/>
     </w:rPr>
   </w:style>
   <w:style w:type="character" w:styleId="af9">
@@ -12084,6 +12082,7 @@
     <w:rPr>
       <w:i/>
       <w:iCs/>
+      <w:color w:val="000000"/>
     </w:rPr>
   </w:style>
   <w:style w:type="paragraph" w:styleId="afa">
@@ -12103,7 +12102,6 @@
       <w:bCs/>
       <w:i/>
       <w:iCs/>
-      <w:color w:val="4F81BD" w:themeColor="accent1"/>
     </w:rPr>
   </w:style>
   <w:style w:type="character" w:customStyle="1" w:styleId="afb">
@@ -12117,7 +12115,7 @@
       <w:bCs/>
       <w:i/>
       <w:iCs/>
-      <w:color w:val="4F81BD" w:themeColor="accent1"/>
+      <w:color w:val="000000"/>
     </w:rPr>
   </w:style>
   <w:style w:type="character" w:styleId="afc">
@@ -12129,7 +12127,7 @@
     <w:rPr>
       <w:i/>
       <w:iCs/>
-      <w:color w:val="808080" w:themeColor="text1" w:themeTint="7F"/>
+      <w:color w:val="000000"/>
     </w:rPr>
   </w:style>
   <w:style w:type="character" w:styleId="afd">
@@ -12143,7 +12141,7 @@
       <w:bCs/>
       <w:i/>
       <w:iCs/>
-      <w:color w:val="4F81BD" w:themeColor="accent1"/>
+      <w:color w:val="000000"/>
     </w:rPr>
   </w:style>
   <w:style w:type="character" w:styleId="afe">
@@ -12154,7 +12152,7 @@
     <w:rsid w:val="00FC693F"/>
     <w:rPr>
       <w:smallCaps/>
-      <w:color w:val="C0504D" w:themeColor="accent2"/>
+      <w:color w:val="000000"/>
       <w:u w:val="single"/>
     </w:rPr>
   </w:style>
@@ -12168,7 +12166,7 @@
       <w:b/>
       <w:bCs/>
       <w:smallCaps/>
-      <w:color w:val="C0504D" w:themeColor="accent2"/>
+      <w:color w:val="000000"/>
       <w:spacing w:val="5"/>
       <w:u w:val="single"/>
     </w:rPr>
@@ -12183,6 +12181,7 @@
       <w:b/>
       <w:bCs/>
       <w:smallCaps/>
+      <w:color w:val="000000"/>
       <w:spacing w:val="5"/>
     </w:rPr>
   </w:style>
@@ -12226,9 +12225,6 @@
     <w:pPr>
       <w:spacing w:after="0" w:line="240" w:lineRule="auto"/>
     </w:pPr>
-    <w:rPr>
-      <w:color w:val="000000" w:themeColor="text1" w:themeShade="BF"/>
-    </w:rPr>
     <w:tblPr>
       <w:tblStyleRowBandSize w:val="1"/>
       <w:tblStyleColBandSize w:val="1"/>
@@ -12244,6 +12240,7 @@
       <w:rPr>
         <w:b/>
         <w:bCs/>
+        <w:color w:val="000000"/>
       </w:rPr>
       <w:tblPr/>
       <w:tcPr>
@@ -12264,6 +12261,7 @@
       <w:rPr>
         <w:b/>
         <w:bCs/>
+        <w:color w:val="000000"/>
       </w:rPr>
       <w:tblPr/>
       <w:tcPr>
@@ -12281,12 +12279,14 @@
       <w:rPr>
         <w:b/>
         <w:bCs/>
+        <w:color w:val="000000"/>
       </w:rPr>
     </w:tblStylePr>
     <w:tblStylePr w:type="lastCol">
       <w:rPr>
         <w:b/>
         <w:bCs/>
+        <w:color w:val="000000"/>
       </w:rPr>
     </w:tblStylePr>
     <w:tblStylePr w:type="band1Vert">
@@ -12322,9 +12322,6 @@
     <w:pPr>
       <w:spacing w:after="0" w:line="240" w:lineRule="auto"/>
     </w:pPr>
-    <w:rPr>
-      <w:color w:val="365F91" w:themeColor="accent1" w:themeShade="BF"/>
-    </w:rPr>
     <w:tblPr>
       <w:tblStyleRowBandSize w:val="1"/>
       <w:tblStyleColBandSize w:val="1"/>
@@ -12340,6 +12337,7 @@
       <w:rPr>
         <w:b/>
         <w:bCs/>
+        <w:color w:val="000000"/>
       </w:rPr>
       <w:tblPr/>
       <w:tcPr>
@@ -12360,6 +12358,7 @@
       <w:rPr>
         <w:b/>
         <w:bCs/>
+        <w:color w:val="000000"/>
       </w:rPr>
       <w:tblPr/>
       <w:tcPr>
@@ -12377,12 +12376,14 @@
       <w:rPr>
         <w:b/>
         <w:bCs/>
+        <w:color w:val="000000"/>
       </w:rPr>
     </w:tblStylePr>
     <w:tblStylePr w:type="lastCol">
       <w:rPr>
         <w:b/>
         <w:bCs/>
+        <w:color w:val="000000"/>
       </w:rPr>
     </w:tblStylePr>
     <w:tblStylePr w:type="band1Vert">
@@ -12418,9 +12419,6 @@
     <w:pPr>
       <w:spacing w:after="0" w:line="240" w:lineRule="auto"/>
     </w:pPr>
-    <w:rPr>
-      <w:color w:val="943634" w:themeColor="accent2" w:themeShade="BF"/>
-    </w:rPr>
     <w:tblPr>
       <w:tblStyleRowBandSize w:val="1"/>
       <w:tblStyleColBandSize w:val="1"/>
@@ -12436,6 +12434,7 @@
       <w:rPr>
         <w:b/>
         <w:bCs/>
+        <w:color w:val="000000"/>
       </w:rPr>
       <w:tblPr/>
       <w:tcPr>
@@ -12456,6 +12455,7 @@
       <w:rPr>
         <w:b/>
         <w:bCs/>
+        <w:color w:val="000000"/>
       </w:rPr>
       <w:tblPr/>
       <w:tcPr>
@@ -12473,12 +12473,14 @@
       <w:rPr>
         <w:b/>
         <w:bCs/>
+        <w:color w:val="000000"/>
       </w:rPr>
     </w:tblStylePr>
     <w:tblStylePr w:type="lastCol">
       <w:rPr>
         <w:b/>
         <w:bCs/>
+        <w:color w:val="000000"/>
       </w:rPr>
     </w:tblStylePr>
     <w:tblStylePr w:type="band1Vert">
@@ -12514,9 +12516,6 @@
     <w:pPr>
       <w:spacing w:after="0" w:line="240" w:lineRule="auto"/>
     </w:pPr>
-    <w:rPr>
-      <w:color w:val="76923C" w:themeColor="accent3" w:themeShade="BF"/>
-    </w:rPr>
     <w:tblPr>
       <w:tblStyleRowBandSize w:val="1"/>
       <w:tblStyleColBandSize w:val="1"/>
@@ -12532,6 +12531,7 @@
       <w:rPr>
         <w:b/>
         <w:bCs/>
+        <w:color w:val="000000"/>
       </w:rPr>
       <w:tblPr/>
       <w:tcPr>
@@ -12552,6 +12552,7 @@
       <w:rPr>
         <w:b/>
         <w:bCs/>
+        <w:color w:val="000000"/>
       </w:rPr>
       <w:tblPr/>
       <w:tcPr>
@@ -12569,12 +12570,14 @@
       <w:rPr>
         <w:b/>
         <w:bCs/>
+        <w:color w:val="000000"/>
       </w:rPr>
     </w:tblStylePr>
     <w:tblStylePr w:type="lastCol">
       <w:rPr>
         <w:b/>
         <w:bCs/>
+        <w:color w:val="000000"/>
       </w:rPr>
     </w:tblStylePr>
     <w:tblStylePr w:type="band1Vert">
@@ -12610,9 +12613,6 @@
     <w:pPr>
       <w:spacing w:after="0" w:line="240" w:lineRule="auto"/>
     </w:pPr>
-    <w:rPr>
-      <w:color w:val="5F497A" w:themeColor="accent4" w:themeShade="BF"/>
-    </w:rPr>
     <w:tblPr>
       <w:tblStyleRowBandSize w:val="1"/>
       <w:tblStyleColBandSize w:val="1"/>
@@ -12628,6 +12628,7 @@
       <w:rPr>
         <w:b/>
         <w:bCs/>
+        <w:color w:val="000000"/>
       </w:rPr>
       <w:tblPr/>
       <w:tcPr>
@@ -12648,6 +12649,7 @@
       <w:rPr>
         <w:b/>
         <w:bCs/>
+        <w:color w:val="000000"/>
       </w:rPr>
       <w:tblPr/>
       <w:tcPr>
@@ -12665,12 +12667,14 @@
       <w:rPr>
         <w:b/>
         <w:bCs/>
+        <w:color w:val="000000"/>
       </w:rPr>
     </w:tblStylePr>
     <w:tblStylePr w:type="lastCol">
       <w:rPr>
         <w:b/>
         <w:bCs/>
+        <w:color w:val="000000"/>
       </w:rPr>
     </w:tblStylePr>
     <w:tblStylePr w:type="band1Vert">
@@ -12706,9 +12710,6 @@
     <w:pPr>
       <w:spacing w:after="0" w:line="240" w:lineRule="auto"/>
     </w:pPr>
-    <w:rPr>
-      <w:color w:val="31849B" w:themeColor="accent5" w:themeShade="BF"/>
-    </w:rPr>
     <w:tblPr>
       <w:tblStyleRowBandSize w:val="1"/>
       <w:tblStyleColBandSize w:val="1"/>
@@ -12724,6 +12725,7 @@
       <w:rPr>
         <w:b/>
         <w:bCs/>
+        <w:color w:val="000000"/>
       </w:rPr>
       <w:tblPr/>
       <w:tcPr>
@@ -12744,6 +12746,7 @@
       <w:rPr>
         <w:b/>
         <w:bCs/>
+        <w:color w:val="000000"/>
       </w:rPr>
       <w:tblPr/>
       <w:tcPr>
@@ -12761,12 +12764,14 @@
       <w:rPr>
         <w:b/>
         <w:bCs/>
+        <w:color w:val="000000"/>
       </w:rPr>
     </w:tblStylePr>
     <w:tblStylePr w:type="lastCol">
       <w:rPr>
         <w:b/>
         <w:bCs/>
+        <w:color w:val="000000"/>
       </w:rPr>
     </w:tblStylePr>
     <w:tblStylePr w:type="band1Vert">
@@ -12802,9 +12807,6 @@
     <w:pPr>
       <w:spacing w:after="0" w:line="240" w:lineRule="auto"/>
     </w:pPr>
-    <w:rPr>
-      <w:color w:val="E36C0A" w:themeColor="accent6" w:themeShade="BF"/>
-    </w:rPr>
     <w:tblPr>
       <w:tblStyleRowBandSize w:val="1"/>
       <w:tblStyleColBandSize w:val="1"/>
@@ -12820,6 +12822,7 @@
       <w:rPr>
         <w:b/>
         <w:bCs/>
+        <w:color w:val="000000"/>
       </w:rPr>
       <w:tblPr/>
       <w:tcPr>
@@ -12840,6 +12843,7 @@
       <w:rPr>
         <w:b/>
         <w:bCs/>
+        <w:color w:val="000000"/>
       </w:rPr>
       <w:tblPr/>
       <w:tcPr>
@@ -12857,12 +12861,14 @@
       <w:rPr>
         <w:b/>
         <w:bCs/>
+        <w:color w:val="000000"/>
       </w:rPr>
     </w:tblStylePr>
     <w:tblStylePr w:type="lastCol">
       <w:rPr>
         <w:b/>
         <w:bCs/>
+        <w:color w:val="000000"/>
       </w:rPr>
     </w:tblStylePr>
     <w:tblStylePr w:type="band1Vert">
@@ -12912,11 +12918,6 @@
       <w:pPr>
         <w:spacing w:before="0" w:after="0" w:line="240" w:lineRule="auto"/>
       </w:pPr>
-      <w:rPr>
-        <w:b/>
-        <w:bCs/>
-        <w:color w:val="FFFFFF" w:themeColor="background1"/>
-      </w:rPr>
       <w:tblPr/>
       <w:tcPr>
         <w:shd w:val="clear" w:color="auto" w:fill="000000" w:themeFill="text1"/>
@@ -12926,10 +12927,6 @@
       <w:pPr>
         <w:spacing w:before="0" w:after="0" w:line="240" w:lineRule="auto"/>
       </w:pPr>
-      <w:rPr>
-        <w:b/>
-        <w:bCs/>
-      </w:rPr>
       <w:tblPr/>
       <w:tcPr>
         <w:tcBorders>
@@ -12939,18 +12936,6 @@
           <w:right w:val="single" w:sz="8" w:space="0" w:color="000000" w:themeColor="text1"/>
         </w:tcBorders>
       </w:tcPr>
-    </w:tblStylePr>
-    <w:tblStylePr w:type="firstCol">
-      <w:rPr>
-        <w:b/>
-        <w:bCs/>
-      </w:rPr>
-    </w:tblStylePr>
-    <w:tblStylePr w:type="lastCol">
-      <w:rPr>
-        <w:b/>
-        <w:bCs/>
-      </w:rPr>
     </w:tblStylePr>
     <w:tblStylePr w:type="band1Vert">
       <w:tblPr/>
@@ -12997,11 +12982,6 @@
       <w:pPr>
         <w:spacing w:before="0" w:after="0" w:line="240" w:lineRule="auto"/>
       </w:pPr>
-      <w:rPr>
-        <w:b/>
-        <w:bCs/>
-        <w:color w:val="FFFFFF" w:themeColor="background1"/>
-      </w:rPr>
       <w:tblPr/>
       <w:tcPr>
         <w:shd w:val="clear" w:color="auto" w:fill="4F81BD" w:themeFill="accent1"/>
@@ -13011,10 +12991,6 @@
       <w:pPr>
         <w:spacing w:before="0" w:after="0" w:line="240" w:lineRule="auto"/>
       </w:pPr>
-      <w:rPr>
-        <w:b/>
-        <w:bCs/>
-      </w:rPr>
       <w:tblPr/>
       <w:tcPr>
         <w:tcBorders>
@@ -13024,18 +13000,6 @@
           <w:right w:val="single" w:sz="8" w:space="0" w:color="4F81BD" w:themeColor="accent1"/>
         </w:tcBorders>
       </w:tcPr>
-    </w:tblStylePr>
-    <w:tblStylePr w:type="firstCol">
-      <w:rPr>
-        <w:b/>
-        <w:bCs/>
-      </w:rPr>
-    </w:tblStylePr>
-    <w:tblStylePr w:type="lastCol">
-      <w:rPr>
-        <w:b/>
-        <w:bCs/>
-      </w:rPr>
     </w:tblStylePr>
     <w:tblStylePr w:type="band1Vert">
       <w:tblPr/>
@@ -13082,11 +13046,6 @@
       <w:pPr>
         <w:spacing w:before="0" w:after="0" w:line="240" w:lineRule="auto"/>
       </w:pPr>
-      <w:rPr>
-        <w:b/>
-        <w:bCs/>
-        <w:color w:val="FFFFFF" w:themeColor="background1"/>
-      </w:rPr>
       <w:tblPr/>
       <w:tcPr>
         <w:shd w:val="clear" w:color="auto" w:fill="C0504D" w:themeFill="accent2"/>
@@ -13096,10 +13055,6 @@
       <w:pPr>
         <w:spacing w:before="0" w:after="0" w:line="240" w:lineRule="auto"/>
       </w:pPr>
-      <w:rPr>
-        <w:b/>
-        <w:bCs/>
-      </w:rPr>
       <w:tblPr/>
       <w:tcPr>
         <w:tcBorders>
@@ -13109,18 +13064,6 @@
           <w:right w:val="single" w:sz="8" w:space="0" w:color="C0504D" w:themeColor="accent2"/>
         </w:tcBorders>
       </w:tcPr>
-    </w:tblStylePr>
-    <w:tblStylePr w:type="firstCol">
-      <w:rPr>
-        <w:b/>
-        <w:bCs/>
-      </w:rPr>
-    </w:tblStylePr>
-    <w:tblStylePr w:type="lastCol">
-      <w:rPr>
-        <w:b/>
-        <w:bCs/>
-      </w:rPr>
     </w:tblStylePr>
     <w:tblStylePr w:type="band1Vert">
       <w:tblPr/>
@@ -13167,11 +13110,6 @@
       <w:pPr>
         <w:spacing w:before="0" w:after="0" w:line="240" w:lineRule="auto"/>
       </w:pPr>
-      <w:rPr>
-        <w:b/>
-        <w:bCs/>
-        <w:color w:val="FFFFFF" w:themeColor="background1"/>
-      </w:rPr>
       <w:tblPr/>
       <w:tcPr>
         <w:shd w:val="clear" w:color="auto" w:fill="9BBB59" w:themeFill="accent3"/>
@@ -13181,10 +13119,6 @@
       <w:pPr>
         <w:spacing w:before="0" w:after="0" w:line="240" w:lineRule="auto"/>
       </w:pPr>
-      <w:rPr>
-        <w:b/>
-        <w:bCs/>
-      </w:rPr>
       <w:tblPr/>
       <w:tcPr>
         <w:tcBorders>
@@ -13194,18 +13128,6 @@
           <w:right w:val="single" w:sz="8" w:space="0" w:color="9BBB59" w:themeColor="accent3"/>
         </w:tcBorders>
       </w:tcPr>
-    </w:tblStylePr>
-    <w:tblStylePr w:type="firstCol">
-      <w:rPr>
-        <w:b/>
-        <w:bCs/>
-      </w:rPr>
-    </w:tblStylePr>
-    <w:tblStylePr w:type="lastCol">
-      <w:rPr>
-        <w:b/>
-        <w:bCs/>
-      </w:rPr>
     </w:tblStylePr>
     <w:tblStylePr w:type="band1Vert">
       <w:tblPr/>
@@ -13252,11 +13174,6 @@
       <w:pPr>
         <w:spacing w:before="0" w:after="0" w:line="240" w:lineRule="auto"/>
       </w:pPr>
-      <w:rPr>
-        <w:b/>
-        <w:bCs/>
-        <w:color w:val="FFFFFF" w:themeColor="background1"/>
-      </w:rPr>
       <w:tblPr/>
       <w:tcPr>
         <w:shd w:val="clear" w:color="auto" w:fill="8064A2" w:themeFill="accent4"/>
@@ -13266,10 +13183,6 @@
       <w:pPr>
         <w:spacing w:before="0" w:after="0" w:line="240" w:lineRule="auto"/>
       </w:pPr>
-      <w:rPr>
-        <w:b/>
-        <w:bCs/>
-      </w:rPr>
       <w:tblPr/>
       <w:tcPr>
         <w:tcBorders>
@@ -13279,18 +13192,6 @@
           <w:right w:val="single" w:sz="8" w:space="0" w:color="8064A2" w:themeColor="accent4"/>
         </w:tcBorders>
       </w:tcPr>
-    </w:tblStylePr>
-    <w:tblStylePr w:type="firstCol">
-      <w:rPr>
-        <w:b/>
-        <w:bCs/>
-      </w:rPr>
-    </w:tblStylePr>
-    <w:tblStylePr w:type="lastCol">
-      <w:rPr>
-        <w:b/>
-        <w:bCs/>
-      </w:rPr>
     </w:tblStylePr>
     <w:tblStylePr w:type="band1Vert">
       <w:tblPr/>
@@ -13337,11 +13238,6 @@
       <w:pPr>
         <w:spacing w:before="0" w:after="0" w:line="240" w:lineRule="auto"/>
       </w:pPr>
-      <w:rPr>
-        <w:b/>
-        <w:bCs/>
-        <w:color w:val="FFFFFF" w:themeColor="background1"/>
-      </w:rPr>
       <w:tblPr/>
       <w:tcPr>
         <w:shd w:val="clear" w:color="auto" w:fill="4BACC6" w:themeFill="accent5"/>
@@ -13351,10 +13247,6 @@
       <w:pPr>
         <w:spacing w:before="0" w:after="0" w:line="240" w:lineRule="auto"/>
       </w:pPr>
-      <w:rPr>
-        <w:b/>
-        <w:bCs/>
-      </w:rPr>
       <w:tblPr/>
       <w:tcPr>
         <w:tcBorders>
@@ -13364,18 +13256,6 @@
           <w:right w:val="single" w:sz="8" w:space="0" w:color="4BACC6" w:themeColor="accent5"/>
         </w:tcBorders>
       </w:tcPr>
-    </w:tblStylePr>
-    <w:tblStylePr w:type="firstCol">
-      <w:rPr>
-        <w:b/>
-        <w:bCs/>
-      </w:rPr>
-    </w:tblStylePr>
-    <w:tblStylePr w:type="lastCol">
-      <w:rPr>
-        <w:b/>
-        <w:bCs/>
-      </w:rPr>
     </w:tblStylePr>
     <w:tblStylePr w:type="band1Vert">
       <w:tblPr/>
@@ -13422,11 +13302,6 @@
       <w:pPr>
         <w:spacing w:before="0" w:after="0" w:line="240" w:lineRule="auto"/>
       </w:pPr>
-      <w:rPr>
-        <w:b/>
-        <w:bCs/>
-        <w:color w:val="FFFFFF" w:themeColor="background1"/>
-      </w:rPr>
       <w:tblPr/>
       <w:tcPr>
         <w:shd w:val="clear" w:color="auto" w:fill="F79646" w:themeFill="accent6"/>
@@ -13436,10 +13311,6 @@
       <w:pPr>
         <w:spacing w:before="0" w:after="0" w:line="240" w:lineRule="auto"/>
       </w:pPr>
-      <w:rPr>
-        <w:b/>
-        <w:bCs/>
-      </w:rPr>
       <w:tblPr/>
       <w:tcPr>
         <w:tcBorders>
@@ -13449,18 +13320,6 @@
           <w:right w:val="single" w:sz="8" w:space="0" w:color="F79646" w:themeColor="accent6"/>
         </w:tcBorders>
       </w:tcPr>
-    </w:tblStylePr>
-    <w:tblStylePr w:type="firstCol">
-      <w:rPr>
-        <w:b/>
-        <w:bCs/>
-      </w:rPr>
-    </w:tblStylePr>
-    <w:tblStylePr w:type="lastCol">
-      <w:rPr>
-        <w:b/>
-        <w:bCs/>
-      </w:rPr>
     </w:tblStylePr>
     <w:tblStylePr w:type="band1Vert">
       <w:tblPr/>
@@ -13509,11 +13368,6 @@
       <w:pPr>
         <w:spacing w:before="0" w:after="0" w:line="240" w:lineRule="auto"/>
       </w:pPr>
-      <w:rPr>
-        <w:rFonts w:asciiTheme="majorHAnsi" w:eastAsiaTheme="majorEastAsia" w:hAnsiTheme="majorHAnsi" w:cstheme="majorBidi"/>
-        <w:b/>
-        <w:bCs/>
-      </w:rPr>
       <w:tblPr/>
       <w:tcPr>
         <w:tcBorders>
@@ -13530,11 +13384,6 @@
       <w:pPr>
         <w:spacing w:before="0" w:after="0" w:line="240" w:lineRule="auto"/>
       </w:pPr>
-      <w:rPr>
-        <w:rFonts w:asciiTheme="majorHAnsi" w:eastAsiaTheme="majorEastAsia" w:hAnsiTheme="majorHAnsi" w:cstheme="majorBidi"/>
-        <w:b/>
-        <w:bCs/>
-      </w:rPr>
       <w:tblPr/>
       <w:tcPr>
         <w:tcBorders>
@@ -13547,19 +13396,7 @@
         </w:tcBorders>
       </w:tcPr>
     </w:tblStylePr>
-    <w:tblStylePr w:type="firstCol">
-      <w:rPr>
-        <w:rFonts w:asciiTheme="majorHAnsi" w:eastAsiaTheme="majorEastAsia" w:hAnsiTheme="majorHAnsi" w:cstheme="majorBidi"/>
-        <w:b/>
-        <w:bCs/>
-      </w:rPr>
-    </w:tblStylePr>
     <w:tblStylePr w:type="lastCol">
-      <w:rPr>
-        <w:rFonts w:asciiTheme="majorHAnsi" w:eastAsiaTheme="majorEastAsia" w:hAnsiTheme="majorHAnsi" w:cstheme="majorBidi"/>
-        <w:b/>
-        <w:bCs/>
-      </w:rPr>
       <w:tblPr/>
       <w:tcPr>
         <w:tcBorders>
@@ -13632,11 +13469,6 @@
       <w:pPr>
         <w:spacing w:before="0" w:after="0" w:line="240" w:lineRule="auto"/>
       </w:pPr>
-      <w:rPr>
-        <w:rFonts w:asciiTheme="majorHAnsi" w:eastAsiaTheme="majorEastAsia" w:hAnsiTheme="majorHAnsi" w:cstheme="majorBidi"/>
-        <w:b/>
-        <w:bCs/>
-      </w:rPr>
       <w:tblPr/>
       <w:tcPr>
         <w:tcBorders>
@@ -13653,11 +13485,6 @@
       <w:pPr>
         <w:spacing w:before="0" w:after="0" w:line="240" w:lineRule="auto"/>
       </w:pPr>
-      <w:rPr>
-        <w:rFonts w:asciiTheme="majorHAnsi" w:eastAsiaTheme="majorEastAsia" w:hAnsiTheme="majorHAnsi" w:cstheme="majorBidi"/>
-        <w:b/>
-        <w:bCs/>
-      </w:rPr>
       <w:tblPr/>
       <w:tcPr>
         <w:tcBorders>
@@ -13670,19 +13497,7 @@
         </w:tcBorders>
       </w:tcPr>
     </w:tblStylePr>
-    <w:tblStylePr w:type="firstCol">
-      <w:rPr>
-        <w:rFonts w:asciiTheme="majorHAnsi" w:eastAsiaTheme="majorEastAsia" w:hAnsiTheme="majorHAnsi" w:cstheme="majorBidi"/>
-        <w:b/>
-        <w:bCs/>
-      </w:rPr>
-    </w:tblStylePr>
     <w:tblStylePr w:type="lastCol">
-      <w:rPr>
-        <w:rFonts w:asciiTheme="majorHAnsi" w:eastAsiaTheme="majorEastAsia" w:hAnsiTheme="majorHAnsi" w:cstheme="majorBidi"/>
-        <w:b/>
-        <w:bCs/>
-      </w:rPr>
       <w:tblPr/>
       <w:tcPr>
         <w:tcBorders>
@@ -13755,11 +13570,6 @@
       <w:pPr>
         <w:spacing w:before="0" w:after="0" w:line="240" w:lineRule="auto"/>
       </w:pPr>
-      <w:rPr>
-        <w:rFonts w:asciiTheme="majorHAnsi" w:eastAsiaTheme="majorEastAsia" w:hAnsiTheme="majorHAnsi" w:cstheme="majorBidi"/>
-        <w:b/>
-        <w:bCs/>
-      </w:rPr>
       <w:tblPr/>
       <w:tcPr>
         <w:tcBorders>
@@ -13776,11 +13586,6 @@
       <w:pPr>
         <w:spacing w:before="0" w:after="0" w:line="240" w:lineRule="auto"/>
       </w:pPr>
-      <w:rPr>
-        <w:rFonts w:asciiTheme="majorHAnsi" w:eastAsiaTheme="majorEastAsia" w:hAnsiTheme="majorHAnsi" w:cstheme="majorBidi"/>
-        <w:b/>
-        <w:bCs/>
-      </w:rPr>
       <w:tblPr/>
       <w:tcPr>
         <w:tcBorders>
@@ -13793,19 +13598,7 @@
         </w:tcBorders>
       </w:tcPr>
     </w:tblStylePr>
-    <w:tblStylePr w:type="firstCol">
-      <w:rPr>
-        <w:rFonts w:asciiTheme="majorHAnsi" w:eastAsiaTheme="majorEastAsia" w:hAnsiTheme="majorHAnsi" w:cstheme="majorBidi"/>
-        <w:b/>
-        <w:bCs/>
-      </w:rPr>
-    </w:tblStylePr>
     <w:tblStylePr w:type="lastCol">
-      <w:rPr>
-        <w:rFonts w:asciiTheme="majorHAnsi" w:eastAsiaTheme="majorEastAsia" w:hAnsiTheme="majorHAnsi" w:cstheme="majorBidi"/>
-        <w:b/>
-        <w:bCs/>
-      </w:rPr>
       <w:tblPr/>
       <w:tcPr>
         <w:tcBorders>
@@ -13878,11 +13671,6 @@
       <w:pPr>
         <w:spacing w:before="0" w:after="0" w:line="240" w:lineRule="auto"/>
       </w:pPr>
-      <w:rPr>
-        <w:rFonts w:asciiTheme="majorHAnsi" w:eastAsiaTheme="majorEastAsia" w:hAnsiTheme="majorHAnsi" w:cstheme="majorBidi"/>
-        <w:b/>
-        <w:bCs/>
-      </w:rPr>
       <w:tblPr/>
       <w:tcPr>
         <w:tcBorders>
@@ -13899,11 +13687,6 @@
       <w:pPr>
         <w:spacing w:before="0" w:after="0" w:line="240" w:lineRule="auto"/>
       </w:pPr>
-      <w:rPr>
-        <w:rFonts w:asciiTheme="majorHAnsi" w:eastAsiaTheme="majorEastAsia" w:hAnsiTheme="majorHAnsi" w:cstheme="majorBidi"/>
-        <w:b/>
-        <w:bCs/>
-      </w:rPr>
       <w:tblPr/>
       <w:tcPr>
         <w:tcBorders>
@@ -13916,19 +13699,7 @@
         </w:tcBorders>
       </w:tcPr>
     </w:tblStylePr>
-    <w:tblStylePr w:type="firstCol">
-      <w:rPr>
-        <w:rFonts w:asciiTheme="majorHAnsi" w:eastAsiaTheme="majorEastAsia" w:hAnsiTheme="majorHAnsi" w:cstheme="majorBidi"/>
-        <w:b/>
-        <w:bCs/>
-      </w:rPr>
-    </w:tblStylePr>
     <w:tblStylePr w:type="lastCol">
-      <w:rPr>
-        <w:rFonts w:asciiTheme="majorHAnsi" w:eastAsiaTheme="majorEastAsia" w:hAnsiTheme="majorHAnsi" w:cstheme="majorBidi"/>
-        <w:b/>
-        <w:bCs/>
-      </w:rPr>
       <w:tblPr/>
       <w:tcPr>
         <w:tcBorders>
@@ -14001,11 +13772,6 @@
       <w:pPr>
         <w:spacing w:before="0" w:after="0" w:line="240" w:lineRule="auto"/>
       </w:pPr>
-      <w:rPr>
-        <w:rFonts w:asciiTheme="majorHAnsi" w:eastAsiaTheme="majorEastAsia" w:hAnsiTheme="majorHAnsi" w:cstheme="majorBidi"/>
-        <w:b/>
-        <w:bCs/>
-      </w:rPr>
       <w:tblPr/>
       <w:tcPr>
         <w:tcBorders>
@@ -14022,11 +13788,6 @@
       <w:pPr>
         <w:spacing w:before="0" w:after="0" w:line="240" w:lineRule="auto"/>
       </w:pPr>
-      <w:rPr>
-        <w:rFonts w:asciiTheme="majorHAnsi" w:eastAsiaTheme="majorEastAsia" w:hAnsiTheme="majorHAnsi" w:cstheme="majorBidi"/>
-        <w:b/>
-        <w:bCs/>
-      </w:rPr>
       <w:tblPr/>
       <w:tcPr>
         <w:tcBorders>
@@ -14039,19 +13800,7 @@
         </w:tcBorders>
       </w:tcPr>
     </w:tblStylePr>
-    <w:tblStylePr w:type="firstCol">
-      <w:rPr>
-        <w:rFonts w:asciiTheme="majorHAnsi" w:eastAsiaTheme="majorEastAsia" w:hAnsiTheme="majorHAnsi" w:cstheme="majorBidi"/>
-        <w:b/>
-        <w:bCs/>
-      </w:rPr>
-    </w:tblStylePr>
     <w:tblStylePr w:type="lastCol">
-      <w:rPr>
-        <w:rFonts w:asciiTheme="majorHAnsi" w:eastAsiaTheme="majorEastAsia" w:hAnsiTheme="majorHAnsi" w:cstheme="majorBidi"/>
-        <w:b/>
-        <w:bCs/>
-      </w:rPr>
       <w:tblPr/>
       <w:tcPr>
         <w:tcBorders>
@@ -14124,11 +13873,6 @@
       <w:pPr>
         <w:spacing w:before="0" w:after="0" w:line="240" w:lineRule="auto"/>
       </w:pPr>
-      <w:rPr>
-        <w:rFonts w:asciiTheme="majorHAnsi" w:eastAsiaTheme="majorEastAsia" w:hAnsiTheme="majorHAnsi" w:cstheme="majorBidi"/>
-        <w:b/>
-        <w:bCs/>
-      </w:rPr>
       <w:tblPr/>
       <w:tcPr>
         <w:tcBorders>
@@ -14145,11 +13889,6 @@
       <w:pPr>
         <w:spacing w:before="0" w:after="0" w:line="240" w:lineRule="auto"/>
       </w:pPr>
-      <w:rPr>
-        <w:rFonts w:asciiTheme="majorHAnsi" w:eastAsiaTheme="majorEastAsia" w:hAnsiTheme="majorHAnsi" w:cstheme="majorBidi"/>
-        <w:b/>
-        <w:bCs/>
-      </w:rPr>
       <w:tblPr/>
       <w:tcPr>
         <w:tcBorders>
@@ -14162,19 +13901,7 @@
         </w:tcBorders>
       </w:tcPr>
     </w:tblStylePr>
-    <w:tblStylePr w:type="firstCol">
-      <w:rPr>
-        <w:rFonts w:asciiTheme="majorHAnsi" w:eastAsiaTheme="majorEastAsia" w:hAnsiTheme="majorHAnsi" w:cstheme="majorBidi"/>
-        <w:b/>
-        <w:bCs/>
-      </w:rPr>
-    </w:tblStylePr>
     <w:tblStylePr w:type="lastCol">
-      <w:rPr>
-        <w:rFonts w:asciiTheme="majorHAnsi" w:eastAsiaTheme="majorEastAsia" w:hAnsiTheme="majorHAnsi" w:cstheme="majorBidi"/>
-        <w:b/>
-        <w:bCs/>
-      </w:rPr>
       <w:tblPr/>
       <w:tcPr>
         <w:tcBorders>
@@ -14247,11 +13974,6 @@
       <w:pPr>
         <w:spacing w:before="0" w:after="0" w:line="240" w:lineRule="auto"/>
       </w:pPr>
-      <w:rPr>
-        <w:rFonts w:asciiTheme="majorHAnsi" w:eastAsiaTheme="majorEastAsia" w:hAnsiTheme="majorHAnsi" w:cstheme="majorBidi"/>
-        <w:b/>
-        <w:bCs/>
-      </w:rPr>
       <w:tblPr/>
       <w:tcPr>
         <w:tcBorders>
@@ -14268,11 +13990,6 @@
       <w:pPr>
         <w:spacing w:before="0" w:after="0" w:line="240" w:lineRule="auto"/>
       </w:pPr>
-      <w:rPr>
-        <w:rFonts w:asciiTheme="majorHAnsi" w:eastAsiaTheme="majorEastAsia" w:hAnsiTheme="majorHAnsi" w:cstheme="majorBidi"/>
-        <w:b/>
-        <w:bCs/>
-      </w:rPr>
       <w:tblPr/>
       <w:tcPr>
         <w:tcBorders>
@@ -14285,19 +14002,7 @@
         </w:tcBorders>
       </w:tcPr>
     </w:tblStylePr>
-    <w:tblStylePr w:type="firstCol">
-      <w:rPr>
-        <w:rFonts w:asciiTheme="majorHAnsi" w:eastAsiaTheme="majorEastAsia" w:hAnsiTheme="majorHAnsi" w:cstheme="majorBidi"/>
-        <w:b/>
-        <w:bCs/>
-      </w:rPr>
-    </w:tblStylePr>
     <w:tblStylePr w:type="lastCol">
-      <w:rPr>
-        <w:rFonts w:asciiTheme="majorHAnsi" w:eastAsiaTheme="majorEastAsia" w:hAnsiTheme="majorHAnsi" w:cstheme="majorBidi"/>
-        <w:b/>
-        <w:bCs/>
-      </w:rPr>
       <w:tblPr/>
       <w:tcPr>
         <w:tcBorders>
@@ -14369,11 +14074,6 @@
       <w:pPr>
         <w:spacing w:before="0" w:after="0" w:line="240" w:lineRule="auto"/>
       </w:pPr>
-      <w:rPr>
-        <w:b/>
-        <w:bCs/>
-        <w:color w:val="FFFFFF" w:themeColor="background1"/>
-      </w:rPr>
       <w:tblPr/>
       <w:tcPr>
         <w:tcBorders>
@@ -14391,10 +14091,6 @@
       <w:pPr>
         <w:spacing w:before="0" w:after="0" w:line="240" w:lineRule="auto"/>
       </w:pPr>
-      <w:rPr>
-        <w:b/>
-        <w:bCs/>
-      </w:rPr>
       <w:tblPr/>
       <w:tcPr>
         <w:tcBorders>
@@ -14406,18 +14102,6 @@
           <w:insideV w:val="nil"/>
         </w:tcBorders>
       </w:tcPr>
-    </w:tblStylePr>
-    <w:tblStylePr w:type="firstCol">
-      <w:rPr>
-        <w:b/>
-        <w:bCs/>
-      </w:rPr>
-    </w:tblStylePr>
-    <w:tblStylePr w:type="lastCol">
-      <w:rPr>
-        <w:b/>
-        <w:bCs/>
-      </w:rPr>
     </w:tblStylePr>
     <w:tblStylePr w:type="band1Vert">
       <w:tblPr/>
@@ -14468,11 +14152,6 @@
       <w:pPr>
         <w:spacing w:before="0" w:after="0" w:line="240" w:lineRule="auto"/>
       </w:pPr>
-      <w:rPr>
-        <w:b/>
-        <w:bCs/>
-        <w:color w:val="FFFFFF" w:themeColor="background1"/>
-      </w:rPr>
       <w:tblPr/>
       <w:tcPr>
         <w:tcBorders>
@@ -14490,10 +14169,6 @@
       <w:pPr>
         <w:spacing w:before="0" w:after="0" w:line="240" w:lineRule="auto"/>
       </w:pPr>
-      <w:rPr>
-        <w:b/>
-        <w:bCs/>
-      </w:rPr>
       <w:tblPr/>
       <w:tcPr>
         <w:tcBorders>
@@ -14505,18 +14180,6 @@
           <w:insideV w:val="nil"/>
         </w:tcBorders>
       </w:tcPr>
-    </w:tblStylePr>
-    <w:tblStylePr w:type="firstCol">
-      <w:rPr>
-        <w:b/>
-        <w:bCs/>
-      </w:rPr>
-    </w:tblStylePr>
-    <w:tblStylePr w:type="lastCol">
-      <w:rPr>
-        <w:b/>
-        <w:bCs/>
-      </w:rPr>
     </w:tblStylePr>
     <w:tblStylePr w:type="band1Vert">
       <w:tblPr/>
@@ -14567,11 +14230,6 @@
       <w:pPr>
         <w:spacing w:before="0" w:after="0" w:line="240" w:lineRule="auto"/>
       </w:pPr>
-      <w:rPr>
-        <w:b/>
-        <w:bCs/>
-        <w:color w:val="FFFFFF" w:themeColor="background1"/>
-      </w:rPr>
       <w:tblPr/>
       <w:tcPr>
         <w:tcBorders>
@@ -14589,10 +14247,6 @@
       <w:pPr>
         <w:spacing w:before="0" w:after="0" w:line="240" w:lineRule="auto"/>
       </w:pPr>
-      <w:rPr>
-        <w:b/>
-        <w:bCs/>
-      </w:rPr>
       <w:tblPr/>
       <w:tcPr>
         <w:tcBorders>
@@ -14604,18 +14258,6 @@
           <w:insideV w:val="nil"/>
         </w:tcBorders>
       </w:tcPr>
-    </w:tblStylePr>
-    <w:tblStylePr w:type="firstCol">
-      <w:rPr>
-        <w:b/>
-        <w:bCs/>
-      </w:rPr>
-    </w:tblStylePr>
-    <w:tblStylePr w:type="lastCol">
-      <w:rPr>
-        <w:b/>
-        <w:bCs/>
-      </w:rPr>
     </w:tblStylePr>
     <w:tblStylePr w:type="band1Vert">
       <w:tblPr/>
@@ -14666,11 +14308,6 @@
       <w:pPr>
         <w:spacing w:before="0" w:after="0" w:line="240" w:lineRule="auto"/>
       </w:pPr>
-      <w:rPr>
-        <w:b/>
-        <w:bCs/>
-        <w:color w:val="FFFFFF" w:themeColor="background1"/>
-      </w:rPr>
       <w:tblPr/>
       <w:tcPr>
         <w:tcBorders>
@@ -14688,10 +14325,6 @@
       <w:pPr>
         <w:spacing w:before="0" w:after="0" w:line="240" w:lineRule="auto"/>
       </w:pPr>
-      <w:rPr>
-        <w:b/>
-        <w:bCs/>
-      </w:rPr>
       <w:tblPr/>
       <w:tcPr>
         <w:tcBorders>
@@ -14703,18 +14336,6 @@
           <w:insideV w:val="nil"/>
         </w:tcBorders>
       </w:tcPr>
-    </w:tblStylePr>
-    <w:tblStylePr w:type="firstCol">
-      <w:rPr>
-        <w:b/>
-        <w:bCs/>
-      </w:rPr>
-    </w:tblStylePr>
-    <w:tblStylePr w:type="lastCol">
-      <w:rPr>
-        <w:b/>
-        <w:bCs/>
-      </w:rPr>
     </w:tblStylePr>
     <w:tblStylePr w:type="band1Vert">
       <w:tblPr/>
@@ -14765,11 +14386,6 @@
       <w:pPr>
         <w:spacing w:before="0" w:after="0" w:line="240" w:lineRule="auto"/>
       </w:pPr>
-      <w:rPr>
-        <w:b/>
-        <w:bCs/>
-        <w:color w:val="FFFFFF" w:themeColor="background1"/>
-      </w:rPr>
       <w:tblPr/>
       <w:tcPr>
         <w:tcBorders>
@@ -14787,10 +14403,6 @@
       <w:pPr>
         <w:spacing w:before="0" w:after="0" w:line="240" w:lineRule="auto"/>
       </w:pPr>
-      <w:rPr>
-        <w:b/>
-        <w:bCs/>
-      </w:rPr>
       <w:tblPr/>
       <w:tcPr>
         <w:tcBorders>
@@ -14802,18 +14414,6 @@
           <w:insideV w:val="nil"/>
         </w:tcBorders>
       </w:tcPr>
-    </w:tblStylePr>
-    <w:tblStylePr w:type="firstCol">
-      <w:rPr>
-        <w:b/>
-        <w:bCs/>
-      </w:rPr>
-    </w:tblStylePr>
-    <w:tblStylePr w:type="lastCol">
-      <w:rPr>
-        <w:b/>
-        <w:bCs/>
-      </w:rPr>
     </w:tblStylePr>
     <w:tblStylePr w:type="band1Vert">
       <w:tblPr/>
@@ -14864,11 +14464,6 @@
       <w:pPr>
         <w:spacing w:before="0" w:after="0" w:line="240" w:lineRule="auto"/>
       </w:pPr>
-      <w:rPr>
-        <w:b/>
-        <w:bCs/>
-        <w:color w:val="FFFFFF" w:themeColor="background1"/>
-      </w:rPr>
       <w:tblPr/>
       <w:tcPr>
         <w:tcBorders>
@@ -14886,10 +14481,6 @@
       <w:pPr>
         <w:spacing w:before="0" w:after="0" w:line="240" w:lineRule="auto"/>
       </w:pPr>
-      <w:rPr>
-        <w:b/>
-        <w:bCs/>
-      </w:rPr>
       <w:tblPr/>
       <w:tcPr>
         <w:tcBorders>
@@ -14901,18 +14492,6 @@
           <w:insideV w:val="nil"/>
         </w:tcBorders>
       </w:tcPr>
-    </w:tblStylePr>
-    <w:tblStylePr w:type="firstCol">
-      <w:rPr>
-        <w:b/>
-        <w:bCs/>
-      </w:rPr>
-    </w:tblStylePr>
-    <w:tblStylePr w:type="lastCol">
-      <w:rPr>
-        <w:b/>
-        <w:bCs/>
-      </w:rPr>
     </w:tblStylePr>
     <w:tblStylePr w:type="band1Vert">
       <w:tblPr/>
@@ -14963,11 +14542,6 @@
       <w:pPr>
         <w:spacing w:before="0" w:after="0" w:line="240" w:lineRule="auto"/>
       </w:pPr>
-      <w:rPr>
-        <w:b/>
-        <w:bCs/>
-        <w:color w:val="FFFFFF" w:themeColor="background1"/>
-      </w:rPr>
       <w:tblPr/>
       <w:tcPr>
         <w:tcBorders>
@@ -14985,10 +14559,6 @@
       <w:pPr>
         <w:spacing w:before="0" w:after="0" w:line="240" w:lineRule="auto"/>
       </w:pPr>
-      <w:rPr>
-        <w:b/>
-        <w:bCs/>
-      </w:rPr>
       <w:tblPr/>
       <w:tcPr>
         <w:tcBorders>
@@ -15000,18 +14570,6 @@
           <w:insideV w:val="nil"/>
         </w:tcBorders>
       </w:tcPr>
-    </w:tblStylePr>
-    <w:tblStylePr w:type="firstCol">
-      <w:rPr>
-        <w:b/>
-        <w:bCs/>
-      </w:rPr>
-    </w:tblStylePr>
-    <w:tblStylePr w:type="lastCol">
-      <w:rPr>
-        <w:b/>
-        <w:bCs/>
-      </w:rPr>
     </w:tblStylePr>
     <w:tblStylePr w:type="band1Vert">
       <w:tblPr/>
@@ -15059,11 +14617,6 @@
       <w:pPr>
         <w:spacing w:before="0" w:after="0" w:line="240" w:lineRule="auto"/>
       </w:pPr>
-      <w:rPr>
-        <w:b/>
-        <w:bCs/>
-        <w:color w:val="FFFFFF" w:themeColor="background1"/>
-      </w:rPr>
       <w:tblPr/>
       <w:tcPr>
         <w:tcBorders>
@@ -15081,9 +14634,6 @@
       <w:pPr>
         <w:spacing w:before="0" w:after="0" w:line="240" w:lineRule="auto"/>
       </w:pPr>
-      <w:rPr>
-        <w:color w:val="auto"/>
-      </w:rPr>
       <w:tblPr/>
       <w:tcPr>
         <w:tcBorders>
@@ -15098,11 +14648,6 @@
       </w:tcPr>
     </w:tblStylePr>
     <w:tblStylePr w:type="firstCol">
-      <w:rPr>
-        <w:b/>
-        <w:bCs/>
-        <w:color w:val="FFFFFF" w:themeColor="background1"/>
-      </w:rPr>
       <w:tblPr/>
       <w:tcPr>
         <w:tcBorders>
@@ -15117,11 +14662,6 @@
       </w:tcPr>
     </w:tblStylePr>
     <w:tblStylePr w:type="lastCol">
-      <w:rPr>
-        <w:b/>
-        <w:bCs/>
-        <w:color w:val="FFFFFF" w:themeColor="background1"/>
-      </w:rPr>
       <w:tblPr/>
       <w:tcPr>
         <w:tcBorders>
@@ -15165,9 +14705,6 @@
       </w:tcPr>
     </w:tblStylePr>
     <w:tblStylePr w:type="nwCell">
-      <w:rPr>
-        <w:color w:val="FFFFFF" w:themeColor="background1"/>
-      </w:rPr>
       <w:tblPr/>
       <w:tcPr>
         <w:tcBorders>
@@ -15201,11 +14738,6 @@
       <w:pPr>
         <w:spacing w:before="0" w:after="0" w:line="240" w:lineRule="auto"/>
       </w:pPr>
-      <w:rPr>
-        <w:b/>
-        <w:bCs/>
-        <w:color w:val="FFFFFF" w:themeColor="background1"/>
-      </w:rPr>
       <w:tblPr/>
       <w:tcPr>
         <w:tcBorders>
@@ -15223,9 +14755,6 @@
       <w:pPr>
         <w:spacing w:before="0" w:after="0" w:line="240" w:lineRule="auto"/>
       </w:pPr>
-      <w:rPr>
-        <w:color w:val="auto"/>
-      </w:rPr>
       <w:tblPr/>
       <w:tcPr>
         <w:tcBorders>
@@ -15240,11 +14769,6 @@
       </w:tcPr>
     </w:tblStylePr>
     <w:tblStylePr w:type="firstCol">
-      <w:rPr>
-        <w:b/>
-        <w:bCs/>
-        <w:color w:val="FFFFFF" w:themeColor="background1"/>
-      </w:rPr>
       <w:tblPr/>
       <w:tcPr>
         <w:tcBorders>
@@ -15259,11 +14783,6 @@
       </w:tcPr>
     </w:tblStylePr>
     <w:tblStylePr w:type="lastCol">
-      <w:rPr>
-        <w:b/>
-        <w:bCs/>
-        <w:color w:val="FFFFFF" w:themeColor="background1"/>
-      </w:rPr>
       <w:tblPr/>
       <w:tcPr>
         <w:tcBorders>
@@ -15307,9 +14826,6 @@
       </w:tcPr>
     </w:tblStylePr>
     <w:tblStylePr w:type="nwCell">
-      <w:rPr>
-        <w:color w:val="FFFFFF" w:themeColor="background1"/>
-      </w:rPr>
       <w:tblPr/>
       <w:tcPr>
         <w:tcBorders>
@@ -15343,11 +14859,6 @@
       <w:pPr>
         <w:spacing w:before="0" w:after="0" w:line="240" w:lineRule="auto"/>
       </w:pPr>
-      <w:rPr>
-        <w:b/>
-        <w:bCs/>
-        <w:color w:val="FFFFFF" w:themeColor="background1"/>
-      </w:rPr>
       <w:tblPr/>
       <w:tcPr>
         <w:tcBorders>
@@ -15365,9 +14876,6 @@
       <w:pPr>
         <w:spacing w:before="0" w:after="0" w:line="240" w:lineRule="auto"/>
       </w:pPr>
-      <w:rPr>
-        <w:color w:val="auto"/>
-      </w:rPr>
       <w:tblPr/>
       <w:tcPr>
         <w:tcBorders>
@@ -15382,11 +14890,6 @@
       </w:tcPr>
     </w:tblStylePr>
     <w:tblStylePr w:type="firstCol">
-      <w:rPr>
-        <w:b/>
-        <w:bCs/>
-        <w:color w:val="FFFFFF" w:themeColor="background1"/>
-      </w:rPr>
       <w:tblPr/>
       <w:tcPr>
         <w:tcBorders>
@@ -15401,11 +14904,6 @@
       </w:tcPr>
     </w:tblStylePr>
     <w:tblStylePr w:type="lastCol">
-      <w:rPr>
-        <w:b/>
-        <w:bCs/>
-        <w:color w:val="FFFFFF" w:themeColor="background1"/>
-      </w:rPr>
       <w:tblPr/>
       <w:tcPr>
         <w:tcBorders>
@@ -15449,9 +14947,6 @@
       </w:tcPr>
     </w:tblStylePr>
     <w:tblStylePr w:type="nwCell">
-      <w:rPr>
-        <w:color w:val="FFFFFF" w:themeColor="background1"/>
-      </w:rPr>
       <w:tblPr/>
       <w:tcPr>
         <w:tcBorders>
@@ -15485,11 +14980,6 @@
       <w:pPr>
         <w:spacing w:before="0" w:after="0" w:line="240" w:lineRule="auto"/>
       </w:pPr>
-      <w:rPr>
-        <w:b/>
-        <w:bCs/>
-        <w:color w:val="FFFFFF" w:themeColor="background1"/>
-      </w:rPr>
       <w:tblPr/>
       <w:tcPr>
         <w:tcBorders>
@@ -15507,9 +14997,6 @@
       <w:pPr>
         <w:spacing w:before="0" w:after="0" w:line="240" w:lineRule="auto"/>
       </w:pPr>
-      <w:rPr>
-        <w:color w:val="auto"/>
-      </w:rPr>
       <w:tblPr/>
       <w:tcPr>
         <w:tcBorders>
@@ -15524,11 +15011,6 @@
       </w:tcPr>
     </w:tblStylePr>
     <w:tblStylePr w:type="firstCol">
-      <w:rPr>
-        <w:b/>
-        <w:bCs/>
-        <w:color w:val="FFFFFF" w:themeColor="background1"/>
-      </w:rPr>
       <w:tblPr/>
       <w:tcPr>
         <w:tcBorders>
@@ -15543,11 +15025,6 @@
       </w:tcPr>
     </w:tblStylePr>
     <w:tblStylePr w:type="lastCol">
-      <w:rPr>
-        <w:b/>
-        <w:bCs/>
-        <w:color w:val="FFFFFF" w:themeColor="background1"/>
-      </w:rPr>
       <w:tblPr/>
       <w:tcPr>
         <w:tcBorders>
@@ -15591,9 +15068,6 @@
       </w:tcPr>
     </w:tblStylePr>
     <w:tblStylePr w:type="nwCell">
-      <w:rPr>
-        <w:color w:val="FFFFFF" w:themeColor="background1"/>
-      </w:rPr>
       <w:tblPr/>
       <w:tcPr>
         <w:tcBorders>
@@ -15627,11 +15101,6 @@
       <w:pPr>
         <w:spacing w:before="0" w:after="0" w:line="240" w:lineRule="auto"/>
       </w:pPr>
-      <w:rPr>
-        <w:b/>
-        <w:bCs/>
-        <w:color w:val="FFFFFF" w:themeColor="background1"/>
-      </w:rPr>
       <w:tblPr/>
       <w:tcPr>
         <w:tcBorders>
@@ -15649,9 +15118,6 @@
       <w:pPr>
         <w:spacing w:before="0" w:after="0" w:line="240" w:lineRule="auto"/>
       </w:pPr>
-      <w:rPr>
-        <w:color w:val="auto"/>
-      </w:rPr>
       <w:tblPr/>
       <w:tcPr>
         <w:tcBorders>
@@ -15666,11 +15132,6 @@
       </w:tcPr>
     </w:tblStylePr>
     <w:tblStylePr w:type="firstCol">
-      <w:rPr>
-        <w:b/>
-        <w:bCs/>
-        <w:color w:val="FFFFFF" w:themeColor="background1"/>
-      </w:rPr>
       <w:tblPr/>
       <w:tcPr>
         <w:tcBorders>
@@ -15685,11 +15146,6 @@
       </w:tcPr>
     </w:tblStylePr>
     <w:tblStylePr w:type="lastCol">
-      <w:rPr>
-        <w:b/>
-        <w:bCs/>
-        <w:color w:val="FFFFFF" w:themeColor="background1"/>
-      </w:rPr>
       <w:tblPr/>
       <w:tcPr>
         <w:tcBorders>
@@ -15733,9 +15189,6 @@
       </w:tcPr>
     </w:tblStylePr>
     <w:tblStylePr w:type="nwCell">
-      <w:rPr>
-        <w:color w:val="FFFFFF" w:themeColor="background1"/>
-      </w:rPr>
       <w:tblPr/>
       <w:tcPr>
         <w:tcBorders>
@@ -15769,11 +15222,6 @@
       <w:pPr>
         <w:spacing w:before="0" w:after="0" w:line="240" w:lineRule="auto"/>
       </w:pPr>
-      <w:rPr>
-        <w:b/>
-        <w:bCs/>
-        <w:color w:val="FFFFFF" w:themeColor="background1"/>
-      </w:rPr>
       <w:tblPr/>
       <w:tcPr>
         <w:tcBorders>
@@ -15791,9 +15239,6 @@
       <w:pPr>
         <w:spacing w:before="0" w:after="0" w:line="240" w:lineRule="auto"/>
       </w:pPr>
-      <w:rPr>
-        <w:color w:val="auto"/>
-      </w:rPr>
       <w:tblPr/>
       <w:tcPr>
         <w:tcBorders>
@@ -15808,11 +15253,6 @@
       </w:tcPr>
     </w:tblStylePr>
     <w:tblStylePr w:type="firstCol">
-      <w:rPr>
-        <w:b/>
-        <w:bCs/>
-        <w:color w:val="FFFFFF" w:themeColor="background1"/>
-      </w:rPr>
       <w:tblPr/>
       <w:tcPr>
         <w:tcBorders>
@@ -15827,11 +15267,6 @@
       </w:tcPr>
     </w:tblStylePr>
     <w:tblStylePr w:type="lastCol">
-      <w:rPr>
-        <w:b/>
-        <w:bCs/>
-        <w:color w:val="FFFFFF" w:themeColor="background1"/>
-      </w:rPr>
       <w:tblPr/>
       <w:tcPr>
         <w:tcBorders>
@@ -15875,9 +15310,6 @@
       </w:tcPr>
     </w:tblStylePr>
     <w:tblStylePr w:type="nwCell">
-      <w:rPr>
-        <w:color w:val="FFFFFF" w:themeColor="background1"/>
-      </w:rPr>
       <w:tblPr/>
       <w:tcPr>
         <w:tcBorders>
@@ -15911,11 +15343,6 @@
       <w:pPr>
         <w:spacing w:before="0" w:after="0" w:line="240" w:lineRule="auto"/>
       </w:pPr>
-      <w:rPr>
-        <w:b/>
-        <w:bCs/>
-        <w:color w:val="FFFFFF" w:themeColor="background1"/>
-      </w:rPr>
       <w:tblPr/>
       <w:tcPr>
         <w:tcBorders>
@@ -15933,9 +15360,6 @@
       <w:pPr>
         <w:spacing w:before="0" w:after="0" w:line="240" w:lineRule="auto"/>
       </w:pPr>
-      <w:rPr>
-        <w:color w:val="auto"/>
-      </w:rPr>
       <w:tblPr/>
       <w:tcPr>
         <w:tcBorders>
@@ -15950,11 +15374,6 @@
       </w:tcPr>
     </w:tblStylePr>
     <w:tblStylePr w:type="firstCol">
-      <w:rPr>
-        <w:b/>
-        <w:bCs/>
-        <w:color w:val="FFFFFF" w:themeColor="background1"/>
-      </w:rPr>
       <w:tblPr/>
       <w:tcPr>
         <w:tcBorders>
@@ -15969,11 +15388,6 @@
       </w:tcPr>
     </w:tblStylePr>
     <w:tblStylePr w:type="lastCol">
-      <w:rPr>
-        <w:b/>
-        <w:bCs/>
-        <w:color w:val="FFFFFF" w:themeColor="background1"/>
-      </w:rPr>
       <w:tblPr/>
       <w:tcPr>
         <w:tcBorders>
@@ -16017,9 +15431,6 @@
       </w:tcPr>
     </w:tblStylePr>
     <w:tblStylePr w:type="nwCell">
-      <w:rPr>
-        <w:color w:val="FFFFFF" w:themeColor="background1"/>
-      </w:rPr>
       <w:tblPr/>
       <w:tcPr>
         <w:tcBorders>
@@ -16041,9 +15452,6 @@
     <w:pPr>
       <w:spacing w:after="0" w:line="240" w:lineRule="auto"/>
     </w:pPr>
-    <w:rPr>
-      <w:color w:val="000000" w:themeColor="text1"/>
-    </w:rPr>
     <w:tblPr>
       <w:tblStyleRowBandSize w:val="1"/>
       <w:tblStyleColBandSize w:val="1"/>
@@ -16055,6 +15463,7 @@
     <w:tblStylePr w:type="firstRow">
       <w:rPr>
         <w:rFonts w:asciiTheme="majorHAnsi" w:eastAsiaTheme="majorEastAsia" w:hAnsiTheme="majorHAnsi" w:cstheme="majorBidi"/>
+        <w:color w:val="000000"/>
       </w:rPr>
       <w:tblPr/>
       <w:tcPr>
@@ -16068,7 +15477,7 @@
       <w:rPr>
         <w:b/>
         <w:bCs/>
-        <w:color w:val="1F497D" w:themeColor="text2"/>
+        <w:color w:val="000000"/>
       </w:rPr>
       <w:tblPr/>
       <w:tcPr>
@@ -16082,12 +15491,14 @@
       <w:rPr>
         <w:b/>
         <w:bCs/>
+        <w:color w:val="000000"/>
       </w:rPr>
     </w:tblStylePr>
     <w:tblStylePr w:type="lastCol">
       <w:rPr>
         <w:b/>
         <w:bCs/>
+        <w:color w:val="000000"/>
       </w:rPr>
       <w:tblPr/>
       <w:tcPr>
@@ -16118,9 +15529,6 @@
     <w:pPr>
       <w:spacing w:after="0" w:line="240" w:lineRule="auto"/>
     </w:pPr>
-    <w:rPr>
-      <w:color w:val="000000" w:themeColor="text1"/>
-    </w:rPr>
     <w:tblPr>
       <w:tblStyleRowBandSize w:val="1"/>
       <w:tblStyleColBandSize w:val="1"/>
@@ -16132,6 +15540,7 @@
     <w:tblStylePr w:type="firstRow">
       <w:rPr>
         <w:rFonts w:asciiTheme="majorHAnsi" w:eastAsiaTheme="majorEastAsia" w:hAnsiTheme="majorHAnsi" w:cstheme="majorBidi"/>
+        <w:color w:val="000000"/>
       </w:rPr>
       <w:tblPr/>
       <w:tcPr>
@@ -16145,7 +15554,7 @@
       <w:rPr>
         <w:b/>
         <w:bCs/>
-        <w:color w:val="1F497D" w:themeColor="text2"/>
+        <w:color w:val="000000"/>
       </w:rPr>
       <w:tblPr/>
       <w:tcPr>
@@ -16159,12 +15568,14 @@
       <w:rPr>
         <w:b/>
         <w:bCs/>
+        <w:color w:val="000000"/>
       </w:rPr>
     </w:tblStylePr>
     <w:tblStylePr w:type="lastCol">
       <w:rPr>
         <w:b/>
         <w:bCs/>
+        <w:color w:val="000000"/>
       </w:rPr>
       <w:tblPr/>
       <w:tcPr>
@@ -16195,9 +15606,6 @@
     <w:pPr>
       <w:spacing w:after="0" w:line="240" w:lineRule="auto"/>
     </w:pPr>
-    <w:rPr>
-      <w:color w:val="000000" w:themeColor="text1"/>
-    </w:rPr>
     <w:tblPr>
       <w:tblStyleRowBandSize w:val="1"/>
       <w:tblStyleColBandSize w:val="1"/>
@@ -16209,6 +15617,7 @@
     <w:tblStylePr w:type="firstRow">
       <w:rPr>
         <w:rFonts w:asciiTheme="majorHAnsi" w:eastAsiaTheme="majorEastAsia" w:hAnsiTheme="majorHAnsi" w:cstheme="majorBidi"/>
+        <w:color w:val="000000"/>
       </w:rPr>
       <w:tblPr/>
       <w:tcPr>
@@ -16222,7 +15631,7 @@
       <w:rPr>
         <w:b/>
         <w:bCs/>
-        <w:color w:val="1F497D" w:themeColor="text2"/>
+        <w:color w:val="000000"/>
       </w:rPr>
       <w:tblPr/>
       <w:tcPr>
@@ -16236,12 +15645,14 @@
       <w:rPr>
         <w:b/>
         <w:bCs/>
+        <w:color w:val="000000"/>
       </w:rPr>
     </w:tblStylePr>
     <w:tblStylePr w:type="lastCol">
       <w:rPr>
         <w:b/>
         <w:bCs/>
+        <w:color w:val="000000"/>
       </w:rPr>
       <w:tblPr/>
       <w:tcPr>
@@ -16272,9 +15683,6 @@
     <w:pPr>
       <w:spacing w:after="0" w:line="240" w:lineRule="auto"/>
     </w:pPr>
-    <w:rPr>
-      <w:color w:val="000000" w:themeColor="text1"/>
-    </w:rPr>
     <w:tblPr>
       <w:tblStyleRowBandSize w:val="1"/>
       <w:tblStyleColBandSize w:val="1"/>
@@ -16286,6 +15694,7 @@
     <w:tblStylePr w:type="firstRow">
       <w:rPr>
         <w:rFonts w:asciiTheme="majorHAnsi" w:eastAsiaTheme="majorEastAsia" w:hAnsiTheme="majorHAnsi" w:cstheme="majorBidi"/>
+        <w:color w:val="000000"/>
       </w:rPr>
       <w:tblPr/>
       <w:tcPr>
@@ -16299,7 +15708,7 @@
       <w:rPr>
         <w:b/>
         <w:bCs/>
-        <w:color w:val="1F497D" w:themeColor="text2"/>
+        <w:color w:val="000000"/>
       </w:rPr>
       <w:tblPr/>
       <w:tcPr>
@@ -16313,12 +15722,14 @@
       <w:rPr>
         <w:b/>
         <w:bCs/>
+        <w:color w:val="000000"/>
       </w:rPr>
     </w:tblStylePr>
     <w:tblStylePr w:type="lastCol">
       <w:rPr>
         <w:b/>
         <w:bCs/>
+        <w:color w:val="000000"/>
       </w:rPr>
       <w:tblPr/>
       <w:tcPr>
@@ -16349,9 +15760,6 @@
     <w:pPr>
       <w:spacing w:after="0" w:line="240" w:lineRule="auto"/>
     </w:pPr>
-    <w:rPr>
-      <w:color w:val="000000" w:themeColor="text1"/>
-    </w:rPr>
     <w:tblPr>
       <w:tblStyleRowBandSize w:val="1"/>
       <w:tblStyleColBandSize w:val="1"/>
@@ -16363,6 +15771,7 @@
     <w:tblStylePr w:type="firstRow">
       <w:rPr>
         <w:rFonts w:asciiTheme="majorHAnsi" w:eastAsiaTheme="majorEastAsia" w:hAnsiTheme="majorHAnsi" w:cstheme="majorBidi"/>
+        <w:color w:val="000000"/>
       </w:rPr>
       <w:tblPr/>
       <w:tcPr>
@@ -16376,7 +15785,7 @@
       <w:rPr>
         <w:b/>
         <w:bCs/>
-        <w:color w:val="1F497D" w:themeColor="text2"/>
+        <w:color w:val="000000"/>
       </w:rPr>
       <w:tblPr/>
       <w:tcPr>
@@ -16390,12 +15799,14 @@
       <w:rPr>
         <w:b/>
         <w:bCs/>
+        <w:color w:val="000000"/>
       </w:rPr>
     </w:tblStylePr>
     <w:tblStylePr w:type="lastCol">
       <w:rPr>
         <w:b/>
         <w:bCs/>
+        <w:color w:val="000000"/>
       </w:rPr>
       <w:tblPr/>
       <w:tcPr>
@@ -16426,9 +15837,6 @@
     <w:pPr>
       <w:spacing w:after="0" w:line="240" w:lineRule="auto"/>
     </w:pPr>
-    <w:rPr>
-      <w:color w:val="000000" w:themeColor="text1"/>
-    </w:rPr>
     <w:tblPr>
       <w:tblStyleRowBandSize w:val="1"/>
       <w:tblStyleColBandSize w:val="1"/>
@@ -16440,6 +15848,7 @@
     <w:tblStylePr w:type="firstRow">
       <w:rPr>
         <w:rFonts w:asciiTheme="majorHAnsi" w:eastAsiaTheme="majorEastAsia" w:hAnsiTheme="majorHAnsi" w:cstheme="majorBidi"/>
+        <w:color w:val="000000"/>
       </w:rPr>
       <w:tblPr/>
       <w:tcPr>
@@ -16453,7 +15862,7 @@
       <w:rPr>
         <w:b/>
         <w:bCs/>
-        <w:color w:val="1F497D" w:themeColor="text2"/>
+        <w:color w:val="000000"/>
       </w:rPr>
       <w:tblPr/>
       <w:tcPr>
@@ -16467,12 +15876,14 @@
       <w:rPr>
         <w:b/>
         <w:bCs/>
+        <w:color w:val="000000"/>
       </w:rPr>
     </w:tblStylePr>
     <w:tblStylePr w:type="lastCol">
       <w:rPr>
         <w:b/>
         <w:bCs/>
+        <w:color w:val="000000"/>
       </w:rPr>
       <w:tblPr/>
       <w:tcPr>
@@ -16503,9 +15914,6 @@
     <w:pPr>
       <w:spacing w:after="0" w:line="240" w:lineRule="auto"/>
     </w:pPr>
-    <w:rPr>
-      <w:color w:val="000000" w:themeColor="text1"/>
-    </w:rPr>
     <w:tblPr>
       <w:tblStyleRowBandSize w:val="1"/>
       <w:tblStyleColBandSize w:val="1"/>
@@ -16517,6 +15925,7 @@
     <w:tblStylePr w:type="firstRow">
       <w:rPr>
         <w:rFonts w:asciiTheme="majorHAnsi" w:eastAsiaTheme="majorEastAsia" w:hAnsiTheme="majorHAnsi" w:cstheme="majorBidi"/>
+        <w:color w:val="000000"/>
       </w:rPr>
       <w:tblPr/>
       <w:tcPr>
@@ -16530,7 +15939,7 @@
       <w:rPr>
         <w:b/>
         <w:bCs/>
-        <w:color w:val="1F497D" w:themeColor="text2"/>
+        <w:color w:val="000000"/>
       </w:rPr>
       <w:tblPr/>
       <w:tcPr>
@@ -16544,12 +15953,14 @@
       <w:rPr>
         <w:b/>
         <w:bCs/>
+        <w:color w:val="000000"/>
       </w:rPr>
     </w:tblStylePr>
     <w:tblStylePr w:type="lastCol">
       <w:rPr>
         <w:b/>
         <w:bCs/>
+        <w:color w:val="000000"/>
       </w:rPr>
       <w:tblPr/>
       <w:tcPr>
@@ -16582,7 +15993,6 @@
     </w:pPr>
     <w:rPr>
       <w:rFonts w:asciiTheme="majorHAnsi" w:eastAsiaTheme="majorEastAsia" w:hAnsiTheme="majorHAnsi" w:cstheme="majorBidi"/>
-      <w:color w:val="000000" w:themeColor="text1"/>
     </w:rPr>
     <w:tblPr>
       <w:tblStyleRowBandSize w:val="1"/>
@@ -16596,6 +16006,7 @@
     </w:tblPr>
     <w:tblStylePr w:type="firstRow">
       <w:rPr>
+        <w:color w:val="000000"/>
         <w:sz w:val="24"/>
         <w:szCs w:val="24"/>
       </w:rPr>
@@ -16703,7 +16114,6 @@
     </w:pPr>
     <w:rPr>
       <w:rFonts w:asciiTheme="majorHAnsi" w:eastAsiaTheme="majorEastAsia" w:hAnsiTheme="majorHAnsi" w:cstheme="majorBidi"/>
-      <w:color w:val="000000" w:themeColor="text1"/>
     </w:rPr>
     <w:tblPr>
       <w:tblStyleRowBandSize w:val="1"/>
@@ -16717,6 +16127,7 @@
     </w:tblPr>
     <w:tblStylePr w:type="firstRow">
       <w:rPr>
+        <w:color w:val="000000"/>
         <w:sz w:val="24"/>
         <w:szCs w:val="24"/>
       </w:rPr>
@@ -16824,7 +16235,6 @@
     </w:pPr>
     <w:rPr>
       <w:rFonts w:asciiTheme="majorHAnsi" w:eastAsiaTheme="majorEastAsia" w:hAnsiTheme="majorHAnsi" w:cstheme="majorBidi"/>
-      <w:color w:val="000000" w:themeColor="text1"/>
     </w:rPr>
     <w:tblPr>
       <w:tblStyleRowBandSize w:val="1"/>
@@ -16838,6 +16248,7 @@
     </w:tblPr>
     <w:tblStylePr w:type="firstRow">
       <w:rPr>
+        <w:color w:val="000000"/>
         <w:sz w:val="24"/>
         <w:szCs w:val="24"/>
       </w:rPr>
@@ -16945,7 +16356,6 @@
     </w:pPr>
     <w:rPr>
       <w:rFonts w:asciiTheme="majorHAnsi" w:eastAsiaTheme="majorEastAsia" w:hAnsiTheme="majorHAnsi" w:cstheme="majorBidi"/>
-      <w:color w:val="000000" w:themeColor="text1"/>
     </w:rPr>
     <w:tblPr>
       <w:tblStyleRowBandSize w:val="1"/>
@@ -16959,6 +16369,7 @@
     </w:tblPr>
     <w:tblStylePr w:type="firstRow">
       <w:rPr>
+        <w:color w:val="000000"/>
         <w:sz w:val="24"/>
         <w:szCs w:val="24"/>
       </w:rPr>
@@ -17066,7 +16477,6 @@
     </w:pPr>
     <w:rPr>
       <w:rFonts w:asciiTheme="majorHAnsi" w:eastAsiaTheme="majorEastAsia" w:hAnsiTheme="majorHAnsi" w:cstheme="majorBidi"/>
-      <w:color w:val="000000" w:themeColor="text1"/>
     </w:rPr>
     <w:tblPr>
       <w:tblStyleRowBandSize w:val="1"/>
@@ -17080,6 +16490,7 @@
     </w:tblPr>
     <w:tblStylePr w:type="firstRow">
       <w:rPr>
+        <w:color w:val="000000"/>
         <w:sz w:val="24"/>
         <w:szCs w:val="24"/>
       </w:rPr>
@@ -17187,7 +16598,6 @@
     </w:pPr>
     <w:rPr>
       <w:rFonts w:asciiTheme="majorHAnsi" w:eastAsiaTheme="majorEastAsia" w:hAnsiTheme="majorHAnsi" w:cstheme="majorBidi"/>
-      <w:color w:val="000000" w:themeColor="text1"/>
     </w:rPr>
     <w:tblPr>
       <w:tblStyleRowBandSize w:val="1"/>
@@ -17201,6 +16611,7 @@
     </w:tblPr>
     <w:tblStylePr w:type="firstRow">
       <w:rPr>
+        <w:color w:val="000000"/>
         <w:sz w:val="24"/>
         <w:szCs w:val="24"/>
       </w:rPr>
@@ -17308,7 +16719,6 @@
     </w:pPr>
     <w:rPr>
       <w:rFonts w:asciiTheme="majorHAnsi" w:eastAsiaTheme="majorEastAsia" w:hAnsiTheme="majorHAnsi" w:cstheme="majorBidi"/>
-      <w:color w:val="000000" w:themeColor="text1"/>
     </w:rPr>
     <w:tblPr>
       <w:tblStyleRowBandSize w:val="1"/>
@@ -17322,6 +16732,7 @@
     </w:tblPr>
     <w:tblStylePr w:type="firstRow">
       <w:rPr>
+        <w:color w:val="000000"/>
         <w:sz w:val="24"/>
         <w:szCs w:val="24"/>
       </w:rPr>
@@ -17442,35 +16853,13 @@
     <w:tcPr>
       <w:shd w:val="clear" w:color="auto" w:fill="C0C0C0" w:themeFill="text1" w:themeFillTint="3F"/>
     </w:tcPr>
-    <w:tblStylePr w:type="firstRow">
-      <w:rPr>
-        <w:b/>
-        <w:bCs/>
-      </w:rPr>
-    </w:tblStylePr>
     <w:tblStylePr w:type="lastRow">
-      <w:rPr>
-        <w:b/>
-        <w:bCs/>
-      </w:rPr>
       <w:tblPr/>
       <w:tcPr>
         <w:tcBorders>
           <w:top w:val="single" w:sz="18" w:space="0" w:color="404040" w:themeColor="text1" w:themeTint="BF"/>
         </w:tcBorders>
       </w:tcPr>
-    </w:tblStylePr>
-    <w:tblStylePr w:type="firstCol">
-      <w:rPr>
-        <w:b/>
-        <w:bCs/>
-      </w:rPr>
-    </w:tblStylePr>
-    <w:tblStylePr w:type="lastCol">
-      <w:rPr>
-        <w:b/>
-        <w:bCs/>
-      </w:rPr>
     </w:tblStylePr>
     <w:tblStylePr w:type="band1Vert">
       <w:tblPr/>
@@ -17508,35 +16897,13 @@
     <w:tcPr>
       <w:shd w:val="clear" w:color="auto" w:fill="D3DFEE" w:themeFill="accent1" w:themeFillTint="3F"/>
     </w:tcPr>
-    <w:tblStylePr w:type="firstRow">
-      <w:rPr>
-        <w:b/>
-        <w:bCs/>
-      </w:rPr>
-    </w:tblStylePr>
     <w:tblStylePr w:type="lastRow">
-      <w:rPr>
-        <w:b/>
-        <w:bCs/>
-      </w:rPr>
       <w:tblPr/>
       <w:tcPr>
         <w:tcBorders>
           <w:top w:val="single" w:sz="18" w:space="0" w:color="7BA0CD" w:themeColor="accent1" w:themeTint="BF"/>
         </w:tcBorders>
       </w:tcPr>
-    </w:tblStylePr>
-    <w:tblStylePr w:type="firstCol">
-      <w:rPr>
-        <w:b/>
-        <w:bCs/>
-      </w:rPr>
-    </w:tblStylePr>
-    <w:tblStylePr w:type="lastCol">
-      <w:rPr>
-        <w:b/>
-        <w:bCs/>
-      </w:rPr>
     </w:tblStylePr>
     <w:tblStylePr w:type="band1Vert">
       <w:tblPr/>
@@ -17574,35 +16941,13 @@
     <w:tcPr>
       <w:shd w:val="clear" w:color="auto" w:fill="EFD3D2" w:themeFill="accent2" w:themeFillTint="3F"/>
     </w:tcPr>
-    <w:tblStylePr w:type="firstRow">
-      <w:rPr>
-        <w:b/>
-        <w:bCs/>
-      </w:rPr>
-    </w:tblStylePr>
     <w:tblStylePr w:type="lastRow">
-      <w:rPr>
-        <w:b/>
-        <w:bCs/>
-      </w:rPr>
       <w:tblPr/>
       <w:tcPr>
         <w:tcBorders>
           <w:top w:val="single" w:sz="18" w:space="0" w:color="CF7B79" w:themeColor="accent2" w:themeTint="BF"/>
         </w:tcBorders>
       </w:tcPr>
-    </w:tblStylePr>
-    <w:tblStylePr w:type="firstCol">
-      <w:rPr>
-        <w:b/>
-        <w:bCs/>
-      </w:rPr>
-    </w:tblStylePr>
-    <w:tblStylePr w:type="lastCol">
-      <w:rPr>
-        <w:b/>
-        <w:bCs/>
-      </w:rPr>
     </w:tblStylePr>
     <w:tblStylePr w:type="band1Vert">
       <w:tblPr/>
@@ -17640,35 +16985,13 @@
     <w:tcPr>
       <w:shd w:val="clear" w:color="auto" w:fill="E6EED5" w:themeFill="accent3" w:themeFillTint="3F"/>
     </w:tcPr>
-    <w:tblStylePr w:type="firstRow">
-      <w:rPr>
-        <w:b/>
-        <w:bCs/>
-      </w:rPr>
-    </w:tblStylePr>
     <w:tblStylePr w:type="lastRow">
-      <w:rPr>
-        <w:b/>
-        <w:bCs/>
-      </w:rPr>
       <w:tblPr/>
       <w:tcPr>
         <w:tcBorders>
           <w:top w:val="single" w:sz="18" w:space="0" w:color="B3CC82" w:themeColor="accent3" w:themeTint="BF"/>
         </w:tcBorders>
       </w:tcPr>
-    </w:tblStylePr>
-    <w:tblStylePr w:type="firstCol">
-      <w:rPr>
-        <w:b/>
-        <w:bCs/>
-      </w:rPr>
-    </w:tblStylePr>
-    <w:tblStylePr w:type="lastCol">
-      <w:rPr>
-        <w:b/>
-        <w:bCs/>
-      </w:rPr>
     </w:tblStylePr>
     <w:tblStylePr w:type="band1Vert">
       <w:tblPr/>
@@ -17706,35 +17029,13 @@
     <w:tcPr>
       <w:shd w:val="clear" w:color="auto" w:fill="DFD8E8" w:themeFill="accent4" w:themeFillTint="3F"/>
     </w:tcPr>
-    <w:tblStylePr w:type="firstRow">
-      <w:rPr>
-        <w:b/>
-        <w:bCs/>
-      </w:rPr>
-    </w:tblStylePr>
     <w:tblStylePr w:type="lastRow">
-      <w:rPr>
-        <w:b/>
-        <w:bCs/>
-      </w:rPr>
       <w:tblPr/>
       <w:tcPr>
         <w:tcBorders>
           <w:top w:val="single" w:sz="18" w:space="0" w:color="9F8AB9" w:themeColor="accent4" w:themeTint="BF"/>
         </w:tcBorders>
       </w:tcPr>
-    </w:tblStylePr>
-    <w:tblStylePr w:type="firstCol">
-      <w:rPr>
-        <w:b/>
-        <w:bCs/>
-      </w:rPr>
-    </w:tblStylePr>
-    <w:tblStylePr w:type="lastCol">
-      <w:rPr>
-        <w:b/>
-        <w:bCs/>
-      </w:rPr>
     </w:tblStylePr>
     <w:tblStylePr w:type="band1Vert">
       <w:tblPr/>
@@ -17772,35 +17073,13 @@
     <w:tcPr>
       <w:shd w:val="clear" w:color="auto" w:fill="D2EAF1" w:themeFill="accent5" w:themeFillTint="3F"/>
     </w:tcPr>
-    <w:tblStylePr w:type="firstRow">
-      <w:rPr>
-        <w:b/>
-        <w:bCs/>
-      </w:rPr>
-    </w:tblStylePr>
     <w:tblStylePr w:type="lastRow">
-      <w:rPr>
-        <w:b/>
-        <w:bCs/>
-      </w:rPr>
       <w:tblPr/>
       <w:tcPr>
         <w:tcBorders>
           <w:top w:val="single" w:sz="18" w:space="0" w:color="78C0D4" w:themeColor="accent5" w:themeTint="BF"/>
         </w:tcBorders>
       </w:tcPr>
-    </w:tblStylePr>
-    <w:tblStylePr w:type="firstCol">
-      <w:rPr>
-        <w:b/>
-        <w:bCs/>
-      </w:rPr>
-    </w:tblStylePr>
-    <w:tblStylePr w:type="lastCol">
-      <w:rPr>
-        <w:b/>
-        <w:bCs/>
-      </w:rPr>
     </w:tblStylePr>
     <w:tblStylePr w:type="band1Vert">
       <w:tblPr/>
@@ -17838,35 +17117,13 @@
     <w:tcPr>
       <w:shd w:val="clear" w:color="auto" w:fill="FDE4D0" w:themeFill="accent6" w:themeFillTint="3F"/>
     </w:tcPr>
-    <w:tblStylePr w:type="firstRow">
-      <w:rPr>
-        <w:b/>
-        <w:bCs/>
-      </w:rPr>
-    </w:tblStylePr>
     <w:tblStylePr w:type="lastRow">
-      <w:rPr>
-        <w:b/>
-        <w:bCs/>
-      </w:rPr>
       <w:tblPr/>
       <w:tcPr>
         <w:tcBorders>
           <w:top w:val="single" w:sz="18" w:space="0" w:color="F9B074" w:themeColor="accent6" w:themeTint="BF"/>
         </w:tcBorders>
       </w:tcPr>
-    </w:tblStylePr>
-    <w:tblStylePr w:type="firstCol">
-      <w:rPr>
-        <w:b/>
-        <w:bCs/>
-      </w:rPr>
-    </w:tblStylePr>
-    <w:tblStylePr w:type="lastCol">
-      <w:rPr>
-        <w:b/>
-        <w:bCs/>
-      </w:rPr>
     </w:tblStylePr>
     <w:tblStylePr w:type="band1Vert">
       <w:tblPr/>
@@ -17891,7 +17148,6 @@
     </w:pPr>
     <w:rPr>
       <w:rFonts w:asciiTheme="majorHAnsi" w:eastAsiaTheme="majorEastAsia" w:hAnsiTheme="majorHAnsi" w:cstheme="majorBidi"/>
-      <w:color w:val="000000" w:themeColor="text1"/>
     </w:rPr>
     <w:tblPr>
       <w:tblStyleRowBandSize w:val="1"/>
@@ -17912,7 +17168,7 @@
       <w:rPr>
         <w:b/>
         <w:bCs/>
-        <w:color w:val="000000" w:themeColor="text1"/>
+        <w:color w:val="000000"/>
       </w:rPr>
       <w:tblPr/>
       <w:tcPr>
@@ -17923,7 +17179,7 @@
       <w:rPr>
         <w:b/>
         <w:bCs/>
-        <w:color w:val="000000" w:themeColor="text1"/>
+        <w:color w:val="000000"/>
       </w:rPr>
       <w:tblPr/>
       <w:tcPr>
@@ -17942,7 +17198,7 @@
       <w:rPr>
         <w:b/>
         <w:bCs/>
-        <w:color w:val="000000" w:themeColor="text1"/>
+        <w:color w:val="000000"/>
       </w:rPr>
       <w:tblPr/>
       <w:tcPr>
@@ -17961,7 +17217,7 @@
       <w:rPr>
         <w:b w:val="0"/>
         <w:bCs w:val="0"/>
-        <w:color w:val="000000" w:themeColor="text1"/>
+        <w:color w:val="000000"/>
       </w:rPr>
       <w:tblPr/>
       <w:tcPr>
@@ -18009,7 +17265,6 @@
     </w:pPr>
     <w:rPr>
       <w:rFonts w:asciiTheme="majorHAnsi" w:eastAsiaTheme="majorEastAsia" w:hAnsiTheme="majorHAnsi" w:cstheme="majorBidi"/>
-      <w:color w:val="000000" w:themeColor="text1"/>
     </w:rPr>
     <w:tblPr>
       <w:tblStyleRowBandSize w:val="1"/>
@@ -18030,7 +17285,7 @@
       <w:rPr>
         <w:b/>
         <w:bCs/>
-        <w:color w:val="000000" w:themeColor="text1"/>
+        <w:color w:val="000000"/>
       </w:rPr>
       <w:tblPr/>
       <w:tcPr>
@@ -18041,7 +17296,7 @@
       <w:rPr>
         <w:b/>
         <w:bCs/>
-        <w:color w:val="000000" w:themeColor="text1"/>
+        <w:color w:val="000000"/>
       </w:rPr>
       <w:tblPr/>
       <w:tcPr>
@@ -18060,7 +17315,7 @@
       <w:rPr>
         <w:b/>
         <w:bCs/>
-        <w:color w:val="000000" w:themeColor="text1"/>
+        <w:color w:val="000000"/>
       </w:rPr>
       <w:tblPr/>
       <w:tcPr>
@@ -18079,7 +17334,7 @@
       <w:rPr>
         <w:b w:val="0"/>
         <w:bCs w:val="0"/>
-        <w:color w:val="000000" w:themeColor="text1"/>
+        <w:color w:val="000000"/>
       </w:rPr>
       <w:tblPr/>
       <w:tcPr>
@@ -18127,7 +17382,6 @@
     </w:pPr>
     <w:rPr>
       <w:rFonts w:asciiTheme="majorHAnsi" w:eastAsiaTheme="majorEastAsia" w:hAnsiTheme="majorHAnsi" w:cstheme="majorBidi"/>
-      <w:color w:val="000000" w:themeColor="text1"/>
     </w:rPr>
     <w:tblPr>
       <w:tblStyleRowBandSize w:val="1"/>
@@ -18148,7 +17402,7 @@
       <w:rPr>
         <w:b/>
         <w:bCs/>
-        <w:color w:val="000000" w:themeColor="text1"/>
+        <w:color w:val="000000"/>
       </w:rPr>
       <w:tblPr/>
       <w:tcPr>
@@ -18159,7 +17413,7 @@
       <w:rPr>
         <w:b/>
         <w:bCs/>
-        <w:color w:val="000000" w:themeColor="text1"/>
+        <w:color w:val="000000"/>
       </w:rPr>
       <w:tblPr/>
       <w:tcPr>
@@ -18178,7 +17432,7 @@
       <w:rPr>
         <w:b/>
         <w:bCs/>
-        <w:color w:val="000000" w:themeColor="text1"/>
+        <w:color w:val="000000"/>
       </w:rPr>
       <w:tblPr/>
       <w:tcPr>
@@ -18197,7 +17451,7 @@
       <w:rPr>
         <w:b w:val="0"/>
         <w:bCs w:val="0"/>
-        <w:color w:val="000000" w:themeColor="text1"/>
+        <w:color w:val="000000"/>
       </w:rPr>
       <w:tblPr/>
       <w:tcPr>
@@ -18245,7 +17499,6 @@
     </w:pPr>
     <w:rPr>
       <w:rFonts w:asciiTheme="majorHAnsi" w:eastAsiaTheme="majorEastAsia" w:hAnsiTheme="majorHAnsi" w:cstheme="majorBidi"/>
-      <w:color w:val="000000" w:themeColor="text1"/>
     </w:rPr>
     <w:tblPr>
       <w:tblStyleRowBandSize w:val="1"/>
@@ -18266,7 +17519,7 @@
       <w:rPr>
         <w:b/>
         <w:bCs/>
-        <w:color w:val="000000" w:themeColor="text1"/>
+        <w:color w:val="000000"/>
       </w:rPr>
       <w:tblPr/>
       <w:tcPr>
@@ -18277,7 +17530,7 @@
       <w:rPr>
         <w:b/>
         <w:bCs/>
-        <w:color w:val="000000" w:themeColor="text1"/>
+        <w:color w:val="000000"/>
       </w:rPr>
       <w:tblPr/>
       <w:tcPr>
@@ -18296,7 +17549,7 @@
       <w:rPr>
         <w:b/>
         <w:bCs/>
-        <w:color w:val="000000" w:themeColor="text1"/>
+        <w:color w:val="000000"/>
       </w:rPr>
       <w:tblPr/>
       <w:tcPr>
@@ -18315,7 +17568,7 @@
       <w:rPr>
         <w:b w:val="0"/>
         <w:bCs w:val="0"/>
-        <w:color w:val="000000" w:themeColor="text1"/>
+        <w:color w:val="000000"/>
       </w:rPr>
       <w:tblPr/>
       <w:tcPr>
@@ -18363,7 +17616,6 @@
     </w:pPr>
     <w:rPr>
       <w:rFonts w:asciiTheme="majorHAnsi" w:eastAsiaTheme="majorEastAsia" w:hAnsiTheme="majorHAnsi" w:cstheme="majorBidi"/>
-      <w:color w:val="000000" w:themeColor="text1"/>
     </w:rPr>
     <w:tblPr>
       <w:tblStyleRowBandSize w:val="1"/>
@@ -18384,7 +17636,7 @@
       <w:rPr>
         <w:b/>
         <w:bCs/>
-        <w:color w:val="000000" w:themeColor="text1"/>
+        <w:color w:val="000000"/>
       </w:rPr>
       <w:tblPr/>
       <w:tcPr>
@@ -18395,7 +17647,7 @@
       <w:rPr>
         <w:b/>
         <w:bCs/>
-        <w:color w:val="000000" w:themeColor="text1"/>
+        <w:color w:val="000000"/>
       </w:rPr>
       <w:tblPr/>
       <w:tcPr>
@@ -18414,7 +17666,7 @@
       <w:rPr>
         <w:b/>
         <w:bCs/>
-        <w:color w:val="000000" w:themeColor="text1"/>
+        <w:color w:val="000000"/>
       </w:rPr>
       <w:tblPr/>
       <w:tcPr>
@@ -18433,7 +17685,7 @@
       <w:rPr>
         <w:b w:val="0"/>
         <w:bCs w:val="0"/>
-        <w:color w:val="000000" w:themeColor="text1"/>
+        <w:color w:val="000000"/>
       </w:rPr>
       <w:tblPr/>
       <w:tcPr>
@@ -18481,7 +17733,6 @@
     </w:pPr>
     <w:rPr>
       <w:rFonts w:asciiTheme="majorHAnsi" w:eastAsiaTheme="majorEastAsia" w:hAnsiTheme="majorHAnsi" w:cstheme="majorBidi"/>
-      <w:color w:val="000000" w:themeColor="text1"/>
     </w:rPr>
     <w:tblPr>
       <w:tblStyleRowBandSize w:val="1"/>
@@ -18502,7 +17753,7 @@
       <w:rPr>
         <w:b/>
         <w:bCs/>
-        <w:color w:val="000000" w:themeColor="text1"/>
+        <w:color w:val="000000"/>
       </w:rPr>
       <w:tblPr/>
       <w:tcPr>
@@ -18513,7 +17764,7 @@
       <w:rPr>
         <w:b/>
         <w:bCs/>
-        <w:color w:val="000000" w:themeColor="text1"/>
+        <w:color w:val="000000"/>
       </w:rPr>
       <w:tblPr/>
       <w:tcPr>
@@ -18532,7 +17783,7 @@
       <w:rPr>
         <w:b/>
         <w:bCs/>
-        <w:color w:val="000000" w:themeColor="text1"/>
+        <w:color w:val="000000"/>
       </w:rPr>
       <w:tblPr/>
       <w:tcPr>
@@ -18551,7 +17802,7 @@
       <w:rPr>
         <w:b w:val="0"/>
         <w:bCs w:val="0"/>
-        <w:color w:val="000000" w:themeColor="text1"/>
+        <w:color w:val="000000"/>
       </w:rPr>
       <w:tblPr/>
       <w:tcPr>
@@ -18599,7 +17850,6 @@
     </w:pPr>
     <w:rPr>
       <w:rFonts w:asciiTheme="majorHAnsi" w:eastAsiaTheme="majorEastAsia" w:hAnsiTheme="majorHAnsi" w:cstheme="majorBidi"/>
-      <w:color w:val="000000" w:themeColor="text1"/>
     </w:rPr>
     <w:tblPr>
       <w:tblStyleRowBandSize w:val="1"/>
@@ -18620,7 +17870,7 @@
       <w:rPr>
         <w:b/>
         <w:bCs/>
-        <w:color w:val="000000" w:themeColor="text1"/>
+        <w:color w:val="000000"/>
       </w:rPr>
       <w:tblPr/>
       <w:tcPr>
@@ -18631,7 +17881,7 @@
       <w:rPr>
         <w:b/>
         <w:bCs/>
-        <w:color w:val="000000" w:themeColor="text1"/>
+        <w:color w:val="000000"/>
       </w:rPr>
       <w:tblPr/>
       <w:tcPr>
@@ -18650,7 +17900,7 @@
       <w:rPr>
         <w:b/>
         <w:bCs/>
-        <w:color w:val="000000" w:themeColor="text1"/>
+        <w:color w:val="000000"/>
       </w:rPr>
       <w:tblPr/>
       <w:tcPr>
@@ -18669,7 +17919,7 @@
       <w:rPr>
         <w:b w:val="0"/>
         <w:bCs w:val="0"/>
-        <w:color w:val="000000" w:themeColor="text1"/>
+        <w:color w:val="000000"/>
       </w:rPr>
       <w:tblPr/>
       <w:tcPr>
@@ -18731,13 +17981,6 @@
       <w:shd w:val="clear" w:color="auto" w:fill="C0C0C0" w:themeFill="text1" w:themeFillTint="3F"/>
     </w:tcPr>
     <w:tblStylePr w:type="firstRow">
-      <w:rPr>
-        <w:b/>
-        <w:bCs/>
-        <w:i w:val="0"/>
-        <w:iCs w:val="0"/>
-        <w:color w:val="FFFFFF" w:themeColor="background1"/>
-      </w:rPr>
       <w:tblPr/>
       <w:tcPr>
         <w:tcBorders>
@@ -18752,13 +17995,6 @@
       </w:tcPr>
     </w:tblStylePr>
     <w:tblStylePr w:type="lastRow">
-      <w:rPr>
-        <w:b/>
-        <w:bCs/>
-        <w:i w:val="0"/>
-        <w:iCs w:val="0"/>
-        <w:color w:val="FFFFFF" w:themeColor="background1"/>
-      </w:rPr>
       <w:tblPr/>
       <w:tcPr>
         <w:tcBorders>
@@ -18773,13 +18009,6 @@
       </w:tcPr>
     </w:tblStylePr>
     <w:tblStylePr w:type="firstCol">
-      <w:rPr>
-        <w:b/>
-        <w:bCs/>
-        <w:i w:val="0"/>
-        <w:iCs w:val="0"/>
-        <w:color w:val="FFFFFF" w:themeColor="background1"/>
-      </w:rPr>
       <w:tblPr/>
       <w:tcPr>
         <w:tcBorders>
@@ -18792,13 +18021,6 @@
       </w:tcPr>
     </w:tblStylePr>
     <w:tblStylePr w:type="lastCol">
-      <w:rPr>
-        <w:b/>
-        <w:bCs/>
-        <w:i w:val="0"/>
-        <w:iCs w:val="0"/>
-        <w:color w:val="FFFFFF" w:themeColor="background1"/>
-      </w:rPr>
       <w:tblPr/>
       <w:tcPr>
         <w:tcBorders>
@@ -18865,13 +18087,6 @@
       <w:shd w:val="clear" w:color="auto" w:fill="D3DFEE" w:themeFill="accent1" w:themeFillTint="3F"/>
     </w:tcPr>
     <w:tblStylePr w:type="firstRow">
-      <w:rPr>
-        <w:b/>
-        <w:bCs/>
-        <w:i w:val="0"/>
-        <w:iCs w:val="0"/>
-        <w:color w:val="FFFFFF" w:themeColor="background1"/>
-      </w:rPr>
       <w:tblPr/>
       <w:tcPr>
         <w:tcBorders>
@@ -18886,13 +18101,6 @@
       </w:tcPr>
     </w:tblStylePr>
     <w:tblStylePr w:type="lastRow">
-      <w:rPr>
-        <w:b/>
-        <w:bCs/>
-        <w:i w:val="0"/>
-        <w:iCs w:val="0"/>
-        <w:color w:val="FFFFFF" w:themeColor="background1"/>
-      </w:rPr>
       <w:tblPr/>
       <w:tcPr>
         <w:tcBorders>
@@ -18907,13 +18115,6 @@
       </w:tcPr>
     </w:tblStylePr>
     <w:tblStylePr w:type="firstCol">
-      <w:rPr>
-        <w:b/>
-        <w:bCs/>
-        <w:i w:val="0"/>
-        <w:iCs w:val="0"/>
-        <w:color w:val="FFFFFF" w:themeColor="background1"/>
-      </w:rPr>
       <w:tblPr/>
       <w:tcPr>
         <w:tcBorders>
@@ -18926,13 +18127,6 @@
       </w:tcPr>
     </w:tblStylePr>
     <w:tblStylePr w:type="lastCol">
-      <w:rPr>
-        <w:b/>
-        <w:bCs/>
-        <w:i w:val="0"/>
-        <w:iCs w:val="0"/>
-        <w:color w:val="FFFFFF" w:themeColor="background1"/>
-      </w:rPr>
       <w:tblPr/>
       <w:tcPr>
         <w:tcBorders>
@@ -18999,13 +18193,6 @@
       <w:shd w:val="clear" w:color="auto" w:fill="EFD3D2" w:themeFill="accent2" w:themeFillTint="3F"/>
     </w:tcPr>
     <w:tblStylePr w:type="firstRow">
-      <w:rPr>
-        <w:b/>
-        <w:bCs/>
-        <w:i w:val="0"/>
-        <w:iCs w:val="0"/>
-        <w:color w:val="FFFFFF" w:themeColor="background1"/>
-      </w:rPr>
       <w:tblPr/>
       <w:tcPr>
         <w:tcBorders>
@@ -19020,13 +18207,6 @@
       </w:tcPr>
     </w:tblStylePr>
     <w:tblStylePr w:type="lastRow">
-      <w:rPr>
-        <w:b/>
-        <w:bCs/>
-        <w:i w:val="0"/>
-        <w:iCs w:val="0"/>
-        <w:color w:val="FFFFFF" w:themeColor="background1"/>
-      </w:rPr>
       <w:tblPr/>
       <w:tcPr>
         <w:tcBorders>
@@ -19041,13 +18221,6 @@
       </w:tcPr>
     </w:tblStylePr>
     <w:tblStylePr w:type="firstCol">
-      <w:rPr>
-        <w:b/>
-        <w:bCs/>
-        <w:i w:val="0"/>
-        <w:iCs w:val="0"/>
-        <w:color w:val="FFFFFF" w:themeColor="background1"/>
-      </w:rPr>
       <w:tblPr/>
       <w:tcPr>
         <w:tcBorders>
@@ -19060,13 +18233,6 @@
       </w:tcPr>
     </w:tblStylePr>
     <w:tblStylePr w:type="lastCol">
-      <w:rPr>
-        <w:b/>
-        <w:bCs/>
-        <w:i w:val="0"/>
-        <w:iCs w:val="0"/>
-        <w:color w:val="FFFFFF" w:themeColor="background1"/>
-      </w:rPr>
       <w:tblPr/>
       <w:tcPr>
         <w:tcBorders>
@@ -19133,13 +18299,6 @@
       <w:shd w:val="clear" w:color="auto" w:fill="E6EED5" w:themeFill="accent3" w:themeFillTint="3F"/>
     </w:tcPr>
     <w:tblStylePr w:type="firstRow">
-      <w:rPr>
-        <w:b/>
-        <w:bCs/>
-        <w:i w:val="0"/>
-        <w:iCs w:val="0"/>
-        <w:color w:val="FFFFFF" w:themeColor="background1"/>
-      </w:rPr>
       <w:tblPr/>
       <w:tcPr>
         <w:tcBorders>
@@ -19154,13 +18313,6 @@
       </w:tcPr>
     </w:tblStylePr>
     <w:tblStylePr w:type="lastRow">
-      <w:rPr>
-        <w:b/>
-        <w:bCs/>
-        <w:i w:val="0"/>
-        <w:iCs w:val="0"/>
-        <w:color w:val="FFFFFF" w:themeColor="background1"/>
-      </w:rPr>
       <w:tblPr/>
       <w:tcPr>
         <w:tcBorders>
@@ -19175,13 +18327,6 @@
       </w:tcPr>
     </w:tblStylePr>
     <w:tblStylePr w:type="firstCol">
-      <w:rPr>
-        <w:b/>
-        <w:bCs/>
-        <w:i w:val="0"/>
-        <w:iCs w:val="0"/>
-        <w:color w:val="FFFFFF" w:themeColor="background1"/>
-      </w:rPr>
       <w:tblPr/>
       <w:tcPr>
         <w:tcBorders>
@@ -19194,13 +18339,6 @@
       </w:tcPr>
     </w:tblStylePr>
     <w:tblStylePr w:type="lastCol">
-      <w:rPr>
-        <w:b/>
-        <w:bCs/>
-        <w:i w:val="0"/>
-        <w:iCs w:val="0"/>
-        <w:color w:val="FFFFFF" w:themeColor="background1"/>
-      </w:rPr>
       <w:tblPr/>
       <w:tcPr>
         <w:tcBorders>
@@ -19267,13 +18405,6 @@
       <w:shd w:val="clear" w:color="auto" w:fill="DFD8E8" w:themeFill="accent4" w:themeFillTint="3F"/>
     </w:tcPr>
     <w:tblStylePr w:type="firstRow">
-      <w:rPr>
-        <w:b/>
-        <w:bCs/>
-        <w:i w:val="0"/>
-        <w:iCs w:val="0"/>
-        <w:color w:val="FFFFFF" w:themeColor="background1"/>
-      </w:rPr>
       <w:tblPr/>
       <w:tcPr>
         <w:tcBorders>
@@ -19288,13 +18419,6 @@
       </w:tcPr>
     </w:tblStylePr>
     <w:tblStylePr w:type="lastRow">
-      <w:rPr>
-        <w:b/>
-        <w:bCs/>
-        <w:i w:val="0"/>
-        <w:iCs w:val="0"/>
-        <w:color w:val="FFFFFF" w:themeColor="background1"/>
-      </w:rPr>
       <w:tblPr/>
       <w:tcPr>
         <w:tcBorders>
@@ -19309,13 +18433,6 @@
       </w:tcPr>
     </w:tblStylePr>
     <w:tblStylePr w:type="firstCol">
-      <w:rPr>
-        <w:b/>
-        <w:bCs/>
-        <w:i w:val="0"/>
-        <w:iCs w:val="0"/>
-        <w:color w:val="FFFFFF" w:themeColor="background1"/>
-      </w:rPr>
       <w:tblPr/>
       <w:tcPr>
         <w:tcBorders>
@@ -19328,13 +18445,6 @@
       </w:tcPr>
     </w:tblStylePr>
     <w:tblStylePr w:type="lastCol">
-      <w:rPr>
-        <w:b/>
-        <w:bCs/>
-        <w:i w:val="0"/>
-        <w:iCs w:val="0"/>
-        <w:color w:val="FFFFFF" w:themeColor="background1"/>
-      </w:rPr>
       <w:tblPr/>
       <w:tcPr>
         <w:tcBorders>
@@ -19401,13 +18511,6 @@
       <w:shd w:val="clear" w:color="auto" w:fill="D2EAF1" w:themeFill="accent5" w:themeFillTint="3F"/>
     </w:tcPr>
     <w:tblStylePr w:type="firstRow">
-      <w:rPr>
-        <w:b/>
-        <w:bCs/>
-        <w:i w:val="0"/>
-        <w:iCs w:val="0"/>
-        <w:color w:val="FFFFFF" w:themeColor="background1"/>
-      </w:rPr>
       <w:tblPr/>
       <w:tcPr>
         <w:tcBorders>
@@ -19422,13 +18525,6 @@
       </w:tcPr>
     </w:tblStylePr>
     <w:tblStylePr w:type="lastRow">
-      <w:rPr>
-        <w:b/>
-        <w:bCs/>
-        <w:i w:val="0"/>
-        <w:iCs w:val="0"/>
-        <w:color w:val="FFFFFF" w:themeColor="background1"/>
-      </w:rPr>
       <w:tblPr/>
       <w:tcPr>
         <w:tcBorders>
@@ -19443,13 +18539,6 @@
       </w:tcPr>
     </w:tblStylePr>
     <w:tblStylePr w:type="firstCol">
-      <w:rPr>
-        <w:b/>
-        <w:bCs/>
-        <w:i w:val="0"/>
-        <w:iCs w:val="0"/>
-        <w:color w:val="FFFFFF" w:themeColor="background1"/>
-      </w:rPr>
       <w:tblPr/>
       <w:tcPr>
         <w:tcBorders>
@@ -19462,13 +18551,6 @@
       </w:tcPr>
     </w:tblStylePr>
     <w:tblStylePr w:type="lastCol">
-      <w:rPr>
-        <w:b/>
-        <w:bCs/>
-        <w:i w:val="0"/>
-        <w:iCs w:val="0"/>
-        <w:color w:val="FFFFFF" w:themeColor="background1"/>
-      </w:rPr>
       <w:tblPr/>
       <w:tcPr>
         <w:tcBorders>
@@ -19535,13 +18617,6 @@
       <w:shd w:val="clear" w:color="auto" w:fill="FDE4D0" w:themeFill="accent6" w:themeFillTint="3F"/>
     </w:tcPr>
     <w:tblStylePr w:type="firstRow">
-      <w:rPr>
-        <w:b/>
-        <w:bCs/>
-        <w:i w:val="0"/>
-        <w:iCs w:val="0"/>
-        <w:color w:val="FFFFFF" w:themeColor="background1"/>
-      </w:rPr>
       <w:tblPr/>
       <w:tcPr>
         <w:tcBorders>
@@ -19556,13 +18631,6 @@
       </w:tcPr>
     </w:tblStylePr>
     <w:tblStylePr w:type="lastRow">
-      <w:rPr>
-        <w:b/>
-        <w:bCs/>
-        <w:i w:val="0"/>
-        <w:iCs w:val="0"/>
-        <w:color w:val="FFFFFF" w:themeColor="background1"/>
-      </w:rPr>
       <w:tblPr/>
       <w:tcPr>
         <w:tcBorders>
@@ -19577,13 +18645,6 @@
       </w:tcPr>
     </w:tblStylePr>
     <w:tblStylePr w:type="firstCol">
-      <w:rPr>
-        <w:b/>
-        <w:bCs/>
-        <w:i w:val="0"/>
-        <w:iCs w:val="0"/>
-        <w:color w:val="FFFFFF" w:themeColor="background1"/>
-      </w:rPr>
       <w:tblPr/>
       <w:tcPr>
         <w:tcBorders>
@@ -19596,13 +18657,6 @@
       </w:tcPr>
     </w:tblStylePr>
     <w:tblStylePr w:type="lastCol">
-      <w:rPr>
-        <w:b/>
-        <w:bCs/>
-        <w:i w:val="0"/>
-        <w:iCs w:val="0"/>
-        <w:color w:val="FFFFFF" w:themeColor="background1"/>
-      </w:rPr>
       <w:tblPr/>
       <w:tcPr>
         <w:tcBorders>
@@ -19653,9 +18707,6 @@
     <w:pPr>
       <w:spacing w:after="0" w:line="240" w:lineRule="auto"/>
     </w:pPr>
-    <w:rPr>
-      <w:color w:val="FFFFFF" w:themeColor="background1"/>
-    </w:rPr>
     <w:tblPr>
       <w:tblStyleRowBandSize w:val="1"/>
       <w:tblStyleColBandSize w:val="1"/>
@@ -19667,6 +18718,7 @@
       <w:rPr>
         <w:b/>
         <w:bCs/>
+        <w:color w:val="000000"/>
       </w:rPr>
       <w:tblPr/>
       <w:tcPr>
@@ -19760,9 +18812,6 @@
     <w:pPr>
       <w:spacing w:after="0" w:line="240" w:lineRule="auto"/>
     </w:pPr>
-    <w:rPr>
-      <w:color w:val="FFFFFF" w:themeColor="background1"/>
-    </w:rPr>
     <w:tblPr>
       <w:tblStyleRowBandSize w:val="1"/>
       <w:tblStyleColBandSize w:val="1"/>
@@ -19774,6 +18823,7 @@
       <w:rPr>
         <w:b/>
         <w:bCs/>
+        <w:color w:val="000000"/>
       </w:rPr>
       <w:tblPr/>
       <w:tcPr>
@@ -19867,9 +18917,6 @@
     <w:pPr>
       <w:spacing w:after="0" w:line="240" w:lineRule="auto"/>
     </w:pPr>
-    <w:rPr>
-      <w:color w:val="FFFFFF" w:themeColor="background1"/>
-    </w:rPr>
     <w:tblPr>
       <w:tblStyleRowBandSize w:val="1"/>
       <w:tblStyleColBandSize w:val="1"/>
@@ -19881,6 +18928,7 @@
       <w:rPr>
         <w:b/>
         <w:bCs/>
+        <w:color w:val="000000"/>
       </w:rPr>
       <w:tblPr/>
       <w:tcPr>
@@ -19974,9 +19022,6 @@
     <w:pPr>
       <w:spacing w:after="0" w:line="240" w:lineRule="auto"/>
     </w:pPr>
-    <w:rPr>
-      <w:color w:val="FFFFFF" w:themeColor="background1"/>
-    </w:rPr>
     <w:tblPr>
       <w:tblStyleRowBandSize w:val="1"/>
       <w:tblStyleColBandSize w:val="1"/>
@@ -19988,6 +19033,7 @@
       <w:rPr>
         <w:b/>
         <w:bCs/>
+        <w:color w:val="000000"/>
       </w:rPr>
       <w:tblPr/>
       <w:tcPr>
@@ -20081,9 +19127,6 @@
     <w:pPr>
       <w:spacing w:after="0" w:line="240" w:lineRule="auto"/>
     </w:pPr>
-    <w:rPr>
-      <w:color w:val="FFFFFF" w:themeColor="background1"/>
-    </w:rPr>
     <w:tblPr>
       <w:tblStyleRowBandSize w:val="1"/>
       <w:tblStyleColBandSize w:val="1"/>
@@ -20095,6 +19138,7 @@
       <w:rPr>
         <w:b/>
         <w:bCs/>
+        <w:color w:val="000000"/>
       </w:rPr>
       <w:tblPr/>
       <w:tcPr>
@@ -20188,9 +19232,6 @@
     <w:pPr>
       <w:spacing w:after="0" w:line="240" w:lineRule="auto"/>
     </w:pPr>
-    <w:rPr>
-      <w:color w:val="FFFFFF" w:themeColor="background1"/>
-    </w:rPr>
     <w:tblPr>
       <w:tblStyleRowBandSize w:val="1"/>
       <w:tblStyleColBandSize w:val="1"/>
@@ -20202,6 +19243,7 @@
       <w:rPr>
         <w:b/>
         <w:bCs/>
+        <w:color w:val="000000"/>
       </w:rPr>
       <w:tblPr/>
       <w:tcPr>
@@ -20295,9 +19337,6 @@
     <w:pPr>
       <w:spacing w:after="0" w:line="240" w:lineRule="auto"/>
     </w:pPr>
-    <w:rPr>
-      <w:color w:val="FFFFFF" w:themeColor="background1"/>
-    </w:rPr>
     <w:tblPr>
       <w:tblStyleRowBandSize w:val="1"/>
       <w:tblStyleColBandSize w:val="1"/>
@@ -20309,6 +19348,7 @@
       <w:rPr>
         <w:b/>
         <w:bCs/>
+        <w:color w:val="000000"/>
       </w:rPr>
       <w:tblPr/>
       <w:tcPr>
@@ -20402,9 +19442,6 @@
     <w:pPr>
       <w:spacing w:after="0" w:line="240" w:lineRule="auto"/>
     </w:pPr>
-    <w:rPr>
-      <w:color w:val="000000" w:themeColor="text1"/>
-    </w:rPr>
     <w:tblPr>
       <w:tblStyleRowBandSize w:val="1"/>
       <w:tblStyleColBandSize w:val="1"/>
@@ -20424,6 +19461,7 @@
       <w:rPr>
         <w:b/>
         <w:bCs/>
+        <w:color w:val="000000"/>
       </w:rPr>
       <w:tblPr/>
       <w:tcPr>
@@ -20442,7 +19480,7 @@
       <w:rPr>
         <w:b/>
         <w:bCs/>
-        <w:color w:val="FFFFFF" w:themeColor="background1"/>
+        <w:color w:val="000000"/>
       </w:rPr>
       <w:tblPr/>
       <w:tcPr>
@@ -20454,7 +19492,7 @@
     </w:tblStylePr>
     <w:tblStylePr w:type="firstCol">
       <w:rPr>
-        <w:color w:val="FFFFFF" w:themeColor="background1"/>
+        <w:color w:val="000000"/>
       </w:rPr>
       <w:tblPr/>
       <w:tcPr>
@@ -20471,7 +19509,7 @@
     </w:tblStylePr>
     <w:tblStylePr w:type="lastCol">
       <w:rPr>
-        <w:color w:val="FFFFFF" w:themeColor="background1"/>
+        <w:color w:val="000000"/>
       </w:rPr>
       <w:tblPr/>
       <w:tcPr>
@@ -20500,12 +19538,12 @@
     </w:tblStylePr>
     <w:tblStylePr w:type="neCell">
       <w:rPr>
-        <w:color w:val="000000" w:themeColor="text1"/>
+        <w:color w:val="000000"/>
       </w:rPr>
     </w:tblStylePr>
     <w:tblStylePr w:type="nwCell">
       <w:rPr>
-        <w:color w:val="000000" w:themeColor="text1"/>
+        <w:color w:val="000000"/>
       </w:rPr>
     </w:tblStylePr>
   </w:style>
@@ -20517,9 +19555,6 @@
     <w:pPr>
       <w:spacing w:after="0" w:line="240" w:lineRule="auto"/>
     </w:pPr>
-    <w:rPr>
-      <w:color w:val="000000" w:themeColor="text1"/>
-    </w:rPr>
     <w:tblPr>
       <w:tblStyleRowBandSize w:val="1"/>
       <w:tblStyleColBandSize w:val="1"/>
@@ -20539,6 +19574,7 @@
       <w:rPr>
         <w:b/>
         <w:bCs/>
+        <w:color w:val="000000"/>
       </w:rPr>
       <w:tblPr/>
       <w:tcPr>
@@ -20557,7 +19593,7 @@
       <w:rPr>
         <w:b/>
         <w:bCs/>
-        <w:color w:val="FFFFFF" w:themeColor="background1"/>
+        <w:color w:val="000000"/>
       </w:rPr>
       <w:tblPr/>
       <w:tcPr>
@@ -20569,7 +19605,7 @@
     </w:tblStylePr>
     <w:tblStylePr w:type="firstCol">
       <w:rPr>
-        <w:color w:val="FFFFFF" w:themeColor="background1"/>
+        <w:color w:val="000000"/>
       </w:rPr>
       <w:tblPr/>
       <w:tcPr>
@@ -20586,7 +19622,7 @@
     </w:tblStylePr>
     <w:tblStylePr w:type="lastCol">
       <w:rPr>
-        <w:color w:val="FFFFFF" w:themeColor="background1"/>
+        <w:color w:val="000000"/>
       </w:rPr>
       <w:tblPr/>
       <w:tcPr>
@@ -20615,12 +19651,12 @@
     </w:tblStylePr>
     <w:tblStylePr w:type="neCell">
       <w:rPr>
-        <w:color w:val="000000" w:themeColor="text1"/>
+        <w:color w:val="000000"/>
       </w:rPr>
     </w:tblStylePr>
     <w:tblStylePr w:type="nwCell">
       <w:rPr>
-        <w:color w:val="000000" w:themeColor="text1"/>
+        <w:color w:val="000000"/>
       </w:rPr>
     </w:tblStylePr>
   </w:style>
@@ -20632,9 +19668,6 @@
     <w:pPr>
       <w:spacing w:after="0" w:line="240" w:lineRule="auto"/>
     </w:pPr>
-    <w:rPr>
-      <w:color w:val="000000" w:themeColor="text1"/>
-    </w:rPr>
     <w:tblPr>
       <w:tblStyleRowBandSize w:val="1"/>
       <w:tblStyleColBandSize w:val="1"/>
@@ -20654,6 +19687,7 @@
       <w:rPr>
         <w:b/>
         <w:bCs/>
+        <w:color w:val="000000"/>
       </w:rPr>
       <w:tblPr/>
       <w:tcPr>
@@ -20672,7 +19706,7 @@
       <w:rPr>
         <w:b/>
         <w:bCs/>
-        <w:color w:val="FFFFFF" w:themeColor="background1"/>
+        <w:color w:val="000000"/>
       </w:rPr>
       <w:tblPr/>
       <w:tcPr>
@@ -20684,7 +19718,7 @@
     </w:tblStylePr>
     <w:tblStylePr w:type="firstCol">
       <w:rPr>
-        <w:color w:val="FFFFFF" w:themeColor="background1"/>
+        <w:color w:val="000000"/>
       </w:rPr>
       <w:tblPr/>
       <w:tcPr>
@@ -20701,7 +19735,7 @@
     </w:tblStylePr>
     <w:tblStylePr w:type="lastCol">
       <w:rPr>
-        <w:color w:val="FFFFFF" w:themeColor="background1"/>
+        <w:color w:val="000000"/>
       </w:rPr>
       <w:tblPr/>
       <w:tcPr>
@@ -20730,12 +19764,12 @@
     </w:tblStylePr>
     <w:tblStylePr w:type="neCell">
       <w:rPr>
-        <w:color w:val="000000" w:themeColor="text1"/>
+        <w:color w:val="000000"/>
       </w:rPr>
     </w:tblStylePr>
     <w:tblStylePr w:type="nwCell">
       <w:rPr>
-        <w:color w:val="000000" w:themeColor="text1"/>
+        <w:color w:val="000000"/>
       </w:rPr>
     </w:tblStylePr>
   </w:style>
@@ -20747,9 +19781,6 @@
     <w:pPr>
       <w:spacing w:after="0" w:line="240" w:lineRule="auto"/>
     </w:pPr>
-    <w:rPr>
-      <w:color w:val="000000" w:themeColor="text1"/>
-    </w:rPr>
     <w:tblPr>
       <w:tblStyleRowBandSize w:val="1"/>
       <w:tblStyleColBandSize w:val="1"/>
@@ -20769,6 +19800,7 @@
       <w:rPr>
         <w:b/>
         <w:bCs/>
+        <w:color w:val="000000"/>
       </w:rPr>
       <w:tblPr/>
       <w:tcPr>
@@ -20787,7 +19819,7 @@
       <w:rPr>
         <w:b/>
         <w:bCs/>
-        <w:color w:val="FFFFFF" w:themeColor="background1"/>
+        <w:color w:val="000000"/>
       </w:rPr>
       <w:tblPr/>
       <w:tcPr>
@@ -20799,7 +19831,7 @@
     </w:tblStylePr>
     <w:tblStylePr w:type="firstCol">
       <w:rPr>
-        <w:color w:val="FFFFFF" w:themeColor="background1"/>
+        <w:color w:val="000000"/>
       </w:rPr>
       <w:tblPr/>
       <w:tcPr>
@@ -20816,7 +19848,7 @@
     </w:tblStylePr>
     <w:tblStylePr w:type="lastCol">
       <w:rPr>
-        <w:color w:val="FFFFFF" w:themeColor="background1"/>
+        <w:color w:val="000000"/>
       </w:rPr>
       <w:tblPr/>
       <w:tcPr>
@@ -20852,9 +19884,6 @@
     <w:pPr>
       <w:spacing w:after="0" w:line="240" w:lineRule="auto"/>
     </w:pPr>
-    <w:rPr>
-      <w:color w:val="000000" w:themeColor="text1"/>
-    </w:rPr>
     <w:tblPr>
       <w:tblStyleRowBandSize w:val="1"/>
       <w:tblStyleColBandSize w:val="1"/>
@@ -20874,6 +19903,7 @@
       <w:rPr>
         <w:b/>
         <w:bCs/>
+        <w:color w:val="000000"/>
       </w:rPr>
       <w:tblPr/>
       <w:tcPr>
@@ -20892,7 +19922,7 @@
       <w:rPr>
         <w:b/>
         <w:bCs/>
-        <w:color w:val="FFFFFF" w:themeColor="background1"/>
+        <w:color w:val="000000"/>
       </w:rPr>
       <w:tblPr/>
       <w:tcPr>
@@ -20904,7 +19934,7 @@
     </w:tblStylePr>
     <w:tblStylePr w:type="firstCol">
       <w:rPr>
-        <w:color w:val="FFFFFF" w:themeColor="background1"/>
+        <w:color w:val="000000"/>
       </w:rPr>
       <w:tblPr/>
       <w:tcPr>
@@ -20921,7 +19951,7 @@
     </w:tblStylePr>
     <w:tblStylePr w:type="lastCol">
       <w:rPr>
-        <w:color w:val="FFFFFF" w:themeColor="background1"/>
+        <w:color w:val="000000"/>
       </w:rPr>
       <w:tblPr/>
       <w:tcPr>
@@ -20950,12 +19980,12 @@
     </w:tblStylePr>
     <w:tblStylePr w:type="neCell">
       <w:rPr>
-        <w:color w:val="000000" w:themeColor="text1"/>
+        <w:color w:val="000000"/>
       </w:rPr>
     </w:tblStylePr>
     <w:tblStylePr w:type="nwCell">
       <w:rPr>
-        <w:color w:val="000000" w:themeColor="text1"/>
+        <w:color w:val="000000"/>
       </w:rPr>
     </w:tblStylePr>
   </w:style>
@@ -20967,9 +19997,6 @@
     <w:pPr>
       <w:spacing w:after="0" w:line="240" w:lineRule="auto"/>
     </w:pPr>
-    <w:rPr>
-      <w:color w:val="000000" w:themeColor="text1"/>
-    </w:rPr>
     <w:tblPr>
       <w:tblStyleRowBandSize w:val="1"/>
       <w:tblStyleColBandSize w:val="1"/>
@@ -20989,6 +20016,7 @@
       <w:rPr>
         <w:b/>
         <w:bCs/>
+        <w:color w:val="000000"/>
       </w:rPr>
       <w:tblPr/>
       <w:tcPr>
@@ -21007,7 +20035,7 @@
       <w:rPr>
         <w:b/>
         <w:bCs/>
-        <w:color w:val="FFFFFF" w:themeColor="background1"/>
+        <w:color w:val="000000"/>
       </w:rPr>
       <w:tblPr/>
       <w:tcPr>
@@ -21019,7 +20047,7 @@
     </w:tblStylePr>
     <w:tblStylePr w:type="firstCol">
       <w:rPr>
-        <w:color w:val="FFFFFF" w:themeColor="background1"/>
+        <w:color w:val="000000"/>
       </w:rPr>
       <w:tblPr/>
       <w:tcPr>
@@ -21036,7 +20064,7 @@
     </w:tblStylePr>
     <w:tblStylePr w:type="lastCol">
       <w:rPr>
-        <w:color w:val="FFFFFF" w:themeColor="background1"/>
+        <w:color w:val="000000"/>
       </w:rPr>
       <w:tblPr/>
       <w:tcPr>
@@ -21065,12 +20093,12 @@
     </w:tblStylePr>
     <w:tblStylePr w:type="neCell">
       <w:rPr>
-        <w:color w:val="000000" w:themeColor="text1"/>
+        <w:color w:val="000000"/>
       </w:rPr>
     </w:tblStylePr>
     <w:tblStylePr w:type="nwCell">
       <w:rPr>
-        <w:color w:val="000000" w:themeColor="text1"/>
+        <w:color w:val="000000"/>
       </w:rPr>
     </w:tblStylePr>
   </w:style>
@@ -21082,9 +20110,6 @@
     <w:pPr>
       <w:spacing w:after="0" w:line="240" w:lineRule="auto"/>
     </w:pPr>
-    <w:rPr>
-      <w:color w:val="000000" w:themeColor="text1"/>
-    </w:rPr>
     <w:tblPr>
       <w:tblStyleRowBandSize w:val="1"/>
       <w:tblStyleColBandSize w:val="1"/>
@@ -21104,6 +20129,7 @@
       <w:rPr>
         <w:b/>
         <w:bCs/>
+        <w:color w:val="000000"/>
       </w:rPr>
       <w:tblPr/>
       <w:tcPr>
@@ -21122,7 +20148,7 @@
       <w:rPr>
         <w:b/>
         <w:bCs/>
-        <w:color w:val="FFFFFF" w:themeColor="background1"/>
+        <w:color w:val="000000"/>
       </w:rPr>
       <w:tblPr/>
       <w:tcPr>
@@ -21134,7 +20160,7 @@
     </w:tblStylePr>
     <w:tblStylePr w:type="firstCol">
       <w:rPr>
-        <w:color w:val="FFFFFF" w:themeColor="background1"/>
+        <w:color w:val="000000"/>
       </w:rPr>
       <w:tblPr/>
       <w:tcPr>
@@ -21151,7 +20177,7 @@
     </w:tblStylePr>
     <w:tblStylePr w:type="lastCol">
       <w:rPr>
-        <w:color w:val="FFFFFF" w:themeColor="background1"/>
+        <w:color w:val="000000"/>
       </w:rPr>
       <w:tblPr/>
       <w:tcPr>
@@ -21180,12 +20206,12 @@
     </w:tblStylePr>
     <w:tblStylePr w:type="neCell">
       <w:rPr>
-        <w:color w:val="000000" w:themeColor="text1"/>
+        <w:color w:val="000000"/>
       </w:rPr>
     </w:tblStylePr>
     <w:tblStylePr w:type="nwCell">
       <w:rPr>
-        <w:color w:val="000000" w:themeColor="text1"/>
+        <w:color w:val="000000"/>
       </w:rPr>
     </w:tblStylePr>
   </w:style>
@@ -21197,9 +20223,6 @@
     <w:pPr>
       <w:spacing w:after="0" w:line="240" w:lineRule="auto"/>
     </w:pPr>
-    <w:rPr>
-      <w:color w:val="000000" w:themeColor="text1"/>
-    </w:rPr>
     <w:tblPr>
       <w:tblStyleRowBandSize w:val="1"/>
       <w:tblStyleColBandSize w:val="1"/>
@@ -21211,7 +20234,7 @@
       <w:rPr>
         <w:b/>
         <w:bCs/>
-        <w:color w:val="FFFFFF" w:themeColor="background1"/>
+        <w:color w:val="000000"/>
       </w:rPr>
       <w:tblPr/>
       <w:tcPr>
@@ -21225,7 +20248,7 @@
       <w:rPr>
         <w:b/>
         <w:bCs/>
-        <w:color w:val="9E3A38" w:themeColor="accent2" w:themeShade="CC"/>
+        <w:color w:val="000000"/>
       </w:rPr>
       <w:tblPr/>
       <w:tcPr>
@@ -21239,12 +20262,14 @@
       <w:rPr>
         <w:b/>
         <w:bCs/>
+        <w:color w:val="000000"/>
       </w:rPr>
     </w:tblStylePr>
     <w:tblStylePr w:type="lastCol">
       <w:rPr>
         <w:b/>
         <w:bCs/>
+        <w:color w:val="000000"/>
       </w:rPr>
     </w:tblStylePr>
     <w:tblStylePr w:type="band1Vert">
@@ -21276,9 +20301,6 @@
     <w:pPr>
       <w:spacing w:after="0" w:line="240" w:lineRule="auto"/>
     </w:pPr>
-    <w:rPr>
-      <w:color w:val="000000" w:themeColor="text1"/>
-    </w:rPr>
     <w:tblPr>
       <w:tblStyleRowBandSize w:val="1"/>
       <w:tblStyleColBandSize w:val="1"/>
@@ -21290,7 +20312,7 @@
       <w:rPr>
         <w:b/>
         <w:bCs/>
-        <w:color w:val="FFFFFF" w:themeColor="background1"/>
+        <w:color w:val="000000"/>
       </w:rPr>
       <w:tblPr/>
       <w:tcPr>
@@ -21304,7 +20326,7 @@
       <w:rPr>
         <w:b/>
         <w:bCs/>
-        <w:color w:val="9E3A38" w:themeColor="accent2" w:themeShade="CC"/>
+        <w:color w:val="000000"/>
       </w:rPr>
       <w:tblPr/>
       <w:tcPr>
@@ -21318,12 +20340,14 @@
       <w:rPr>
         <w:b/>
         <w:bCs/>
+        <w:color w:val="000000"/>
       </w:rPr>
     </w:tblStylePr>
     <w:tblStylePr w:type="lastCol">
       <w:rPr>
         <w:b/>
         <w:bCs/>
+        <w:color w:val="000000"/>
       </w:rPr>
     </w:tblStylePr>
     <w:tblStylePr w:type="band1Vert">
@@ -21355,9 +20379,6 @@
     <w:pPr>
       <w:spacing w:after="0" w:line="240" w:lineRule="auto"/>
     </w:pPr>
-    <w:rPr>
-      <w:color w:val="000000" w:themeColor="text1"/>
-    </w:rPr>
     <w:tblPr>
       <w:tblStyleRowBandSize w:val="1"/>
       <w:tblStyleColBandSize w:val="1"/>
@@ -21369,7 +20390,7 @@
       <w:rPr>
         <w:b/>
         <w:bCs/>
-        <w:color w:val="FFFFFF" w:themeColor="background1"/>
+        <w:color w:val="000000"/>
       </w:rPr>
       <w:tblPr/>
       <w:tcPr>
@@ -21383,7 +20404,7 @@
       <w:rPr>
         <w:b/>
         <w:bCs/>
-        <w:color w:val="9E3A38" w:themeColor="accent2" w:themeShade="CC"/>
+        <w:color w:val="000000"/>
       </w:rPr>
       <w:tblPr/>
       <w:tcPr>
@@ -21397,12 +20418,14 @@
       <w:rPr>
         <w:b/>
         <w:bCs/>
+        <w:color w:val="000000"/>
       </w:rPr>
     </w:tblStylePr>
     <w:tblStylePr w:type="lastCol">
       <w:rPr>
         <w:b/>
         <w:bCs/>
+        <w:color w:val="000000"/>
       </w:rPr>
     </w:tblStylePr>
     <w:tblStylePr w:type="band1Vert">
@@ -21434,9 +20457,6 @@
     <w:pPr>
       <w:spacing w:after="0" w:line="240" w:lineRule="auto"/>
     </w:pPr>
-    <w:rPr>
-      <w:color w:val="000000" w:themeColor="text1"/>
-    </w:rPr>
     <w:tblPr>
       <w:tblStyleRowBandSize w:val="1"/>
       <w:tblStyleColBandSize w:val="1"/>
@@ -21448,7 +20468,7 @@
       <w:rPr>
         <w:b/>
         <w:bCs/>
-        <w:color w:val="FFFFFF" w:themeColor="background1"/>
+        <w:color w:val="000000"/>
       </w:rPr>
       <w:tblPr/>
       <w:tcPr>
@@ -21462,7 +20482,7 @@
       <w:rPr>
         <w:b/>
         <w:bCs/>
-        <w:color w:val="664E82" w:themeColor="accent4" w:themeShade="CC"/>
+        <w:color w:val="000000"/>
       </w:rPr>
       <w:tblPr/>
       <w:tcPr>
@@ -21476,12 +20496,14 @@
       <w:rPr>
         <w:b/>
         <w:bCs/>
+        <w:color w:val="000000"/>
       </w:rPr>
     </w:tblStylePr>
     <w:tblStylePr w:type="lastCol">
       <w:rPr>
         <w:b/>
         <w:bCs/>
+        <w:color w:val="000000"/>
       </w:rPr>
     </w:tblStylePr>
     <w:tblStylePr w:type="band1Vert">
@@ -21513,9 +20535,6 @@
     <w:pPr>
       <w:spacing w:after="0" w:line="240" w:lineRule="auto"/>
     </w:pPr>
-    <w:rPr>
-      <w:color w:val="000000" w:themeColor="text1"/>
-    </w:rPr>
     <w:tblPr>
       <w:tblStyleRowBandSize w:val="1"/>
       <w:tblStyleColBandSize w:val="1"/>
@@ -21527,7 +20546,7 @@
       <w:rPr>
         <w:b/>
         <w:bCs/>
-        <w:color w:val="FFFFFF" w:themeColor="background1"/>
+        <w:color w:val="000000"/>
       </w:rPr>
       <w:tblPr/>
       <w:tcPr>
@@ -21541,7 +20560,7 @@
       <w:rPr>
         <w:b/>
         <w:bCs/>
-        <w:color w:val="7E9C40" w:themeColor="accent3" w:themeShade="CC"/>
+        <w:color w:val="000000"/>
       </w:rPr>
       <w:tblPr/>
       <w:tcPr>
@@ -21555,12 +20574,14 @@
       <w:rPr>
         <w:b/>
         <w:bCs/>
+        <w:color w:val="000000"/>
       </w:rPr>
     </w:tblStylePr>
     <w:tblStylePr w:type="lastCol">
       <w:rPr>
         <w:b/>
         <w:bCs/>
+        <w:color w:val="000000"/>
       </w:rPr>
     </w:tblStylePr>
     <w:tblStylePr w:type="band1Vert">
@@ -21592,9 +20613,6 @@
     <w:pPr>
       <w:spacing w:after="0" w:line="240" w:lineRule="auto"/>
     </w:pPr>
-    <w:rPr>
-      <w:color w:val="000000" w:themeColor="text1"/>
-    </w:rPr>
     <w:tblPr>
       <w:tblStyleRowBandSize w:val="1"/>
       <w:tblStyleColBandSize w:val="1"/>
@@ -21606,7 +20624,7 @@
       <w:rPr>
         <w:b/>
         <w:bCs/>
-        <w:color w:val="FFFFFF" w:themeColor="background1"/>
+        <w:color w:val="000000"/>
       </w:rPr>
       <w:tblPr/>
       <w:tcPr>
@@ -21620,7 +20638,7 @@
       <w:rPr>
         <w:b/>
         <w:bCs/>
-        <w:color w:val="F2730A" w:themeColor="accent6" w:themeShade="CC"/>
+        <w:color w:val="000000"/>
       </w:rPr>
       <w:tblPr/>
       <w:tcPr>
@@ -21634,12 +20652,14 @@
       <w:rPr>
         <w:b/>
         <w:bCs/>
+        <w:color w:val="000000"/>
       </w:rPr>
     </w:tblStylePr>
     <w:tblStylePr w:type="lastCol">
       <w:rPr>
         <w:b/>
         <w:bCs/>
+        <w:color w:val="000000"/>
       </w:rPr>
     </w:tblStylePr>
     <w:tblStylePr w:type="band1Vert">
@@ -21671,9 +20691,6 @@
     <w:pPr>
       <w:spacing w:after="0" w:line="240" w:lineRule="auto"/>
     </w:pPr>
-    <w:rPr>
-      <w:color w:val="000000" w:themeColor="text1"/>
-    </w:rPr>
     <w:tblPr>
       <w:tblStyleRowBandSize w:val="1"/>
       <w:tblStyleColBandSize w:val="1"/>
@@ -21685,7 +20702,7 @@
       <w:rPr>
         <w:b/>
         <w:bCs/>
-        <w:color w:val="FFFFFF" w:themeColor="background1"/>
+        <w:color w:val="000000"/>
       </w:rPr>
       <w:tblPr/>
       <w:tcPr>
@@ -21699,7 +20716,7 @@
       <w:rPr>
         <w:b/>
         <w:bCs/>
-        <w:color w:val="348DA5" w:themeColor="accent5" w:themeShade="CC"/>
+        <w:color w:val="000000"/>
       </w:rPr>
       <w:tblPr/>
       <w:tcPr>
@@ -21713,12 +20730,14 @@
       <w:rPr>
         <w:b/>
         <w:bCs/>
+        <w:color w:val="000000"/>
       </w:rPr>
     </w:tblStylePr>
     <w:tblStylePr w:type="lastCol">
       <w:rPr>
         <w:b/>
         <w:bCs/>
+        <w:color w:val="000000"/>
       </w:rPr>
     </w:tblStylePr>
     <w:tblStylePr w:type="band1Vert">
@@ -21750,9 +20769,6 @@
     <w:pPr>
       <w:spacing w:after="0" w:line="240" w:lineRule="auto"/>
     </w:pPr>
-    <w:rPr>
-      <w:color w:val="000000" w:themeColor="text1"/>
-    </w:rPr>
     <w:tblPr>
       <w:tblStyleRowBandSize w:val="1"/>
       <w:tblStyleColBandSize w:val="1"/>
@@ -21767,6 +20783,7 @@
       <w:rPr>
         <w:b/>
         <w:bCs/>
+        <w:color w:val="000000"/>
       </w:rPr>
       <w:tblPr/>
       <w:tcPr>
@@ -21777,7 +20794,7 @@
       <w:rPr>
         <w:b/>
         <w:bCs/>
-        <w:color w:val="000000" w:themeColor="text1"/>
+        <w:color w:val="000000"/>
       </w:rPr>
       <w:tblPr/>
       <w:tcPr>
@@ -21786,7 +20803,7 @@
     </w:tblStylePr>
     <w:tblStylePr w:type="firstCol">
       <w:rPr>
-        <w:color w:val="FFFFFF" w:themeColor="background1"/>
+        <w:color w:val="000000"/>
       </w:rPr>
       <w:tblPr/>
       <w:tcPr>
@@ -21795,7 +20812,7 @@
     </w:tblStylePr>
     <w:tblStylePr w:type="lastCol">
       <w:rPr>
-        <w:color w:val="FFFFFF" w:themeColor="background1"/>
+        <w:color w:val="000000"/>
       </w:rPr>
       <w:tblPr/>
       <w:tcPr>
@@ -21823,9 +20840,6 @@
     <w:pPr>
       <w:spacing w:after="0" w:line="240" w:lineRule="auto"/>
     </w:pPr>
-    <w:rPr>
-      <w:color w:val="000000" w:themeColor="text1"/>
-    </w:rPr>
     <w:tblPr>
       <w:tblStyleRowBandSize w:val="1"/>
       <w:tblStyleColBandSize w:val="1"/>
@@ -21840,6 +20854,7 @@
       <w:rPr>
         <w:b/>
         <w:bCs/>
+        <w:color w:val="000000"/>
       </w:rPr>
       <w:tblPr/>
       <w:tcPr>
@@ -21850,7 +20865,7 @@
       <w:rPr>
         <w:b/>
         <w:bCs/>
-        <w:color w:val="000000" w:themeColor="text1"/>
+        <w:color w:val="000000"/>
       </w:rPr>
       <w:tblPr/>
       <w:tcPr>
@@ -21859,7 +20874,7 @@
     </w:tblStylePr>
     <w:tblStylePr w:type="firstCol">
       <w:rPr>
-        <w:color w:val="FFFFFF" w:themeColor="background1"/>
+        <w:color w:val="000000"/>
       </w:rPr>
       <w:tblPr/>
       <w:tcPr>
@@ -21868,7 +20883,7 @@
     </w:tblStylePr>
     <w:tblStylePr w:type="lastCol">
       <w:rPr>
-        <w:color w:val="FFFFFF" w:themeColor="background1"/>
+        <w:color w:val="000000"/>
       </w:rPr>
       <w:tblPr/>
       <w:tcPr>
@@ -21896,9 +20911,6 @@
     <w:pPr>
       <w:spacing w:after="0" w:line="240" w:lineRule="auto"/>
     </w:pPr>
-    <w:rPr>
-      <w:color w:val="000000" w:themeColor="text1"/>
-    </w:rPr>
     <w:tblPr>
       <w:tblStyleRowBandSize w:val="1"/>
       <w:tblStyleColBandSize w:val="1"/>
@@ -21913,6 +20925,7 @@
       <w:rPr>
         <w:b/>
         <w:bCs/>
+        <w:color w:val="000000"/>
       </w:rPr>
       <w:tblPr/>
       <w:tcPr>
@@ -21923,7 +20936,7 @@
       <w:rPr>
         <w:b/>
         <w:bCs/>
-        <w:color w:val="000000" w:themeColor="text1"/>
+        <w:color w:val="000000"/>
       </w:rPr>
       <w:tblPr/>
       <w:tcPr>
@@ -21932,7 +20945,7 @@
     </w:tblStylePr>
     <w:tblStylePr w:type="firstCol">
       <w:rPr>
-        <w:color w:val="FFFFFF" w:themeColor="background1"/>
+        <w:color w:val="000000"/>
       </w:rPr>
       <w:tblPr/>
       <w:tcPr>
@@ -21941,7 +20954,7 @@
     </w:tblStylePr>
     <w:tblStylePr w:type="lastCol">
       <w:rPr>
-        <w:color w:val="FFFFFF" w:themeColor="background1"/>
+        <w:color w:val="000000"/>
       </w:rPr>
       <w:tblPr/>
       <w:tcPr>
@@ -21969,9 +20982,6 @@
     <w:pPr>
       <w:spacing w:after="0" w:line="240" w:lineRule="auto"/>
     </w:pPr>
-    <w:rPr>
-      <w:color w:val="000000" w:themeColor="text1"/>
-    </w:rPr>
     <w:tblPr>
       <w:tblStyleRowBandSize w:val="1"/>
       <w:tblStyleColBandSize w:val="1"/>
@@ -21986,6 +20996,7 @@
       <w:rPr>
         <w:b/>
         <w:bCs/>
+        <w:color w:val="000000"/>
       </w:rPr>
       <w:tblPr/>
       <w:tcPr>
@@ -21996,7 +21007,7 @@
       <w:rPr>
         <w:b/>
         <w:bCs/>
-        <w:color w:val="000000" w:themeColor="text1"/>
+        <w:color w:val="000000"/>
       </w:rPr>
       <w:tblPr/>
       <w:tcPr>
@@ -22005,7 +21016,7 @@
     </w:tblStylePr>
     <w:tblStylePr w:type="firstCol">
       <w:rPr>
-        <w:color w:val="FFFFFF" w:themeColor="background1"/>
+        <w:color w:val="000000"/>
       </w:rPr>
       <w:tblPr/>
       <w:tcPr>
@@ -22014,7 +21025,7 @@
     </w:tblStylePr>
     <w:tblStylePr w:type="lastCol">
       <w:rPr>
-        <w:color w:val="FFFFFF" w:themeColor="background1"/>
+        <w:color w:val="000000"/>
       </w:rPr>
       <w:tblPr/>
       <w:tcPr>
@@ -22042,9 +21053,6 @@
     <w:pPr>
       <w:spacing w:after="0" w:line="240" w:lineRule="auto"/>
     </w:pPr>
-    <w:rPr>
-      <w:color w:val="000000" w:themeColor="text1"/>
-    </w:rPr>
     <w:tblPr>
       <w:tblStyleRowBandSize w:val="1"/>
       <w:tblStyleColBandSize w:val="1"/>
@@ -22059,6 +21067,7 @@
       <w:rPr>
         <w:b/>
         <w:bCs/>
+        <w:color w:val="000000"/>
       </w:rPr>
       <w:tblPr/>
       <w:tcPr>
@@ -22069,7 +21078,7 @@
       <w:rPr>
         <w:b/>
         <w:bCs/>
-        <w:color w:val="000000" w:themeColor="text1"/>
+        <w:color w:val="000000"/>
       </w:rPr>
       <w:tblPr/>
       <w:tcPr>
@@ -22078,7 +21087,7 @@
     </w:tblStylePr>
     <w:tblStylePr w:type="firstCol">
       <w:rPr>
-        <w:color w:val="FFFFFF" w:themeColor="background1"/>
+        <w:color w:val="000000"/>
       </w:rPr>
       <w:tblPr/>
       <w:tcPr>
@@ -22087,7 +21096,7 @@
     </w:tblStylePr>
     <w:tblStylePr w:type="lastCol">
       <w:rPr>
-        <w:color w:val="FFFFFF" w:themeColor="background1"/>
+        <w:color w:val="000000"/>
       </w:rPr>
       <w:tblPr/>
       <w:tcPr>
@@ -22115,9 +21124,6 @@
     <w:pPr>
       <w:spacing w:after="0" w:line="240" w:lineRule="auto"/>
     </w:pPr>
-    <w:rPr>
-      <w:color w:val="000000" w:themeColor="text1"/>
-    </w:rPr>
     <w:tblPr>
       <w:tblStyleRowBandSize w:val="1"/>
       <w:tblStyleColBandSize w:val="1"/>
@@ -22132,6 +21138,7 @@
       <w:rPr>
         <w:b/>
         <w:bCs/>
+        <w:color w:val="000000"/>
       </w:rPr>
       <w:tblPr/>
       <w:tcPr>
@@ -22142,7 +21149,7 @@
       <w:rPr>
         <w:b/>
         <w:bCs/>
-        <w:color w:val="000000" w:themeColor="text1"/>
+        <w:color w:val="000000"/>
       </w:rPr>
       <w:tblPr/>
       <w:tcPr>
@@ -22151,7 +21158,7 @@
     </w:tblStylePr>
     <w:tblStylePr w:type="firstCol">
       <w:rPr>
-        <w:color w:val="FFFFFF" w:themeColor="background1"/>
+        <w:color w:val="000000"/>
       </w:rPr>
       <w:tblPr/>
       <w:tcPr>
@@ -22160,7 +21167,7 @@
     </w:tblStylePr>
     <w:tblStylePr w:type="lastCol">
       <w:rPr>
-        <w:color w:val="FFFFFF" w:themeColor="background1"/>
+        <w:color w:val="000000"/>
       </w:rPr>
       <w:tblPr/>
       <w:tcPr>
@@ -22188,9 +21195,6 @@
     <w:pPr>
       <w:spacing w:after="0" w:line="240" w:lineRule="auto"/>
     </w:pPr>
-    <w:rPr>
-      <w:color w:val="000000" w:themeColor="text1"/>
-    </w:rPr>
     <w:tblPr>
       <w:tblStyleRowBandSize w:val="1"/>
       <w:tblStyleColBandSize w:val="1"/>
@@ -22205,6 +21209,7 @@
       <w:rPr>
         <w:b/>
         <w:bCs/>
+        <w:color w:val="000000"/>
       </w:rPr>
       <w:tblPr/>
       <w:tcPr>
@@ -22215,7 +21220,7 @@
       <w:rPr>
         <w:b/>
         <w:bCs/>
-        <w:color w:val="000000" w:themeColor="text1"/>
+        <w:color w:val="000000"/>
       </w:rPr>
       <w:tblPr/>
       <w:tcPr>
@@ -22224,7 +21229,7 @@
     </w:tblStylePr>
     <w:tblStylePr w:type="firstCol">
       <w:rPr>
-        <w:color w:val="FFFFFF" w:themeColor="background1"/>
+        <w:color w:val="000000"/>
       </w:rPr>
       <w:tblPr/>
       <w:tcPr>
@@ -22233,7 +21238,7 @@
     </w:tblStylePr>
     <w:tblStylePr w:type="lastCol">
       <w:rPr>
-        <w:color w:val="FFFFFF" w:themeColor="background1"/>
+        <w:color w:val="000000"/>
       </w:rPr>
       <w:tblPr/>
       <w:tcPr>
@@ -22269,7 +21274,7 @@
     <w:unhideWhenUsed/>
     <w:rsid w:val="00566DA2"/>
     <w:rPr>
-      <w:color w:val="0000FF" w:themeColor="hyperlink"/>
+      <w:color w:val="000000"/>
       <w:u w:val="single"/>
     </w:rPr>
   </w:style>

</xml_diff>

<commit_message>
feat: unify conversational PDF reading and refine assistant layout
</commit_message>
<xml_diff>
--- a/docs/软件测试报告.docx
+++ b/docs/软件测试报告.docx
@@ -138,7 +138,7 @@
       <w:r>
         <w:fldChar w:fldCharType="separate"/>
       </w:r>
-      <w:hyperlink w:anchor="_Toc242965691" w:history="1">
+      <w:hyperlink w:anchor="_Toc242986714" w:history="1">
         <w:r>
           <w:rPr>
             <w:rStyle w:val="aff9"/>
@@ -172,7 +172,7 @@
             <w:noProof/>
             <w:webHidden/>
           </w:rPr>
-          <w:instrText xml:space="preserve"> PAGEREF _Toc242965691 \h </w:instrText>
+          <w:instrText xml:space="preserve"> PAGEREF _Toc242986714 \h </w:instrText>
         </w:r>
         <w:r>
           <w:rPr>
@@ -192,7 +192,7 @@
             <w:noProof/>
             <w:webHidden/>
           </w:rPr>
-          <w:t>4</w:t>
+          <w:t>3</w:t>
         </w:r>
         <w:r>
           <w:rPr>
@@ -220,7 +220,7 @@
           <w14:ligatures w14:val="standardContextual"/>
         </w:rPr>
       </w:pPr>
-      <w:hyperlink w:anchor="_Toc242965692" w:history="1">
+      <w:hyperlink w:anchor="_Toc242986715" w:history="1">
         <w:r>
           <w:rPr>
             <w:rStyle w:val="aff9"/>
@@ -254,7 +254,7 @@
             <w:noProof/>
             <w:webHidden/>
           </w:rPr>
-          <w:instrText xml:space="preserve"> PAGEREF _Toc242965692 \h </w:instrText>
+          <w:instrText xml:space="preserve"> PAGEREF _Toc242986715 \h </w:instrText>
         </w:r>
         <w:r>
           <w:rPr>
@@ -274,7 +274,7 @@
             <w:noProof/>
             <w:webHidden/>
           </w:rPr>
-          <w:t>4</w:t>
+          <w:t>3</w:t>
         </w:r>
         <w:r>
           <w:rPr>
@@ -302,7 +302,7 @@
           <w14:ligatures w14:val="standardContextual"/>
         </w:rPr>
       </w:pPr>
-      <w:hyperlink w:anchor="_Toc242965693" w:history="1">
+      <w:hyperlink w:anchor="_Toc242986716" w:history="1">
         <w:r>
           <w:rPr>
             <w:rStyle w:val="aff9"/>
@@ -336,7 +336,7 @@
             <w:noProof/>
             <w:webHidden/>
           </w:rPr>
-          <w:instrText xml:space="preserve"> PAGEREF _Toc242965693 \h </w:instrText>
+          <w:instrText xml:space="preserve"> PAGEREF _Toc242986716 \h </w:instrText>
         </w:r>
         <w:r>
           <w:rPr>
@@ -356,7 +356,7 @@
             <w:noProof/>
             <w:webHidden/>
           </w:rPr>
-          <w:t>4</w:t>
+          <w:t>3</w:t>
         </w:r>
         <w:r>
           <w:rPr>
@@ -384,7 +384,7 @@
           <w14:ligatures w14:val="standardContextual"/>
         </w:rPr>
       </w:pPr>
-      <w:hyperlink w:anchor="_Toc242965694" w:history="1">
+      <w:hyperlink w:anchor="_Toc242986717" w:history="1">
         <w:r>
           <w:rPr>
             <w:rStyle w:val="aff9"/>
@@ -418,7 +418,7 @@
             <w:noProof/>
             <w:webHidden/>
           </w:rPr>
-          <w:instrText xml:space="preserve"> PAGEREF _Toc242965694 \h </w:instrText>
+          <w:instrText xml:space="preserve"> PAGEREF _Toc242986717 \h </w:instrText>
         </w:r>
         <w:r>
           <w:rPr>
@@ -438,7 +438,7 @@
             <w:noProof/>
             <w:webHidden/>
           </w:rPr>
-          <w:t>4</w:t>
+          <w:t>3</w:t>
         </w:r>
         <w:r>
           <w:rPr>
@@ -466,7 +466,7 @@
           <w14:ligatures w14:val="standardContextual"/>
         </w:rPr>
       </w:pPr>
-      <w:hyperlink w:anchor="_Toc242965695" w:history="1">
+      <w:hyperlink w:anchor="_Toc242986718" w:history="1">
         <w:r>
           <w:rPr>
             <w:rStyle w:val="aff9"/>
@@ -500,7 +500,7 @@
             <w:noProof/>
             <w:webHidden/>
           </w:rPr>
-          <w:instrText xml:space="preserve"> PAGEREF _Toc242965695 \h </w:instrText>
+          <w:instrText xml:space="preserve"> PAGEREF _Toc242986718 \h </w:instrText>
         </w:r>
         <w:r>
           <w:rPr>
@@ -520,7 +520,7 @@
             <w:noProof/>
             <w:webHidden/>
           </w:rPr>
-          <w:t>4</w:t>
+          <w:t>3</w:t>
         </w:r>
         <w:r>
           <w:rPr>
@@ -548,7 +548,7 @@
           <w14:ligatures w14:val="standardContextual"/>
         </w:rPr>
       </w:pPr>
-      <w:hyperlink w:anchor="_Toc242965696" w:history="1">
+      <w:hyperlink w:anchor="_Toc242986719" w:history="1">
         <w:r>
           <w:rPr>
             <w:rStyle w:val="aff9"/>
@@ -582,7 +582,7 @@
             <w:noProof/>
             <w:webHidden/>
           </w:rPr>
-          <w:instrText xml:space="preserve"> PAGEREF _Toc242965696 \h </w:instrText>
+          <w:instrText xml:space="preserve"> PAGEREF _Toc242986719 \h </w:instrText>
         </w:r>
         <w:r>
           <w:rPr>
@@ -602,7 +602,7 @@
             <w:noProof/>
             <w:webHidden/>
           </w:rPr>
-          <w:t>5</w:t>
+          <w:t>4</w:t>
         </w:r>
         <w:r>
           <w:rPr>
@@ -630,7 +630,7 @@
           <w14:ligatures w14:val="standardContextual"/>
         </w:rPr>
       </w:pPr>
-      <w:hyperlink w:anchor="_Toc242965697" w:history="1">
+      <w:hyperlink w:anchor="_Toc242986720" w:history="1">
         <w:r>
           <w:rPr>
             <w:rStyle w:val="aff9"/>
@@ -664,7 +664,7 @@
             <w:noProof/>
             <w:webHidden/>
           </w:rPr>
-          <w:instrText xml:space="preserve"> PAGEREF _Toc242965697 \h </w:instrText>
+          <w:instrText xml:space="preserve"> PAGEREF _Toc242986720 \h </w:instrText>
         </w:r>
         <w:r>
           <w:rPr>
@@ -684,7 +684,7 @@
             <w:noProof/>
             <w:webHidden/>
           </w:rPr>
-          <w:t>6</w:t>
+          <w:t>5</w:t>
         </w:r>
         <w:r>
           <w:rPr>
@@ -712,7 +712,7 @@
           <w14:ligatures w14:val="standardContextual"/>
         </w:rPr>
       </w:pPr>
-      <w:hyperlink w:anchor="_Toc242965698" w:history="1">
+      <w:hyperlink w:anchor="_Toc242986721" w:history="1">
         <w:r>
           <w:rPr>
             <w:rStyle w:val="aff9"/>
@@ -746,7 +746,7 @@
             <w:noProof/>
             <w:webHidden/>
           </w:rPr>
-          <w:instrText xml:space="preserve"> PAGEREF _Toc242965698 \h </w:instrText>
+          <w:instrText xml:space="preserve"> PAGEREF _Toc242986721 \h </w:instrText>
         </w:r>
         <w:r>
           <w:rPr>
@@ -766,7 +766,7 @@
             <w:noProof/>
             <w:webHidden/>
           </w:rPr>
-          <w:t>6</w:t>
+          <w:t>5</w:t>
         </w:r>
         <w:r>
           <w:rPr>
@@ -794,7 +794,7 @@
           <w14:ligatures w14:val="standardContextual"/>
         </w:rPr>
       </w:pPr>
-      <w:hyperlink w:anchor="_Toc242965699" w:history="1">
+      <w:hyperlink w:anchor="_Toc242986722" w:history="1">
         <w:r>
           <w:rPr>
             <w:rStyle w:val="aff9"/>
@@ -828,7 +828,7 @@
             <w:noProof/>
             <w:webHidden/>
           </w:rPr>
-          <w:instrText xml:space="preserve"> PAGEREF _Toc242965699 \h </w:instrText>
+          <w:instrText xml:space="preserve"> PAGEREF _Toc242986722 \h </w:instrText>
         </w:r>
         <w:r>
           <w:rPr>
@@ -848,7 +848,7 @@
             <w:noProof/>
             <w:webHidden/>
           </w:rPr>
-          <w:t>6</w:t>
+          <w:t>5</w:t>
         </w:r>
         <w:r>
           <w:rPr>
@@ -876,7 +876,7 @@
           <w14:ligatures w14:val="standardContextual"/>
         </w:rPr>
       </w:pPr>
-      <w:hyperlink w:anchor="_Toc242965700" w:history="1">
+      <w:hyperlink w:anchor="_Toc242986723" w:history="1">
         <w:r>
           <w:rPr>
             <w:rStyle w:val="aff9"/>
@@ -910,7 +910,7 @@
             <w:noProof/>
             <w:webHidden/>
           </w:rPr>
-          <w:instrText xml:space="preserve"> PAGEREF _Toc242965700 \h </w:instrText>
+          <w:instrText xml:space="preserve"> PAGEREF _Toc242986723 \h </w:instrText>
         </w:r>
         <w:r>
           <w:rPr>
@@ -930,7 +930,7 @@
             <w:noProof/>
             <w:webHidden/>
           </w:rPr>
-          <w:t>7</w:t>
+          <w:t>6</w:t>
         </w:r>
         <w:r>
           <w:rPr>
@@ -958,7 +958,7 @@
           <w14:ligatures w14:val="standardContextual"/>
         </w:rPr>
       </w:pPr>
-      <w:hyperlink w:anchor="_Toc242965701" w:history="1">
+      <w:hyperlink w:anchor="_Toc242986724" w:history="1">
         <w:r>
           <w:rPr>
             <w:rStyle w:val="aff9"/>
@@ -992,7 +992,7 @@
             <w:noProof/>
             <w:webHidden/>
           </w:rPr>
-          <w:instrText xml:space="preserve"> PAGEREF _Toc242965701 \h </w:instrText>
+          <w:instrText xml:space="preserve"> PAGEREF _Toc242986724 \h </w:instrText>
         </w:r>
         <w:r>
           <w:rPr>
@@ -1012,7 +1012,7 @@
             <w:noProof/>
             <w:webHidden/>
           </w:rPr>
-          <w:t>8</w:t>
+          <w:t>7</w:t>
         </w:r>
         <w:r>
           <w:rPr>
@@ -1040,7 +1040,7 @@
           <w14:ligatures w14:val="standardContextual"/>
         </w:rPr>
       </w:pPr>
-      <w:hyperlink w:anchor="_Toc242965702" w:history="1">
+      <w:hyperlink w:anchor="_Toc242986725" w:history="1">
         <w:r>
           <w:rPr>
             <w:rStyle w:val="aff9"/>
@@ -1074,7 +1074,7 @@
             <w:noProof/>
             <w:webHidden/>
           </w:rPr>
-          <w:instrText xml:space="preserve"> PAGEREF _Toc242965702 \h </w:instrText>
+          <w:instrText xml:space="preserve"> PAGEREF _Toc242986725 \h </w:instrText>
         </w:r>
         <w:r>
           <w:rPr>
@@ -1094,7 +1094,7 @@
             <w:noProof/>
             <w:webHidden/>
           </w:rPr>
-          <w:t>9</w:t>
+          <w:t>8</w:t>
         </w:r>
         <w:r>
           <w:rPr>
@@ -1122,7 +1122,7 @@
           <w14:ligatures w14:val="standardContextual"/>
         </w:rPr>
       </w:pPr>
-      <w:hyperlink w:anchor="_Toc242965703" w:history="1">
+      <w:hyperlink w:anchor="_Toc242986726" w:history="1">
         <w:r>
           <w:rPr>
             <w:rStyle w:val="aff9"/>
@@ -1156,7 +1156,7 @@
             <w:noProof/>
             <w:webHidden/>
           </w:rPr>
-          <w:instrText xml:space="preserve"> PAGEREF _Toc242965703 \h </w:instrText>
+          <w:instrText xml:space="preserve"> PAGEREF _Toc242986726 \h </w:instrText>
         </w:r>
         <w:r>
           <w:rPr>
@@ -1176,7 +1176,7 @@
             <w:noProof/>
             <w:webHidden/>
           </w:rPr>
-          <w:t>9</w:t>
+          <w:t>8</w:t>
         </w:r>
         <w:r>
           <w:rPr>
@@ -1204,7 +1204,7 @@
           <w14:ligatures w14:val="standardContextual"/>
         </w:rPr>
       </w:pPr>
-      <w:hyperlink w:anchor="_Toc242965704" w:history="1">
+      <w:hyperlink w:anchor="_Toc242986727" w:history="1">
         <w:r>
           <w:rPr>
             <w:rStyle w:val="aff9"/>
@@ -1238,7 +1238,7 @@
             <w:noProof/>
             <w:webHidden/>
           </w:rPr>
-          <w:instrText xml:space="preserve"> PAGEREF _Toc242965704 \h </w:instrText>
+          <w:instrText xml:space="preserve"> PAGEREF _Toc242986727 \h </w:instrText>
         </w:r>
         <w:r>
           <w:rPr>
@@ -1258,7 +1258,7 @@
             <w:noProof/>
             <w:webHidden/>
           </w:rPr>
-          <w:t>10</w:t>
+          <w:t>9</w:t>
         </w:r>
         <w:r>
           <w:rPr>
@@ -1286,7 +1286,7 @@
           <w14:ligatures w14:val="standardContextual"/>
         </w:rPr>
       </w:pPr>
-      <w:hyperlink w:anchor="_Toc242965705" w:history="1">
+      <w:hyperlink w:anchor="_Toc242986728" w:history="1">
         <w:r>
           <w:rPr>
             <w:rStyle w:val="aff9"/>
@@ -1320,7 +1320,7 @@
             <w:noProof/>
             <w:webHidden/>
           </w:rPr>
-          <w:instrText xml:space="preserve"> PAGEREF _Toc242965705 \h </w:instrText>
+          <w:instrText xml:space="preserve"> PAGEREF _Toc242986728 \h </w:instrText>
         </w:r>
         <w:r>
           <w:rPr>
@@ -1340,7 +1340,7 @@
             <w:noProof/>
             <w:webHidden/>
           </w:rPr>
-          <w:t>10</w:t>
+          <w:t>9</w:t>
         </w:r>
         <w:r>
           <w:rPr>
@@ -1368,7 +1368,7 @@
           <w14:ligatures w14:val="standardContextual"/>
         </w:rPr>
       </w:pPr>
-      <w:hyperlink w:anchor="_Toc242965706" w:history="1">
+      <w:hyperlink w:anchor="_Toc242986729" w:history="1">
         <w:r>
           <w:rPr>
             <w:rStyle w:val="aff9"/>
@@ -1402,7 +1402,7 @@
             <w:noProof/>
             <w:webHidden/>
           </w:rPr>
-          <w:instrText xml:space="preserve"> PAGEREF _Toc242965706 \h </w:instrText>
+          <w:instrText xml:space="preserve"> PAGEREF _Toc242986729 \h </w:instrText>
         </w:r>
         <w:r>
           <w:rPr>
@@ -1422,7 +1422,7 @@
             <w:noProof/>
             <w:webHidden/>
           </w:rPr>
-          <w:t>11</w:t>
+          <w:t>10</w:t>
         </w:r>
         <w:r>
           <w:rPr>
@@ -1450,7 +1450,7 @@
           <w14:ligatures w14:val="standardContextual"/>
         </w:rPr>
       </w:pPr>
-      <w:hyperlink w:anchor="_Toc242965707" w:history="1">
+      <w:hyperlink w:anchor="_Toc242986730" w:history="1">
         <w:r>
           <w:rPr>
             <w:rStyle w:val="aff9"/>
@@ -1484,7 +1484,7 @@
             <w:noProof/>
             <w:webHidden/>
           </w:rPr>
-          <w:instrText xml:space="preserve"> PAGEREF _Toc242965707 \h </w:instrText>
+          <w:instrText xml:space="preserve"> PAGEREF _Toc242986730 \h </w:instrText>
         </w:r>
         <w:r>
           <w:rPr>
@@ -1504,7 +1504,7 @@
             <w:noProof/>
             <w:webHidden/>
           </w:rPr>
-          <w:t>11</w:t>
+          <w:t>10</w:t>
         </w:r>
         <w:r>
           <w:rPr>
@@ -1532,7 +1532,7 @@
           <w14:ligatures w14:val="standardContextual"/>
         </w:rPr>
       </w:pPr>
-      <w:hyperlink w:anchor="_Toc242965708" w:history="1">
+      <w:hyperlink w:anchor="_Toc242986731" w:history="1">
         <w:r>
           <w:rPr>
             <w:rStyle w:val="aff9"/>
@@ -1566,7 +1566,7 @@
             <w:noProof/>
             <w:webHidden/>
           </w:rPr>
-          <w:instrText xml:space="preserve"> PAGEREF _Toc242965708 \h </w:instrText>
+          <w:instrText xml:space="preserve"> PAGEREF _Toc242986731 \h </w:instrText>
         </w:r>
         <w:r>
           <w:rPr>
@@ -1586,7 +1586,7 @@
             <w:noProof/>
             <w:webHidden/>
           </w:rPr>
-          <w:t>11</w:t>
+          <w:t>10</w:t>
         </w:r>
         <w:r>
           <w:rPr>
@@ -1614,7 +1614,7 @@
           <w14:ligatures w14:val="standardContextual"/>
         </w:rPr>
       </w:pPr>
-      <w:hyperlink w:anchor="_Toc242965709" w:history="1">
+      <w:hyperlink w:anchor="_Toc242986732" w:history="1">
         <w:r>
           <w:rPr>
             <w:rStyle w:val="aff9"/>
@@ -1655,7 +1655,7 @@
             <w:noProof/>
             <w:webHidden/>
           </w:rPr>
-          <w:instrText xml:space="preserve"> PAGEREF _Toc242965709 \h </w:instrText>
+          <w:instrText xml:space="preserve"> PAGEREF _Toc242986732 \h </w:instrText>
         </w:r>
         <w:r>
           <w:rPr>
@@ -1675,7 +1675,7 @@
             <w:noProof/>
             <w:webHidden/>
           </w:rPr>
-          <w:t>11</w:t>
+          <w:t>10</w:t>
         </w:r>
         <w:r>
           <w:rPr>
@@ -1703,7 +1703,7 @@
           <w14:ligatures w14:val="standardContextual"/>
         </w:rPr>
       </w:pPr>
-      <w:hyperlink w:anchor="_Toc242965710" w:history="1">
+      <w:hyperlink w:anchor="_Toc242986733" w:history="1">
         <w:r>
           <w:rPr>
             <w:rStyle w:val="aff9"/>
@@ -1737,7 +1737,7 @@
             <w:noProof/>
             <w:webHidden/>
           </w:rPr>
-          <w:instrText xml:space="preserve"> PAGEREF _Toc242965710 \h </w:instrText>
+          <w:instrText xml:space="preserve"> PAGEREF _Toc242986733 \h </w:instrText>
         </w:r>
         <w:r>
           <w:rPr>
@@ -1757,7 +1757,7 @@
             <w:noProof/>
             <w:webHidden/>
           </w:rPr>
-          <w:t>12</w:t>
+          <w:t>11</w:t>
         </w:r>
         <w:r>
           <w:rPr>
@@ -1785,7 +1785,7 @@
           <w14:ligatures w14:val="standardContextual"/>
         </w:rPr>
       </w:pPr>
-      <w:hyperlink w:anchor="_Toc242965711" w:history="1">
+      <w:hyperlink w:anchor="_Toc242986734" w:history="1">
         <w:r>
           <w:rPr>
             <w:rStyle w:val="aff9"/>
@@ -1819,7 +1819,7 @@
             <w:noProof/>
             <w:webHidden/>
           </w:rPr>
-          <w:instrText xml:space="preserve"> PAGEREF _Toc242965711 \h </w:instrText>
+          <w:instrText xml:space="preserve"> PAGEREF _Toc242986734 \h </w:instrText>
         </w:r>
         <w:r>
           <w:rPr>
@@ -1839,7 +1839,7 @@
             <w:noProof/>
             <w:webHidden/>
           </w:rPr>
-          <w:t>12</w:t>
+          <w:t>11</w:t>
         </w:r>
         <w:r>
           <w:rPr>
@@ -1867,7 +1867,7 @@
           <w14:ligatures w14:val="standardContextual"/>
         </w:rPr>
       </w:pPr>
-      <w:hyperlink w:anchor="_Toc242965712" w:history="1">
+      <w:hyperlink w:anchor="_Toc242986735" w:history="1">
         <w:r>
           <w:rPr>
             <w:rStyle w:val="aff9"/>
@@ -1901,7 +1901,7 @@
             <w:noProof/>
             <w:webHidden/>
           </w:rPr>
-          <w:instrText xml:space="preserve"> PAGEREF _Toc242965712 \h </w:instrText>
+          <w:instrText xml:space="preserve"> PAGEREF _Toc242986735 \h </w:instrText>
         </w:r>
         <w:r>
           <w:rPr>
@@ -1921,7 +1921,7 @@
             <w:noProof/>
             <w:webHidden/>
           </w:rPr>
-          <w:t>12</w:t>
+          <w:t>11</w:t>
         </w:r>
         <w:r>
           <w:rPr>
@@ -1949,7 +1949,7 @@
           <w14:ligatures w14:val="standardContextual"/>
         </w:rPr>
       </w:pPr>
-      <w:hyperlink w:anchor="_Toc242965713" w:history="1">
+      <w:hyperlink w:anchor="_Toc242986736" w:history="1">
         <w:r>
           <w:rPr>
             <w:rStyle w:val="aff9"/>
@@ -1983,7 +1983,7 @@
             <w:noProof/>
             <w:webHidden/>
           </w:rPr>
-          <w:instrText xml:space="preserve"> PAGEREF _Toc242965713 \h </w:instrText>
+          <w:instrText xml:space="preserve"> PAGEREF _Toc242986736 \h </w:instrText>
         </w:r>
         <w:r>
           <w:rPr>
@@ -2003,7 +2003,7 @@
             <w:noProof/>
             <w:webHidden/>
           </w:rPr>
-          <w:t>12</w:t>
+          <w:t>11</w:t>
         </w:r>
         <w:r>
           <w:rPr>
@@ -2031,7 +2031,7 @@
           <w14:ligatures w14:val="standardContextual"/>
         </w:rPr>
       </w:pPr>
-      <w:hyperlink w:anchor="_Toc242965714" w:history="1">
+      <w:hyperlink w:anchor="_Toc242986737" w:history="1">
         <w:r>
           <w:rPr>
             <w:rStyle w:val="aff9"/>
@@ -2065,7 +2065,7 @@
             <w:noProof/>
             <w:webHidden/>
           </w:rPr>
-          <w:instrText xml:space="preserve"> PAGEREF _Toc242965714 \h </w:instrText>
+          <w:instrText xml:space="preserve"> PAGEREF _Toc242986737 \h </w:instrText>
         </w:r>
         <w:r>
           <w:rPr>
@@ -2085,7 +2085,7 @@
             <w:noProof/>
             <w:webHidden/>
           </w:rPr>
-          <w:t>13</w:t>
+          <w:t>12</w:t>
         </w:r>
         <w:r>
           <w:rPr>
@@ -2113,7 +2113,7 @@
           <w14:ligatures w14:val="standardContextual"/>
         </w:rPr>
       </w:pPr>
-      <w:hyperlink w:anchor="_Toc242965715" w:history="1">
+      <w:hyperlink w:anchor="_Toc242986738" w:history="1">
         <w:r>
           <w:rPr>
             <w:rStyle w:val="aff9"/>
@@ -2147,7 +2147,7 @@
             <w:noProof/>
             <w:webHidden/>
           </w:rPr>
-          <w:instrText xml:space="preserve"> PAGEREF _Toc242965715 \h </w:instrText>
+          <w:instrText xml:space="preserve"> PAGEREF _Toc242986738 \h </w:instrText>
         </w:r>
         <w:r>
           <w:rPr>
@@ -2167,7 +2167,7 @@
             <w:noProof/>
             <w:webHidden/>
           </w:rPr>
-          <w:t>13</w:t>
+          <w:t>12</w:t>
         </w:r>
         <w:r>
           <w:rPr>
@@ -2195,7 +2195,7 @@
           <w14:ligatures w14:val="standardContextual"/>
         </w:rPr>
       </w:pPr>
-      <w:hyperlink w:anchor="_Toc242965716" w:history="1">
+      <w:hyperlink w:anchor="_Toc242986739" w:history="1">
         <w:r>
           <w:rPr>
             <w:rStyle w:val="aff9"/>
@@ -2229,7 +2229,7 @@
             <w:noProof/>
             <w:webHidden/>
           </w:rPr>
-          <w:instrText xml:space="preserve"> PAGEREF _Toc242965716 \h </w:instrText>
+          <w:instrText xml:space="preserve"> PAGEREF _Toc242986739 \h </w:instrText>
         </w:r>
         <w:r>
           <w:rPr>
@@ -2249,7 +2249,7 @@
             <w:noProof/>
             <w:webHidden/>
           </w:rPr>
-          <w:t>13</w:t>
+          <w:t>12</w:t>
         </w:r>
         <w:r>
           <w:rPr>
@@ -2277,7 +2277,7 @@
           <w14:ligatures w14:val="standardContextual"/>
         </w:rPr>
       </w:pPr>
-      <w:hyperlink w:anchor="_Toc242965717" w:history="1">
+      <w:hyperlink w:anchor="_Toc242986740" w:history="1">
         <w:r>
           <w:rPr>
             <w:rStyle w:val="aff9"/>
@@ -2311,7 +2311,7 @@
             <w:noProof/>
             <w:webHidden/>
           </w:rPr>
-          <w:instrText xml:space="preserve"> PAGEREF _Toc242965717 \h </w:instrText>
+          <w:instrText xml:space="preserve"> PAGEREF _Toc242986740 \h </w:instrText>
         </w:r>
         <w:r>
           <w:rPr>
@@ -2331,7 +2331,7 @@
             <w:noProof/>
             <w:webHidden/>
           </w:rPr>
-          <w:t>13</w:t>
+          <w:t>12</w:t>
         </w:r>
         <w:r>
           <w:rPr>
@@ -2359,7 +2359,7 @@
           <w14:ligatures w14:val="standardContextual"/>
         </w:rPr>
       </w:pPr>
-      <w:hyperlink w:anchor="_Toc242965718" w:history="1">
+      <w:hyperlink w:anchor="_Toc242986741" w:history="1">
         <w:r>
           <w:rPr>
             <w:rStyle w:val="aff9"/>
@@ -2393,7 +2393,7 @@
             <w:noProof/>
             <w:webHidden/>
           </w:rPr>
-          <w:instrText xml:space="preserve"> PAGEREF _Toc242965718 \h </w:instrText>
+          <w:instrText xml:space="preserve"> PAGEREF _Toc242986741 \h </w:instrText>
         </w:r>
         <w:r>
           <w:rPr>
@@ -2441,7 +2441,7 @@
           <w14:ligatures w14:val="standardContextual"/>
         </w:rPr>
       </w:pPr>
-      <w:hyperlink w:anchor="_Toc242965719" w:history="1">
+      <w:hyperlink w:anchor="_Toc242986742" w:history="1">
         <w:r>
           <w:rPr>
             <w:rStyle w:val="aff9"/>
@@ -2475,7 +2475,7 @@
             <w:noProof/>
             <w:webHidden/>
           </w:rPr>
-          <w:instrText xml:space="preserve"> PAGEREF _Toc242965719 \h </w:instrText>
+          <w:instrText xml:space="preserve"> PAGEREF _Toc242986742 \h </w:instrText>
         </w:r>
         <w:r>
           <w:rPr>
@@ -2495,7 +2495,7 @@
             <w:noProof/>
             <w:webHidden/>
           </w:rPr>
-          <w:t>16</w:t>
+          <w:t>15</w:t>
         </w:r>
         <w:r>
           <w:rPr>
@@ -2523,7 +2523,7 @@
           <w14:ligatures w14:val="standardContextual"/>
         </w:rPr>
       </w:pPr>
-      <w:hyperlink w:anchor="_Toc242965720" w:history="1">
+      <w:hyperlink w:anchor="_Toc242986743" w:history="1">
         <w:r>
           <w:rPr>
             <w:rStyle w:val="aff9"/>
@@ -2557,7 +2557,7 @@
             <w:noProof/>
             <w:webHidden/>
           </w:rPr>
-          <w:instrText xml:space="preserve"> PAGEREF _Toc242965720 \h </w:instrText>
+          <w:instrText xml:space="preserve"> PAGEREF _Toc242986743 \h </w:instrText>
         </w:r>
         <w:r>
           <w:rPr>
@@ -2605,7 +2605,7 @@
           <w14:ligatures w14:val="standardContextual"/>
         </w:rPr>
       </w:pPr>
-      <w:hyperlink w:anchor="_Toc242965721" w:history="1">
+      <w:hyperlink w:anchor="_Toc242986744" w:history="1">
         <w:r>
           <w:rPr>
             <w:rStyle w:val="aff9"/>
@@ -2639,7 +2639,7 @@
             <w:noProof/>
             <w:webHidden/>
           </w:rPr>
-          <w:instrText xml:space="preserve"> PAGEREF _Toc242965721 \h </w:instrText>
+          <w:instrText xml:space="preserve"> PAGEREF _Toc242986744 \h </w:instrText>
         </w:r>
         <w:r>
           <w:rPr>
@@ -2687,7 +2687,7 @@
           <w14:ligatures w14:val="standardContextual"/>
         </w:rPr>
       </w:pPr>
-      <w:hyperlink w:anchor="_Toc242965722" w:history="1">
+      <w:hyperlink w:anchor="_Toc242986745" w:history="1">
         <w:r>
           <w:rPr>
             <w:rStyle w:val="aff9"/>
@@ -2721,7 +2721,7 @@
             <w:noProof/>
             <w:webHidden/>
           </w:rPr>
-          <w:instrText xml:space="preserve"> PAGEREF _Toc242965722 \h </w:instrText>
+          <w:instrText xml:space="preserve"> PAGEREF _Toc242986745 \h </w:instrText>
         </w:r>
         <w:r>
           <w:rPr>
@@ -2769,7 +2769,7 @@
           <w14:ligatures w14:val="standardContextual"/>
         </w:rPr>
       </w:pPr>
-      <w:hyperlink w:anchor="_Toc242965723" w:history="1">
+      <w:hyperlink w:anchor="_Toc242986746" w:history="1">
         <w:r>
           <w:rPr>
             <w:rStyle w:val="aff9"/>
@@ -2803,7 +2803,7 @@
             <w:noProof/>
             <w:webHidden/>
           </w:rPr>
-          <w:instrText xml:space="preserve"> PAGEREF _Toc242965723 \h </w:instrText>
+          <w:instrText xml:space="preserve"> PAGEREF _Toc242986746 \h </w:instrText>
         </w:r>
         <w:r>
           <w:rPr>
@@ -2851,7 +2851,7 @@
           <w14:ligatures w14:val="standardContextual"/>
         </w:rPr>
       </w:pPr>
-      <w:hyperlink w:anchor="_Toc242965724" w:history="1">
+      <w:hyperlink w:anchor="_Toc242986747" w:history="1">
         <w:r>
           <w:rPr>
             <w:rStyle w:val="aff9"/>
@@ -2885,7 +2885,7 @@
             <w:noProof/>
             <w:webHidden/>
           </w:rPr>
-          <w:instrText xml:space="preserve"> PAGEREF _Toc242965724 \h </w:instrText>
+          <w:instrText xml:space="preserve"> PAGEREF _Toc242986747 \h </w:instrText>
         </w:r>
         <w:r>
           <w:rPr>
@@ -2933,7 +2933,7 @@
           <w14:ligatures w14:val="standardContextual"/>
         </w:rPr>
       </w:pPr>
-      <w:hyperlink w:anchor="_Toc242965725" w:history="1">
+      <w:hyperlink w:anchor="_Toc242986748" w:history="1">
         <w:r>
           <w:rPr>
             <w:rStyle w:val="aff9"/>
@@ -2967,7 +2967,7 @@
             <w:noProof/>
             <w:webHidden/>
           </w:rPr>
-          <w:instrText xml:space="preserve"> PAGEREF _Toc242965725 \h </w:instrText>
+          <w:instrText xml:space="preserve"> PAGEREF _Toc242986748 \h </w:instrText>
         </w:r>
         <w:r>
           <w:rPr>
@@ -2987,7 +2987,7 @@
             <w:noProof/>
             <w:webHidden/>
           </w:rPr>
-          <w:t>19</w:t>
+          <w:t>18</w:t>
         </w:r>
         <w:r>
           <w:rPr>
@@ -3015,7 +3015,7 @@
           <w14:ligatures w14:val="standardContextual"/>
         </w:rPr>
       </w:pPr>
-      <w:hyperlink w:anchor="_Toc242965726" w:history="1">
+      <w:hyperlink w:anchor="_Toc242986749" w:history="1">
         <w:r>
           <w:rPr>
             <w:rStyle w:val="aff9"/>
@@ -3049,7 +3049,7 @@
             <w:noProof/>
             <w:webHidden/>
           </w:rPr>
-          <w:instrText xml:space="preserve"> PAGEREF _Toc242965726 \h </w:instrText>
+          <w:instrText xml:space="preserve"> PAGEREF _Toc242986749 \h </w:instrText>
         </w:r>
         <w:r>
           <w:rPr>
@@ -3097,7 +3097,7 @@
           <w14:ligatures w14:val="standardContextual"/>
         </w:rPr>
       </w:pPr>
-      <w:hyperlink w:anchor="_Toc242965727" w:history="1">
+      <w:hyperlink w:anchor="_Toc242986750" w:history="1">
         <w:r>
           <w:rPr>
             <w:rStyle w:val="aff9"/>
@@ -3131,7 +3131,7 @@
             <w:noProof/>
             <w:webHidden/>
           </w:rPr>
-          <w:instrText xml:space="preserve"> PAGEREF _Toc242965727 \h </w:instrText>
+          <w:instrText xml:space="preserve"> PAGEREF _Toc242986750 \h </w:instrText>
         </w:r>
         <w:r>
           <w:rPr>
@@ -3179,7 +3179,7 @@
           <w14:ligatures w14:val="standardContextual"/>
         </w:rPr>
       </w:pPr>
-      <w:hyperlink w:anchor="_Toc242965728" w:history="1">
+      <w:hyperlink w:anchor="_Toc242986751" w:history="1">
         <w:r>
           <w:rPr>
             <w:rStyle w:val="aff9"/>
@@ -3213,7 +3213,7 @@
             <w:noProof/>
             <w:webHidden/>
           </w:rPr>
-          <w:instrText xml:space="preserve"> PAGEREF _Toc242965728 \h </w:instrText>
+          <w:instrText xml:space="preserve"> PAGEREF _Toc242986751 \h </w:instrText>
         </w:r>
         <w:r>
           <w:rPr>
@@ -3233,7 +3233,7 @@
             <w:noProof/>
             <w:webHidden/>
           </w:rPr>
-          <w:t>20</w:t>
+          <w:t>19</w:t>
         </w:r>
         <w:r>
           <w:rPr>
@@ -3261,7 +3261,7 @@
           <w14:ligatures w14:val="standardContextual"/>
         </w:rPr>
       </w:pPr>
-      <w:hyperlink w:anchor="_Toc242965729" w:history="1">
+      <w:hyperlink w:anchor="_Toc242986752" w:history="1">
         <w:r>
           <w:rPr>
             <w:rStyle w:val="aff9"/>
@@ -3295,7 +3295,7 @@
             <w:noProof/>
             <w:webHidden/>
           </w:rPr>
-          <w:instrText xml:space="preserve"> PAGEREF _Toc242965729 \h </w:instrText>
+          <w:instrText xml:space="preserve"> PAGEREF _Toc242986752 \h </w:instrText>
         </w:r>
         <w:r>
           <w:rPr>
@@ -3336,7 +3336,7 @@
         <w:pStyle w:val="1"/>
         <w:pageBreakBefore/>
       </w:pPr>
-      <w:bookmarkStart w:id="0" w:name="_Toc242965691"/>
+      <w:bookmarkStart w:id="0" w:name="_Toc242986714"/>
       <w:r>
         <w:lastRenderedPageBreak/>
         <w:t xml:space="preserve">1 </w:t>
@@ -3350,7 +3350,7 @@
       <w:pPr>
         <w:pStyle w:val="21"/>
       </w:pPr>
-      <w:bookmarkStart w:id="1" w:name="_Toc242965692"/>
+      <w:bookmarkStart w:id="1" w:name="_Toc242986715"/>
       <w:r>
         <w:t xml:space="preserve">1.1 </w:t>
       </w:r>
@@ -3394,7 +3394,7 @@
         <w:t>～</w:t>
       </w:r>
       <w:r>
-        <w:t xml:space="preserve">A07 </w:t>
+        <w:t xml:space="preserve">A09 </w:t>
       </w:r>
       <w:r>
         <w:t>与已实现的异常、容量、资源和界面行为。测试文档内容组织参考</w:t>
@@ -3417,22 +3417,16 @@
         <w:t>本报告采用</w:t>
       </w:r>
       <w:r>
-        <w:t xml:space="preserve"> 2026-10-14 </w:t>
-      </w:r>
-      <w:r>
-        <w:t>的最终后端回归及真实模型契约记录，并于</w:t>
-      </w:r>
-      <w:r>
         <w:t xml:space="preserve"> 2026-10-15 </w:t>
       </w:r>
       <w:r>
-        <w:t>复测前端单元、构建、静态检查、基础浏览器流程和真实模型阅读流程。独立签名交叉验证保留</w:t>
+        <w:t>的后端全量回归、真实模型契约及自然语言路由记录，同日复测前端单元、构建、静态检查、基础浏览器和真实模型阅读流程。独立签名交叉验证保留</w:t>
       </w:r>
       <w:r>
         <w:t xml:space="preserve"> 2026-10-03 </w:t>
       </w:r>
       <w:r>
-        <w:t>基线，未将其计入本轮新增测试。各项执行证据列于第</w:t>
+        <w:t>基线。各项执行证据列于第</w:t>
       </w:r>
       <w:r>
         <w:t xml:space="preserve"> 3 </w:t>
@@ -3451,7 +3445,7 @@
       <w:pPr>
         <w:pStyle w:val="21"/>
       </w:pPr>
-      <w:bookmarkStart w:id="2" w:name="_Toc242965693"/>
+      <w:bookmarkStart w:id="2" w:name="_Toc242986716"/>
       <w:r>
         <w:t xml:space="preserve">1.2 </w:t>
       </w:r>
@@ -3465,19 +3459,19 @@
         <w:t>后端默认回归</w:t>
       </w:r>
       <w:r>
-        <w:t xml:space="preserve"> 106 </w:t>
+        <w:t xml:space="preserve"> 127 </w:t>
       </w:r>
       <w:r>
         <w:t>项全部通过，独立真实模型契约</w:t>
       </w:r>
       <w:r>
-        <w:t xml:space="preserve"> 1 </w:t>
+        <w:t xml:space="preserve"> 2 </w:t>
       </w:r>
       <w:r>
         <w:t>项通过；前端单元</w:t>
       </w:r>
       <w:r>
-        <w:t xml:space="preserve"> 10 </w:t>
+        <w:t xml:space="preserve"> 14 </w:t>
       </w:r>
       <w:r>
         <w:t>项、基础浏览器</w:t>
@@ -3505,7 +3499,7 @@
       <w:pPr>
         <w:pStyle w:val="1"/>
       </w:pPr>
-      <w:bookmarkStart w:id="3" w:name="_Toc242965694"/>
+      <w:bookmarkStart w:id="3" w:name="_Toc242986717"/>
       <w:r>
         <w:t xml:space="preserve">2 </w:t>
       </w:r>
@@ -3518,7 +3512,7 @@
       <w:pPr>
         <w:pStyle w:val="21"/>
       </w:pPr>
-      <w:bookmarkStart w:id="4" w:name="_Toc242965695"/>
+      <w:bookmarkStart w:id="4" w:name="_Toc242986718"/>
       <w:r>
         <w:t xml:space="preserve">2.1 </w:t>
       </w:r>
@@ -3664,7 +3658,7 @@
               <w:t>后端与真实模型契约：</w:t>
             </w:r>
             <w:r>
-              <w:t>2026-10-14</w:t>
+              <w:t>2026-10-15</w:t>
             </w:r>
             <w:r>
               <w:t>；前端与浏览器复测：</w:t>
@@ -4202,7 +4196,7 @@
       <w:pPr>
         <w:pStyle w:val="21"/>
       </w:pPr>
-      <w:bookmarkStart w:id="5" w:name="_Toc242965696"/>
+      <w:bookmarkStart w:id="5" w:name="_Toc242986719"/>
       <w:r>
         <w:t xml:space="preserve">2.2 </w:t>
       </w:r>
@@ -4329,7 +4323,7 @@
       <w:pPr>
         <w:pStyle w:val="21"/>
       </w:pPr>
-      <w:bookmarkStart w:id="6" w:name="_Toc242965697"/>
+      <w:bookmarkStart w:id="6" w:name="_Toc242986720"/>
       <w:r>
         <w:lastRenderedPageBreak/>
         <w:t xml:space="preserve">2.3 </w:t>
@@ -4928,7 +4922,7 @@
       <w:pPr>
         <w:pStyle w:val="1"/>
       </w:pPr>
-      <w:bookmarkStart w:id="7" w:name="_Toc242965698"/>
+      <w:bookmarkStart w:id="7" w:name="_Toc242986721"/>
       <w:r>
         <w:t xml:space="preserve">3 </w:t>
       </w:r>
@@ -4941,7 +4935,7 @@
       <w:pPr>
         <w:pStyle w:val="21"/>
       </w:pPr>
-      <w:bookmarkStart w:id="8" w:name="_Toc242965699"/>
+      <w:bookmarkStart w:id="8" w:name="_Toc242986722"/>
       <w:r>
         <w:t xml:space="preserve">3.1 </w:t>
       </w:r>
@@ -5138,7 +5132,7 @@
               <w:pStyle w:val="TableBody"/>
             </w:pPr>
             <w:r>
-              <w:t>2026-10-14</w:t>
+              <w:t>2026-10-15</w:t>
             </w:r>
           </w:p>
         </w:tc>
@@ -5178,7 +5172,7 @@
               <w:pStyle w:val="TableBody"/>
             </w:pPr>
             <w:r>
-              <w:t>106/106</w:t>
+              <w:t>127/127</w:t>
             </w:r>
             <w:r>
               <w:t>；</w:t>
@@ -5251,7 +5245,7 @@
               <w:pStyle w:val="TableBody"/>
             </w:pPr>
             <w:r>
-              <w:t>2026-10-14</w:t>
+              <w:t>2026-10-15</w:t>
             </w:r>
           </w:p>
         </w:tc>
@@ -5291,10 +5285,10 @@
               <w:pStyle w:val="TableBody"/>
             </w:pPr>
             <w:r>
-              <w:t>1/1</w:t>
-            </w:r>
-            <w:r>
-              <w:t>；真实模型三种调用通过</w:t>
+              <w:t>2/2</w:t>
+            </w:r>
+            <w:r>
+              <w:t>；模型三种调用及七类自然语言路由通过</w:t>
             </w:r>
           </w:p>
         </w:tc>
@@ -5380,7 +5374,7 @@
               <w:pStyle w:val="TableBody"/>
             </w:pPr>
             <w:r>
-              <w:t>10/10</w:t>
+              <w:t>14/14</w:t>
             </w:r>
             <w:r>
               <w:t>；</w:t>
@@ -5586,10 +5580,7 @@
               <w:t>；</w:t>
             </w:r>
             <w:r>
-              <w:t xml:space="preserve">7.6 </w:t>
-            </w:r>
-            <w:r>
-              <w:t>秒</w:t>
+              <w:t>5.2s</w:t>
             </w:r>
           </w:p>
         </w:tc>
@@ -5681,10 +5672,10 @@
               <w:t>；</w:t>
             </w:r>
             <w:r>
-              <w:t xml:space="preserve">24.3 </w:t>
-            </w:r>
-            <w:r>
-              <w:t>秒；真实模型完整流程</w:t>
+              <w:t>35.3s</w:t>
+            </w:r>
+            <w:r>
+              <w:t>；真实模型完整流程</w:t>
             </w:r>
           </w:p>
         </w:tc>
@@ -5946,7 +5937,7 @@
       <w:pPr>
         <w:pStyle w:val="21"/>
       </w:pPr>
-      <w:bookmarkStart w:id="9" w:name="_Toc242965700"/>
+      <w:bookmarkStart w:id="9" w:name="_Toc242986723"/>
       <w:r>
         <w:t xml:space="preserve">3.2 </w:t>
       </w:r>
@@ -6197,7 +6188,7 @@
               <w:pStyle w:val="TableBody"/>
             </w:pPr>
             <w:r>
-              <w:t>15</w:t>
+              <w:t>19</w:t>
             </w:r>
           </w:p>
         </w:tc>
@@ -6277,7 +6268,7 @@
               <w:pStyle w:val="TableBody"/>
             </w:pPr>
             <w:r>
-              <w:t>20.64</w:t>
+              <w:t>25.454</w:t>
             </w:r>
           </w:p>
         </w:tc>
@@ -6429,7 +6420,7 @@
               <w:pStyle w:val="TableBody"/>
             </w:pPr>
             <w:r>
-              <w:t>AiReadingTest</w:t>
+              <w:t>AiIntentTest</w:t>
             </w:r>
           </w:p>
         </w:tc>
@@ -6449,7 +6440,7 @@
               <w:pStyle w:val="TableBody"/>
             </w:pPr>
             <w:r>
-              <w:t>4</w:t>
+              <w:t>17</w:t>
             </w:r>
           </w:p>
         </w:tc>
@@ -6529,7 +6520,7 @@
               <w:pStyle w:val="TableBody"/>
             </w:pPr>
             <w:r>
-              <w:t>0.697</w:t>
+              <w:t>0.041</w:t>
             </w:r>
           </w:p>
         </w:tc>
@@ -6555,7 +6546,7 @@
               <w:pStyle w:val="TableBody"/>
             </w:pPr>
             <w:r>
-              <w:t>ApplicationTest</w:t>
+              <w:t>AiReadingTest</w:t>
             </w:r>
           </w:p>
         </w:tc>
@@ -6575,7 +6566,7 @@
               <w:pStyle w:val="TableBody"/>
             </w:pPr>
             <w:r>
-              <w:t>1</w:t>
+              <w:t>4</w:t>
             </w:r>
           </w:p>
         </w:tc>
@@ -6655,7 +6646,7 @@
               <w:pStyle w:val="TableBody"/>
             </w:pPr>
             <w:r>
-              <w:t>0.492</w:t>
+              <w:t>0.674</w:t>
             </w:r>
           </w:p>
         </w:tc>
@@ -6681,7 +6672,7 @@
               <w:pStyle w:val="TableBody"/>
             </w:pPr>
             <w:r>
-              <w:t>ExamplesTest</w:t>
+              <w:t>ApplicationTest</w:t>
             </w:r>
           </w:p>
         </w:tc>
@@ -6781,7 +6772,7 @@
               <w:pStyle w:val="TableBody"/>
             </w:pPr>
             <w:r>
-              <w:t>3.842</w:t>
+              <w:t>0.47</w:t>
             </w:r>
           </w:p>
         </w:tc>
@@ -6807,7 +6798,7 @@
               <w:pStyle w:val="TableBody"/>
             </w:pPr>
             <w:r>
-              <w:t>PageSelectionTest</w:t>
+              <w:t>ExamplesTest</w:t>
             </w:r>
           </w:p>
         </w:tc>
@@ -6827,7 +6818,7 @@
               <w:pStyle w:val="TableBody"/>
             </w:pPr>
             <w:r>
-              <w:t>12</w:t>
+              <w:t>1</w:t>
             </w:r>
           </w:p>
         </w:tc>
@@ -6907,7 +6898,7 @@
               <w:pStyle w:val="TableBody"/>
             </w:pPr>
             <w:r>
-              <w:t>0.028</w:t>
+              <w:t>3.729</w:t>
             </w:r>
           </w:p>
         </w:tc>
@@ -6933,7 +6924,7 @@
               <w:pStyle w:val="TableBody"/>
             </w:pPr>
             <w:r>
-              <w:t>PdfApiTest</w:t>
+              <w:t>PageSelectionTest</w:t>
             </w:r>
           </w:p>
         </w:tc>
@@ -6953,7 +6944,7 @@
               <w:pStyle w:val="TableBody"/>
             </w:pPr>
             <w:r>
-              <w:t>6</w:t>
+              <w:t>12</w:t>
             </w:r>
           </w:p>
         </w:tc>
@@ -7033,7 +7024,7 @@
               <w:pStyle w:val="TableBody"/>
             </w:pPr>
             <w:r>
-              <w:t>1.348</w:t>
+              <w:t>0.009</w:t>
             </w:r>
           </w:p>
         </w:tc>
@@ -7059,7 +7050,7 @@
               <w:pStyle w:val="TableBody"/>
             </w:pPr>
             <w:r>
-              <w:t>PdfEncryptionUtilsTest</w:t>
+              <w:t>PdfApiTest</w:t>
             </w:r>
           </w:p>
         </w:tc>
@@ -7079,7 +7070,7 @@
               <w:pStyle w:val="TableBody"/>
             </w:pPr>
             <w:r>
-              <w:t>20</w:t>
+              <w:t>6</w:t>
             </w:r>
           </w:p>
         </w:tc>
@@ -7159,7 +7150,7 @@
               <w:pStyle w:val="TableBody"/>
             </w:pPr>
             <w:r>
-              <w:t>0.599</w:t>
+              <w:t>1.274</w:t>
             </w:r>
           </w:p>
         </w:tc>
@@ -7185,7 +7176,7 @@
               <w:pStyle w:val="TableBody"/>
             </w:pPr>
             <w:r>
-              <w:t>PdfImageUtilsTest</w:t>
+              <w:t>PdfEncryptionUtilsTest</w:t>
             </w:r>
           </w:p>
         </w:tc>
@@ -7205,7 +7196,7 @@
               <w:pStyle w:val="TableBody"/>
             </w:pPr>
             <w:r>
-              <w:t>6</w:t>
+              <w:t>20</w:t>
             </w:r>
           </w:p>
         </w:tc>
@@ -7285,7 +7276,7 @@
               <w:pStyle w:val="TableBody"/>
             </w:pPr>
             <w:r>
-              <w:t>0.125</w:t>
+              <w:t>0.546</w:t>
             </w:r>
           </w:p>
         </w:tc>
@@ -7311,7 +7302,7 @@
               <w:pStyle w:val="TableBody"/>
             </w:pPr>
             <w:r>
-              <w:t>PdfInfoUtilsTest</w:t>
+              <w:t>PdfImageUtilsTest</w:t>
             </w:r>
           </w:p>
         </w:tc>
@@ -7331,7 +7322,7 @@
               <w:pStyle w:val="TableBody"/>
             </w:pPr>
             <w:r>
-              <w:t>3</w:t>
+              <w:t>6</w:t>
             </w:r>
           </w:p>
         </w:tc>
@@ -7411,7 +7402,7 @@
               <w:pStyle w:val="TableBody"/>
             </w:pPr>
             <w:r>
-              <w:t>0.067</w:t>
+              <w:t>0.129</w:t>
             </w:r>
           </w:p>
         </w:tc>
@@ -7437,7 +7428,7 @@
               <w:pStyle w:val="TableBody"/>
             </w:pPr>
             <w:r>
-              <w:t>PdfServiceLimitsTest</w:t>
+              <w:t>PdfInfoUtilsTest</w:t>
             </w:r>
           </w:p>
         </w:tc>
@@ -7537,7 +7528,7 @@
               <w:pStyle w:val="TableBody"/>
             </w:pPr>
             <w:r>
-              <w:t>0.067</w:t>
+              <w:t>0.064</w:t>
             </w:r>
           </w:p>
         </w:tc>
@@ -7564,7 +7555,7 @@
             </w:pPr>
             <w:r>
               <w:lastRenderedPageBreak/>
-              <w:t>PdfSignatureUtilsTest</w:t>
+              <w:t>PdfServiceLimitsTest</w:t>
             </w:r>
           </w:p>
         </w:tc>
@@ -7584,7 +7575,7 @@
               <w:pStyle w:val="TableBody"/>
             </w:pPr>
             <w:r>
-              <w:t>9</w:t>
+              <w:t>3</w:t>
             </w:r>
           </w:p>
         </w:tc>
@@ -7664,7 +7655,7 @@
               <w:pStyle w:val="TableBody"/>
             </w:pPr>
             <w:r>
-              <w:t>1.421</w:t>
+              <w:t>0.059</w:t>
             </w:r>
           </w:p>
         </w:tc>
@@ -7690,7 +7681,7 @@
               <w:pStyle w:val="TableBody"/>
             </w:pPr>
             <w:r>
-              <w:t>PdfTableUtilsTest</w:t>
+              <w:t>PdfSignatureUtilsTest</w:t>
             </w:r>
           </w:p>
         </w:tc>
@@ -7710,7 +7701,7 @@
               <w:pStyle w:val="TableBody"/>
             </w:pPr>
             <w:r>
-              <w:t>6</w:t>
+              <w:t>9</w:t>
             </w:r>
           </w:p>
         </w:tc>
@@ -7790,7 +7781,7 @@
               <w:pStyle w:val="TableBody"/>
             </w:pPr>
             <w:r>
-              <w:t>0.122</w:t>
+              <w:t>1.346</w:t>
             </w:r>
           </w:p>
         </w:tc>
@@ -7816,7 +7807,7 @@
               <w:pStyle w:val="TableBody"/>
             </w:pPr>
             <w:r>
-              <w:t>PdfTextUtilsTest</w:t>
+              <w:t>PdfTableUtilsTest</w:t>
             </w:r>
           </w:p>
         </w:tc>
@@ -7836,7 +7827,7 @@
               <w:pStyle w:val="TableBody"/>
             </w:pPr>
             <w:r>
-              <w:t>10</w:t>
+              <w:t>6</w:t>
             </w:r>
           </w:p>
         </w:tc>
@@ -7916,7 +7907,7 @@
               <w:pStyle w:val="TableBody"/>
             </w:pPr>
             <w:r>
-              <w:t>0.15</w:t>
+              <w:t>0.133</w:t>
             </w:r>
           </w:p>
         </w:tc>
@@ -7942,6 +7933,132 @@
               <w:pStyle w:val="TableBody"/>
             </w:pPr>
             <w:r>
+              <w:t>PdfTextUtilsTest</w:t>
+            </w:r>
+          </w:p>
+        </w:tc>
+        <w:tc>
+          <w:tcPr>
+            <w:tcW w:w="794" w:type="dxa"/>
+            <w:tcMar>
+              <w:top w:w="75" w:type="dxa"/>
+              <w:left w:w="85" w:type="dxa"/>
+              <w:bottom w:w="75" w:type="dxa"/>
+              <w:right w:w="85" w:type="dxa"/>
+            </w:tcMar>
+            <w:vAlign w:val="center"/>
+          </w:tcPr>
+          <w:p>
+            <w:pPr>
+              <w:pStyle w:val="TableBody"/>
+            </w:pPr>
+            <w:r>
+              <w:t>10</w:t>
+            </w:r>
+          </w:p>
+        </w:tc>
+        <w:tc>
+          <w:tcPr>
+            <w:tcW w:w="794" w:type="dxa"/>
+            <w:tcMar>
+              <w:top w:w="75" w:type="dxa"/>
+              <w:left w:w="85" w:type="dxa"/>
+              <w:bottom w:w="75" w:type="dxa"/>
+              <w:right w:w="85" w:type="dxa"/>
+            </w:tcMar>
+            <w:vAlign w:val="center"/>
+          </w:tcPr>
+          <w:p>
+            <w:pPr>
+              <w:pStyle w:val="TableBody"/>
+            </w:pPr>
+            <w:r>
+              <w:t>0</w:t>
+            </w:r>
+          </w:p>
+        </w:tc>
+        <w:tc>
+          <w:tcPr>
+            <w:tcW w:w="794" w:type="dxa"/>
+            <w:tcMar>
+              <w:top w:w="75" w:type="dxa"/>
+              <w:left w:w="85" w:type="dxa"/>
+              <w:bottom w:w="75" w:type="dxa"/>
+              <w:right w:w="85" w:type="dxa"/>
+            </w:tcMar>
+            <w:vAlign w:val="center"/>
+          </w:tcPr>
+          <w:p>
+            <w:pPr>
+              <w:pStyle w:val="TableBody"/>
+            </w:pPr>
+            <w:r>
+              <w:t>0</w:t>
+            </w:r>
+          </w:p>
+        </w:tc>
+        <w:tc>
+          <w:tcPr>
+            <w:tcW w:w="794" w:type="dxa"/>
+            <w:tcMar>
+              <w:top w:w="75" w:type="dxa"/>
+              <w:left w:w="85" w:type="dxa"/>
+              <w:bottom w:w="75" w:type="dxa"/>
+              <w:right w:w="85" w:type="dxa"/>
+            </w:tcMar>
+            <w:vAlign w:val="center"/>
+          </w:tcPr>
+          <w:p>
+            <w:pPr>
+              <w:pStyle w:val="TableBody"/>
+            </w:pPr>
+            <w:r>
+              <w:t>0</w:t>
+            </w:r>
+          </w:p>
+        </w:tc>
+        <w:tc>
+          <w:tcPr>
+            <w:tcW w:w="1077" w:type="dxa"/>
+            <w:tcMar>
+              <w:top w:w="75" w:type="dxa"/>
+              <w:left w:w="85" w:type="dxa"/>
+              <w:bottom w:w="75" w:type="dxa"/>
+              <w:right w:w="85" w:type="dxa"/>
+            </w:tcMar>
+            <w:vAlign w:val="center"/>
+          </w:tcPr>
+          <w:p>
+            <w:pPr>
+              <w:pStyle w:val="TableBody"/>
+            </w:pPr>
+            <w:r>
+              <w:t>0.178</w:t>
+            </w:r>
+          </w:p>
+        </w:tc>
+      </w:tr>
+      <w:tr>
+        <w:trPr>
+          <w:cantSplit/>
+          <w:jc w:val="center"/>
+        </w:trPr>
+        <w:tc>
+          <w:tcPr>
+            <w:tcW w:w="4535" w:type="dxa"/>
+            <w:tcMar>
+              <w:top w:w="75" w:type="dxa"/>
+              <w:left w:w="85" w:type="dxa"/>
+              <w:bottom w:w="75" w:type="dxa"/>
+              <w:right w:w="85" w:type="dxa"/>
+            </w:tcMar>
+            <w:vAlign w:val="center"/>
+          </w:tcPr>
+          <w:p>
+            <w:pPr>
+              <w:pStyle w:val="TableBody"/>
+            </w:pPr>
+            <w:r>
               <w:t>PdfWatermarkUtilsTest</w:t>
             </w:r>
           </w:p>
@@ -8042,7 +8159,7 @@
               <w:pStyle w:val="TableBody"/>
             </w:pPr>
             <w:r>
-              <w:t>0.308</w:t>
+              <w:t>0.288</w:t>
             </w:r>
           </w:p>
         </w:tc>
@@ -8052,7 +8169,7 @@
       <w:pPr>
         <w:pStyle w:val="21"/>
       </w:pPr>
-      <w:bookmarkStart w:id="10" w:name="_Toc242965701"/>
+      <w:bookmarkStart w:id="10" w:name="_Toc242986724"/>
       <w:r>
         <w:t xml:space="preserve">3.3 </w:t>
       </w:r>
@@ -8243,7 +8360,7 @@
               <w:pStyle w:val="TableBody"/>
             </w:pPr>
             <w:r>
-              <w:t>backend/target/ai-final.log</w:t>
+              <w:t>backend/target/conversation-backend.log</w:t>
             </w:r>
           </w:p>
         </w:tc>
@@ -8263,7 +8380,7 @@
               <w:pStyle w:val="TableBody"/>
             </w:pPr>
             <w:r>
-              <w:t>a4d307e0bf70d101</w:t>
+              <w:t>85adc211fa102e07</w:t>
             </w:r>
           </w:p>
         </w:tc>
@@ -8309,7 +8426,7 @@
               <w:pStyle w:val="TableBody"/>
             </w:pPr>
             <w:r>
-              <w:t>backend/target/ai-live.log</w:t>
+              <w:t>backend/target/conversation-live.log</w:t>
             </w:r>
           </w:p>
         </w:tc>
@@ -8329,7 +8446,7 @@
               <w:pStyle w:val="TableBody"/>
             </w:pPr>
             <w:r>
-              <w:t>ae61a7cfd79b8452</w:t>
+              <w:t>7d5fc5871d01a41d</w:t>
             </w:r>
           </w:p>
         </w:tc>
@@ -8375,7 +8492,7 @@
               <w:pStyle w:val="TableBody"/>
             </w:pPr>
             <w:r>
-              <w:t>backend/target/final-vitest.log</w:t>
+              <w:t>backend/target/conversation-vitest.log</w:t>
             </w:r>
           </w:p>
         </w:tc>
@@ -8395,7 +8512,7 @@
               <w:pStyle w:val="TableBody"/>
             </w:pPr>
             <w:r>
-              <w:t>2223da17664c152b</w:t>
+              <w:t>d09d1d8f8248683d</w:t>
             </w:r>
           </w:p>
         </w:tc>
@@ -8441,7 +8558,7 @@
               <w:pStyle w:val="TableBody"/>
             </w:pPr>
             <w:r>
-              <w:t>backend/target/final-build.log</w:t>
+              <w:t>backend/target/conversation-build.log</w:t>
             </w:r>
           </w:p>
         </w:tc>
@@ -8461,7 +8578,7 @@
               <w:pStyle w:val="TableBody"/>
             </w:pPr>
             <w:r>
-              <w:t>bd6879b7a857e3af</w:t>
+              <w:t>84acb749f99841b4</w:t>
             </w:r>
           </w:p>
         </w:tc>
@@ -8507,7 +8624,7 @@
               <w:pStyle w:val="TableBody"/>
             </w:pPr>
             <w:r>
-              <w:t>backend/target/final-lint.log</w:t>
+              <w:t>backend/target/conversation-lint.log</w:t>
             </w:r>
           </w:p>
         </w:tc>
@@ -8573,7 +8690,7 @@
               <w:pStyle w:val="TableBody"/>
             </w:pPr>
             <w:r>
-              <w:t>backend/target/final-e2e.log</w:t>
+              <w:t>backend/target/conversation-e2e.log</w:t>
             </w:r>
           </w:p>
         </w:tc>
@@ -8593,7 +8710,7 @@
               <w:pStyle w:val="TableBody"/>
             </w:pPr>
             <w:r>
-              <w:t>3b9cbd999967eb58</w:t>
+              <w:t>e19f6ad5ded8deb8</w:t>
             </w:r>
           </w:p>
         </w:tc>
@@ -8639,7 +8756,7 @@
               <w:pStyle w:val="TableBody"/>
             </w:pPr>
             <w:r>
-              <w:t>backend/target/final-ai-e2e.log</w:t>
+              <w:t>backend/target/conversation-ai-e2e.log</w:t>
             </w:r>
           </w:p>
         </w:tc>
@@ -8659,7 +8776,7 @@
               <w:pStyle w:val="TableBody"/>
             </w:pPr>
             <w:r>
-              <w:t>6e257b7ed72c135c</w:t>
+              <w:t>a8791133a9a52e99</w:t>
             </w:r>
           </w:p>
         </w:tc>
@@ -8771,7 +8888,7 @@
               <w:pStyle w:val="TableBody"/>
             </w:pPr>
             <w:r>
-              <w:t>backend/target/final-openapi.json</w:t>
+              <w:t>backend/target/conversation-openapi.json</w:t>
             </w:r>
           </w:p>
         </w:tc>
@@ -8791,7 +8908,7 @@
               <w:pStyle w:val="TableBody"/>
             </w:pPr>
             <w:r>
-              <w:t>fca76cea3ea08554</w:t>
+              <w:t>37c7ebb756a88eeb</w:t>
             </w:r>
           </w:p>
         </w:tc>
@@ -8830,7 +8947,7 @@
       <w:pPr>
         <w:pStyle w:val="1"/>
       </w:pPr>
-      <w:bookmarkStart w:id="11" w:name="_Toc242965702"/>
+      <w:bookmarkStart w:id="11" w:name="_Toc242986725"/>
       <w:r>
         <w:lastRenderedPageBreak/>
         <w:t xml:space="preserve">4 </w:t>
@@ -8844,7 +8961,7 @@
       <w:pPr>
         <w:pStyle w:val="21"/>
       </w:pPr>
-      <w:bookmarkStart w:id="12" w:name="_Toc242965703"/>
+      <w:bookmarkStart w:id="12" w:name="_Toc242986726"/>
       <w:r>
         <w:t xml:space="preserve">4.1 </w:t>
       </w:r>
@@ -10508,7 +10625,7 @@
       <w:pPr>
         <w:pStyle w:val="21"/>
       </w:pPr>
-      <w:bookmarkStart w:id="13" w:name="_Toc242965704"/>
+      <w:bookmarkStart w:id="13" w:name="_Toc242986727"/>
       <w:r>
         <w:t xml:space="preserve">4.2 </w:t>
       </w:r>
@@ -11352,7 +11469,7 @@
       <w:pPr>
         <w:pStyle w:val="21"/>
       </w:pPr>
-      <w:bookmarkStart w:id="14" w:name="_Toc242965705"/>
+      <w:bookmarkStart w:id="14" w:name="_Toc242986728"/>
       <w:r>
         <w:t xml:space="preserve">4.3 </w:t>
       </w:r>
@@ -12042,7 +12159,7 @@
       <w:pPr>
         <w:pStyle w:val="1"/>
       </w:pPr>
-      <w:bookmarkStart w:id="15" w:name="_Toc242965706"/>
+      <w:bookmarkStart w:id="15" w:name="_Toc242986729"/>
       <w:r>
         <w:t xml:space="preserve">5 PDF </w:t>
       </w:r>
@@ -12055,7 +12172,7 @@
       <w:pPr>
         <w:pStyle w:val="21"/>
       </w:pPr>
-      <w:bookmarkStart w:id="16" w:name="_Toc242965707"/>
+      <w:bookmarkStart w:id="16" w:name="_Toc242986730"/>
       <w:r>
         <w:t xml:space="preserve">5.1 T01 </w:t>
       </w:r>
@@ -12119,7 +12236,7 @@
       <w:pPr>
         <w:pStyle w:val="21"/>
       </w:pPr>
-      <w:bookmarkStart w:id="17" w:name="_Toc242965708"/>
+      <w:bookmarkStart w:id="17" w:name="_Toc242986731"/>
       <w:r>
         <w:t xml:space="preserve">5.2 T02 </w:t>
       </w:r>
@@ -12189,7 +12306,7 @@
       <w:pPr>
         <w:pStyle w:val="21"/>
       </w:pPr>
-      <w:bookmarkStart w:id="18" w:name="_Toc242965709"/>
+      <w:bookmarkStart w:id="18" w:name="_Toc242986732"/>
       <w:r>
         <w:t xml:space="preserve">5.3 T03 </w:t>
       </w:r>
@@ -12257,7 +12374,7 @@
       <w:pPr>
         <w:pStyle w:val="21"/>
       </w:pPr>
-      <w:bookmarkStart w:id="19" w:name="_Toc242965710"/>
+      <w:bookmarkStart w:id="19" w:name="_Toc242986733"/>
       <w:r>
         <w:t xml:space="preserve">5.4 T04 </w:t>
       </w:r>
@@ -12339,7 +12456,7 @@
       <w:pPr>
         <w:pStyle w:val="21"/>
       </w:pPr>
-      <w:bookmarkStart w:id="20" w:name="_Toc242965711"/>
+      <w:bookmarkStart w:id="20" w:name="_Toc242986734"/>
       <w:r>
         <w:t xml:space="preserve">5.5 T05 </w:t>
       </w:r>
@@ -12409,7 +12526,7 @@
       <w:pPr>
         <w:pStyle w:val="21"/>
       </w:pPr>
-      <w:bookmarkStart w:id="21" w:name="_Toc242965712"/>
+      <w:bookmarkStart w:id="21" w:name="_Toc242986735"/>
       <w:r>
         <w:t xml:space="preserve">5.6 T06 </w:t>
       </w:r>
@@ -12479,7 +12596,7 @@
       <w:pPr>
         <w:pStyle w:val="21"/>
       </w:pPr>
-      <w:bookmarkStart w:id="22" w:name="_Toc242965713"/>
+      <w:bookmarkStart w:id="22" w:name="_Toc242986736"/>
       <w:r>
         <w:t xml:space="preserve">5.7 T07 </w:t>
       </w:r>
@@ -12555,7 +12672,7 @@
       <w:pPr>
         <w:pStyle w:val="21"/>
       </w:pPr>
-      <w:bookmarkStart w:id="23" w:name="_Toc242965714"/>
+      <w:bookmarkStart w:id="23" w:name="_Toc242986737"/>
       <w:r>
         <w:lastRenderedPageBreak/>
         <w:t xml:space="preserve">5.8 T08 </w:t>
@@ -12626,7 +12743,7 @@
       <w:pPr>
         <w:pStyle w:val="21"/>
       </w:pPr>
-      <w:bookmarkStart w:id="24" w:name="_Toc242965715"/>
+      <w:bookmarkStart w:id="24" w:name="_Toc242986738"/>
       <w:r>
         <w:t xml:space="preserve">5.9 </w:t>
       </w:r>
@@ -12731,7 +12848,7 @@
       <w:pPr>
         <w:pStyle w:val="1"/>
       </w:pPr>
-      <w:bookmarkStart w:id="25" w:name="_Toc242965716"/>
+      <w:bookmarkStart w:id="25" w:name="_Toc242986739"/>
       <w:r>
         <w:t xml:space="preserve">6 </w:t>
       </w:r>
@@ -12744,7 +12861,7 @@
       <w:pPr>
         <w:pStyle w:val="21"/>
       </w:pPr>
-      <w:bookmarkStart w:id="26" w:name="_Toc242965717"/>
+      <w:bookmarkStart w:id="26" w:name="_Toc242986740"/>
       <w:r>
         <w:t xml:space="preserve">6.1 </w:t>
       </w:r>
@@ -12758,7 +12875,7 @@
         <w:t>本组</w:t>
       </w:r>
       <w:r>
-        <w:t xml:space="preserve"> 15 </w:t>
+        <w:t xml:space="preserve"> 19 </w:t>
       </w:r>
       <w:r>
         <w:t>项用例在</w:t>
@@ -14205,6 +14322,358 @@
           </w:p>
         </w:tc>
       </w:tr>
+      <w:tr>
+        <w:trPr>
+          <w:cantSplit/>
+          <w:jc w:val="center"/>
+        </w:trPr>
+        <w:tc>
+          <w:tcPr>
+            <w:tcW w:w="1814" w:type="dxa"/>
+            <w:tcMar>
+              <w:top w:w="75" w:type="dxa"/>
+              <w:left w:w="85" w:type="dxa"/>
+              <w:bottom w:w="75" w:type="dxa"/>
+              <w:right w:w="85" w:type="dxa"/>
+            </w:tcMar>
+            <w:vAlign w:val="center"/>
+          </w:tcPr>
+          <w:p>
+            <w:pPr>
+              <w:pStyle w:val="TableBody"/>
+            </w:pPr>
+            <w:r>
+              <w:t>AI-API-16 A09</w:t>
+            </w:r>
+          </w:p>
+        </w:tc>
+        <w:tc>
+          <w:tcPr>
+            <w:tcW w:w="3402" w:type="dxa"/>
+            <w:tcMar>
+              <w:top w:w="75" w:type="dxa"/>
+              <w:left w:w="85" w:type="dxa"/>
+              <w:bottom w:w="75" w:type="dxa"/>
+              <w:right w:w="85" w:type="dxa"/>
+            </w:tcMar>
+            <w:vAlign w:val="center"/>
+          </w:tcPr>
+          <w:p>
+            <w:pPr>
+              <w:pStyle w:val="TableBody"/>
+            </w:pPr>
+            <w:r>
+              <w:t>新会话</w:t>
+            </w:r>
+            <w:r>
+              <w:t xml:space="preserve"> WELCOME </w:t>
+            </w:r>
+            <w:r>
+              <w:t>及同标识重放、再次新增欢迎；预期无用户消息且重复新增拒绝</w:t>
+            </w:r>
+          </w:p>
+        </w:tc>
+        <w:tc>
+          <w:tcPr>
+            <w:tcW w:w="3572" w:type="dxa"/>
+            <w:tcMar>
+              <w:top w:w="75" w:type="dxa"/>
+              <w:left w:w="85" w:type="dxa"/>
+              <w:bottom w:w="75" w:type="dxa"/>
+              <w:right w:w="85" w:type="dxa"/>
+            </w:tcMar>
+            <w:vAlign w:val="center"/>
+          </w:tcPr>
+          <w:p>
+            <w:pPr>
+              <w:pStyle w:val="TableBody"/>
+            </w:pPr>
+            <w:r>
+              <w:t>仅</w:t>
+            </w:r>
+            <w:r>
+              <w:t xml:space="preserve"> 1 </w:t>
+            </w:r>
+            <w:r>
+              <w:t>条助手消息；幂等</w:t>
+            </w:r>
+            <w:r>
+              <w:t xml:space="preserve"> 200</w:t>
+            </w:r>
+            <w:r>
+              <w:t>、重复新增</w:t>
+            </w:r>
+            <w:r>
+              <w:t xml:space="preserve"> 409</w:t>
+            </w:r>
+            <w:r>
+              <w:t>，标题仍为新对话；</w:t>
+            </w:r>
+            <w:r>
+              <w:t>E01</w:t>
+            </w:r>
+          </w:p>
+        </w:tc>
+      </w:tr>
+      <w:tr>
+        <w:trPr>
+          <w:cantSplit/>
+          <w:jc w:val="center"/>
+        </w:trPr>
+        <w:tc>
+          <w:tcPr>
+            <w:tcW w:w="1814" w:type="dxa"/>
+            <w:tcMar>
+              <w:top w:w="75" w:type="dxa"/>
+              <w:left w:w="85" w:type="dxa"/>
+              <w:bottom w:w="75" w:type="dxa"/>
+              <w:right w:w="85" w:type="dxa"/>
+            </w:tcMar>
+            <w:vAlign w:val="center"/>
+          </w:tcPr>
+          <w:p>
+            <w:pPr>
+              <w:pStyle w:val="TableBody"/>
+            </w:pPr>
+            <w:r>
+              <w:lastRenderedPageBreak/>
+              <w:t>AI-API-17 A08/A01</w:t>
+            </w:r>
+          </w:p>
+        </w:tc>
+        <w:tc>
+          <w:tcPr>
+            <w:tcW w:w="3402" w:type="dxa"/>
+            <w:tcMar>
+              <w:top w:w="75" w:type="dxa"/>
+              <w:left w:w="85" w:type="dxa"/>
+              <w:bottom w:w="75" w:type="dxa"/>
+              <w:right w:w="85" w:type="dxa"/>
+            </w:tcMar>
+            <w:vAlign w:val="center"/>
+          </w:tcPr>
+          <w:p>
+            <w:pPr>
+              <w:pStyle w:val="TableBody"/>
+            </w:pPr>
+            <w:r>
+              <w:t xml:space="preserve">AUTO </w:t>
+            </w:r>
+            <w:r>
+              <w:t>详细全文摘要；预期调用全部证据摘要，不执行问答重排序</w:t>
+            </w:r>
+          </w:p>
+        </w:tc>
+        <w:tc>
+          <w:tcPr>
+            <w:tcW w:w="3572" w:type="dxa"/>
+            <w:tcMar>
+              <w:top w:w="75" w:type="dxa"/>
+              <w:left w:w="85" w:type="dxa"/>
+              <w:bottom w:w="75" w:type="dxa"/>
+              <w:right w:w="85" w:type="dxa"/>
+            </w:tcMar>
+            <w:vAlign w:val="center"/>
+          </w:tcPr>
+          <w:p>
+            <w:pPr>
+              <w:pStyle w:val="TableBody"/>
+            </w:pPr>
+            <w:r>
+              <w:t>COMPLETED</w:t>
+            </w:r>
+            <w:r>
+              <w:t>；未调用</w:t>
+            </w:r>
+            <w:r>
+              <w:t xml:space="preserve"> rerank</w:t>
+            </w:r>
+            <w:r>
+              <w:t>，生成输入含详细摘要指令；</w:t>
+            </w:r>
+            <w:r>
+              <w:t>E01</w:t>
+            </w:r>
+          </w:p>
+        </w:tc>
+      </w:tr>
+      <w:tr>
+        <w:trPr>
+          <w:cantSplit/>
+          <w:jc w:val="center"/>
+        </w:trPr>
+        <w:tc>
+          <w:tcPr>
+            <w:tcW w:w="1814" w:type="dxa"/>
+            <w:tcMar>
+              <w:top w:w="75" w:type="dxa"/>
+              <w:left w:w="85" w:type="dxa"/>
+              <w:bottom w:w="75" w:type="dxa"/>
+              <w:right w:w="85" w:type="dxa"/>
+            </w:tcMar>
+            <w:vAlign w:val="center"/>
+          </w:tcPr>
+          <w:p>
+            <w:pPr>
+              <w:pStyle w:val="TableBody"/>
+            </w:pPr>
+            <w:r>
+              <w:t>AI-API-18 A08/A04</w:t>
+            </w:r>
+          </w:p>
+        </w:tc>
+        <w:tc>
+          <w:tcPr>
+            <w:tcW w:w="3402" w:type="dxa"/>
+            <w:tcMar>
+              <w:top w:w="75" w:type="dxa"/>
+              <w:left w:w="85" w:type="dxa"/>
+              <w:bottom w:w="75" w:type="dxa"/>
+              <w:right w:w="85" w:type="dxa"/>
+            </w:tcMar>
+            <w:vAlign w:val="center"/>
+          </w:tcPr>
+          <w:p>
+            <w:pPr>
+              <w:pStyle w:val="TableBody"/>
+            </w:pPr>
+            <w:r>
+              <w:t>一页</w:t>
+            </w:r>
+            <w:r>
+              <w:t xml:space="preserve"> PDF </w:t>
+            </w:r>
+            <w:r>
+              <w:t>请求第</w:t>
+            </w:r>
+            <w:r>
+              <w:t xml:space="preserve"> 3–8 </w:t>
+            </w:r>
+            <w:r>
+              <w:t>页；预期澄清且不生成文档答案</w:t>
+            </w:r>
+          </w:p>
+        </w:tc>
+        <w:tc>
+          <w:tcPr>
+            <w:tcW w:w="3572" w:type="dxa"/>
+            <w:tcMar>
+              <w:top w:w="75" w:type="dxa"/>
+              <w:left w:w="85" w:type="dxa"/>
+              <w:bottom w:w="75" w:type="dxa"/>
+              <w:right w:w="85" w:type="dxa"/>
+            </w:tcMar>
+            <w:vAlign w:val="center"/>
+          </w:tcPr>
+          <w:p>
+            <w:pPr>
+              <w:pStyle w:val="TableBody"/>
+            </w:pPr>
+            <w:r>
+              <w:t>返回共</w:t>
+            </w:r>
+            <w:r>
+              <w:t xml:space="preserve"> 1 </w:t>
+            </w:r>
+            <w:r>
+              <w:t>页提示、引用为空；未调用</w:t>
+            </w:r>
+            <w:r>
+              <w:t xml:space="preserve"> stream </w:t>
+            </w:r>
+            <w:r>
+              <w:t>或</w:t>
+            </w:r>
+            <w:r>
+              <w:t xml:space="preserve"> rerank</w:t>
+            </w:r>
+            <w:r>
+              <w:t>；</w:t>
+            </w:r>
+            <w:r>
+              <w:t>E01</w:t>
+            </w:r>
+          </w:p>
+        </w:tc>
+      </w:tr>
+      <w:tr>
+        <w:trPr>
+          <w:cantSplit/>
+          <w:jc w:val="center"/>
+        </w:trPr>
+        <w:tc>
+          <w:tcPr>
+            <w:tcW w:w="1814" w:type="dxa"/>
+            <w:tcMar>
+              <w:top w:w="75" w:type="dxa"/>
+              <w:left w:w="85" w:type="dxa"/>
+              <w:bottom w:w="75" w:type="dxa"/>
+              <w:right w:w="85" w:type="dxa"/>
+            </w:tcMar>
+            <w:vAlign w:val="center"/>
+          </w:tcPr>
+          <w:p>
+            <w:pPr>
+              <w:pStyle w:val="TableBody"/>
+            </w:pPr>
+            <w:r>
+              <w:t>AI-API-19 A08</w:t>
+            </w:r>
+          </w:p>
+        </w:tc>
+        <w:tc>
+          <w:tcPr>
+            <w:tcW w:w="3402" w:type="dxa"/>
+            <w:tcMar>
+              <w:top w:w="75" w:type="dxa"/>
+              <w:left w:w="85" w:type="dxa"/>
+              <w:bottom w:w="75" w:type="dxa"/>
+              <w:right w:w="85" w:type="dxa"/>
+            </w:tcMar>
+            <w:vAlign w:val="center"/>
+          </w:tcPr>
+          <w:p>
+            <w:pPr>
+              <w:pStyle w:val="TableBody"/>
+            </w:pPr>
+            <w:r>
+              <w:t xml:space="preserve">AUTO </w:t>
+            </w:r>
+            <w:r>
+              <w:t>空问题及额外隐藏范围；预期同步拒绝</w:t>
+            </w:r>
+          </w:p>
+        </w:tc>
+        <w:tc>
+          <w:tcPr>
+            <w:tcW w:w="3572" w:type="dxa"/>
+            <w:tcMar>
+              <w:top w:w="75" w:type="dxa"/>
+              <w:left w:w="85" w:type="dxa"/>
+              <w:bottom w:w="75" w:type="dxa"/>
+              <w:right w:w="85" w:type="dxa"/>
+            </w:tcMar>
+            <w:vAlign w:val="center"/>
+          </w:tcPr>
+          <w:p>
+            <w:pPr>
+              <w:pStyle w:val="TableBody"/>
+            </w:pPr>
+            <w:r>
+              <w:t>两类请求均</w:t>
+            </w:r>
+            <w:r>
+              <w:t xml:space="preserve"> 400</w:t>
+            </w:r>
+            <w:r>
+              <w:t>，未创建消息；</w:t>
+            </w:r>
+            <w:r>
+              <w:t>E01</w:t>
+            </w:r>
+          </w:p>
+        </w:tc>
+      </w:tr>
     </w:tbl>
     <w:p>
       <w:pPr>
@@ -14373,7 +14842,6 @@
               <w:pStyle w:val="TableBody"/>
             </w:pPr>
             <w:r>
-              <w:lastRenderedPageBreak/>
               <w:t>AI-API-02</w:t>
             </w:r>
           </w:p>
@@ -14997,12 +15465,197 @@
           </w:p>
         </w:tc>
       </w:tr>
+      <w:tr>
+        <w:trPr>
+          <w:cantSplit/>
+          <w:jc w:val="center"/>
+        </w:trPr>
+        <w:tc>
+          <w:tcPr>
+            <w:tcW w:w="1757" w:type="dxa"/>
+            <w:tcMar>
+              <w:top w:w="75" w:type="dxa"/>
+              <w:left w:w="85" w:type="dxa"/>
+              <w:bottom w:w="75" w:type="dxa"/>
+              <w:right w:w="85" w:type="dxa"/>
+            </w:tcMar>
+            <w:vAlign w:val="center"/>
+          </w:tcPr>
+          <w:p>
+            <w:pPr>
+              <w:pStyle w:val="TableBody"/>
+            </w:pPr>
+            <w:r>
+              <w:t>AI-API-16</w:t>
+            </w:r>
+          </w:p>
+        </w:tc>
+        <w:tc>
+          <w:tcPr>
+            <w:tcW w:w="7030" w:type="dxa"/>
+            <w:tcMar>
+              <w:top w:w="75" w:type="dxa"/>
+              <w:left w:w="85" w:type="dxa"/>
+              <w:bottom w:w="75" w:type="dxa"/>
+              <w:right w:w="85" w:type="dxa"/>
+            </w:tcMar>
+            <w:vAlign w:val="center"/>
+          </w:tcPr>
+          <w:p>
+            <w:pPr>
+              <w:pStyle w:val="TableBody"/>
+            </w:pPr>
+            <w:r>
+              <w:t>welcomeIsAssistantOnlyAndCannotBeDuplicated</w:t>
+            </w:r>
+          </w:p>
+        </w:tc>
+      </w:tr>
+      <w:tr>
+        <w:trPr>
+          <w:cantSplit/>
+          <w:jc w:val="center"/>
+        </w:trPr>
+        <w:tc>
+          <w:tcPr>
+            <w:tcW w:w="1757" w:type="dxa"/>
+            <w:tcMar>
+              <w:top w:w="75" w:type="dxa"/>
+              <w:left w:w="85" w:type="dxa"/>
+              <w:bottom w:w="75" w:type="dxa"/>
+              <w:right w:w="85" w:type="dxa"/>
+            </w:tcMar>
+            <w:vAlign w:val="center"/>
+          </w:tcPr>
+          <w:p>
+            <w:pPr>
+              <w:pStyle w:val="TableBody"/>
+            </w:pPr>
+            <w:r>
+              <w:t>AI-API-17</w:t>
+            </w:r>
+          </w:p>
+        </w:tc>
+        <w:tc>
+          <w:tcPr>
+            <w:tcW w:w="7030" w:type="dxa"/>
+            <w:tcMar>
+              <w:top w:w="75" w:type="dxa"/>
+              <w:left w:w="85" w:type="dxa"/>
+              <w:bottom w:w="75" w:type="dxa"/>
+              <w:right w:w="85" w:type="dxa"/>
+            </w:tcMar>
+            <w:vAlign w:val="center"/>
+          </w:tcPr>
+          <w:p>
+            <w:pPr>
+              <w:pStyle w:val="TableBody"/>
+            </w:pPr>
+            <w:r>
+              <w:t>automaticSummaryUsesFullEvidenceWithoutSearch</w:t>
+            </w:r>
+          </w:p>
+        </w:tc>
+      </w:tr>
+      <w:tr>
+        <w:trPr>
+          <w:cantSplit/>
+          <w:jc w:val="center"/>
+        </w:trPr>
+        <w:tc>
+          <w:tcPr>
+            <w:tcW w:w="1757" w:type="dxa"/>
+            <w:tcMar>
+              <w:top w:w="75" w:type="dxa"/>
+              <w:left w:w="85" w:type="dxa"/>
+              <w:bottom w:w="75" w:type="dxa"/>
+              <w:right w:w="85" w:type="dxa"/>
+            </w:tcMar>
+            <w:vAlign w:val="center"/>
+          </w:tcPr>
+          <w:p>
+            <w:pPr>
+              <w:pStyle w:val="TableBody"/>
+            </w:pPr>
+            <w:r>
+              <w:lastRenderedPageBreak/>
+              <w:t>AI-API-18</w:t>
+            </w:r>
+          </w:p>
+        </w:tc>
+        <w:tc>
+          <w:tcPr>
+            <w:tcW w:w="7030" w:type="dxa"/>
+            <w:tcMar>
+              <w:top w:w="75" w:type="dxa"/>
+              <w:left w:w="85" w:type="dxa"/>
+              <w:bottom w:w="75" w:type="dxa"/>
+              <w:right w:w="85" w:type="dxa"/>
+            </w:tcMar>
+            <w:vAlign w:val="center"/>
+          </w:tcPr>
+          <w:p>
+            <w:pPr>
+              <w:pStyle w:val="TableBody"/>
+            </w:pPr>
+            <w:r>
+              <w:t>invalidAutomaticScopeClarifiesWithoutAnswerGeneration</w:t>
+            </w:r>
+          </w:p>
+        </w:tc>
+      </w:tr>
+      <w:tr>
+        <w:trPr>
+          <w:cantSplit/>
+          <w:jc w:val="center"/>
+        </w:trPr>
+        <w:tc>
+          <w:tcPr>
+            <w:tcW w:w="1757" w:type="dxa"/>
+            <w:tcMar>
+              <w:top w:w="75" w:type="dxa"/>
+              <w:left w:w="85" w:type="dxa"/>
+              <w:bottom w:w="75" w:type="dxa"/>
+              <w:right w:w="85" w:type="dxa"/>
+            </w:tcMar>
+            <w:vAlign w:val="center"/>
+          </w:tcPr>
+          <w:p>
+            <w:pPr>
+              <w:pStyle w:val="TableBody"/>
+            </w:pPr>
+            <w:r>
+              <w:t>AI-API-19</w:t>
+            </w:r>
+          </w:p>
+        </w:tc>
+        <w:tc>
+          <w:tcPr>
+            <w:tcW w:w="7030" w:type="dxa"/>
+            <w:tcMar>
+              <w:top w:w="75" w:type="dxa"/>
+              <w:left w:w="85" w:type="dxa"/>
+              <w:bottom w:w="75" w:type="dxa"/>
+              <w:right w:w="85" w:type="dxa"/>
+            </w:tcMar>
+            <w:vAlign w:val="center"/>
+          </w:tcPr>
+          <w:p>
+            <w:pPr>
+              <w:pStyle w:val="TableBody"/>
+            </w:pPr>
+            <w:r>
+              <w:t>autoRejectsEmptyQuestionAndHiddenExplicitScope</w:t>
+            </w:r>
+          </w:p>
+        </w:tc>
+      </w:tr>
     </w:tbl>
     <w:p>
       <w:pPr>
         <w:pStyle w:val="21"/>
       </w:pPr>
-      <w:bookmarkStart w:id="27" w:name="_Toc242965718"/>
+      <w:bookmarkStart w:id="27" w:name="_Toc242986741"/>
       <w:r>
         <w:t xml:space="preserve">6.2 </w:t>
       </w:r>
@@ -15365,7 +16018,6 @@
               <w:pStyle w:val="TableBody"/>
             </w:pPr>
             <w:r>
-              <w:lastRenderedPageBreak/>
               <w:t>AI-ALG-04</w:t>
             </w:r>
           </w:p>
@@ -15419,6 +16071,93 @@
             </w:r>
             <w:r>
               <w:t>拒绝</w:t>
+            </w:r>
+          </w:p>
+        </w:tc>
+      </w:tr>
+      <w:tr>
+        <w:trPr>
+          <w:cantSplit/>
+          <w:jc w:val="center"/>
+        </w:trPr>
+        <w:tc>
+          <w:tcPr>
+            <w:tcW w:w="1587" w:type="dxa"/>
+            <w:tcMar>
+              <w:top w:w="75" w:type="dxa"/>
+              <w:left w:w="85" w:type="dxa"/>
+              <w:bottom w:w="75" w:type="dxa"/>
+              <w:right w:w="85" w:type="dxa"/>
+            </w:tcMar>
+            <w:vAlign w:val="center"/>
+          </w:tcPr>
+          <w:p>
+            <w:pPr>
+              <w:pStyle w:val="TableBody"/>
+            </w:pPr>
+            <w:r>
+              <w:t>AI-INT-01 A08</w:t>
+            </w:r>
+          </w:p>
+        </w:tc>
+        <w:tc>
+          <w:tcPr>
+            <w:tcW w:w="3572" w:type="dxa"/>
+            <w:tcMar>
+              <w:top w:w="75" w:type="dxa"/>
+              <w:left w:w="85" w:type="dxa"/>
+              <w:bottom w:w="75" w:type="dxa"/>
+              <w:right w:w="85" w:type="dxa"/>
+            </w:tcMar>
+            <w:vAlign w:val="center"/>
+          </w:tcPr>
+          <w:p>
+            <w:pPr>
+              <w:pStyle w:val="TableBody"/>
+            </w:pPr>
+            <w:r>
+              <w:t>AiIntentTest</w:t>
+            </w:r>
+            <w:r>
+              <w:t>：四类全文操作、页码和章节、五类无效范围、缺失章节、五类非法响应、历史和目录数据传递</w:t>
+            </w:r>
+          </w:p>
+        </w:tc>
+        <w:tc>
+          <w:tcPr>
+            <w:tcW w:w="3628" w:type="dxa"/>
+            <w:tcMar>
+              <w:top w:w="75" w:type="dxa"/>
+              <w:left w:w="85" w:type="dxa"/>
+              <w:bottom w:w="75" w:type="dxa"/>
+              <w:right w:w="85" w:type="dxa"/>
+            </w:tcMar>
+            <w:vAlign w:val="center"/>
+          </w:tcPr>
+          <w:p>
+            <w:pPr>
+              <w:pStyle w:val="TableBody"/>
+            </w:pPr>
+            <w:r>
+              <w:t xml:space="preserve">17 </w:t>
+            </w:r>
+            <w:r>
+              <w:t>项通过；非法范围转</w:t>
+            </w:r>
+            <w:r>
+              <w:t xml:space="preserve"> CLARIFY</w:t>
+            </w:r>
+            <w:r>
+              <w:t>，非法协议抛出</w:t>
+            </w:r>
+            <w:r>
+              <w:t xml:space="preserve"> INVALID_READING_INTENT</w:t>
+            </w:r>
+            <w:r>
+              <w:t>；</w:t>
+            </w:r>
+            <w:r>
+              <w:t>E01</w:t>
             </w:r>
           </w:p>
         </w:tc>
@@ -15472,7 +16211,7 @@
       <w:pPr>
         <w:pStyle w:val="21"/>
       </w:pPr>
-      <w:bookmarkStart w:id="28" w:name="_Toc242965719"/>
+      <w:bookmarkStart w:id="28" w:name="_Toc242986742"/>
       <w:r>
         <w:t xml:space="preserve">6.3 </w:t>
       </w:r>
@@ -15706,6 +16445,136 @@
           </w:p>
         </w:tc>
       </w:tr>
+      <w:tr>
+        <w:trPr>
+          <w:cantSplit/>
+          <w:jc w:val="center"/>
+        </w:trPr>
+        <w:tc>
+          <w:tcPr>
+            <w:tcW w:w="1587" w:type="dxa"/>
+            <w:tcMar>
+              <w:top w:w="75" w:type="dxa"/>
+              <w:left w:w="85" w:type="dxa"/>
+              <w:bottom w:w="75" w:type="dxa"/>
+              <w:right w:w="85" w:type="dxa"/>
+            </w:tcMar>
+            <w:vAlign w:val="center"/>
+          </w:tcPr>
+          <w:p>
+            <w:pPr>
+              <w:pStyle w:val="TableBody"/>
+            </w:pPr>
+            <w:r>
+              <w:lastRenderedPageBreak/>
+              <w:t>AI-LIVE-02 A08</w:t>
+            </w:r>
+          </w:p>
+        </w:tc>
+        <w:tc>
+          <w:tcPr>
+            <w:tcW w:w="3572" w:type="dxa"/>
+            <w:tcMar>
+              <w:top w:w="75" w:type="dxa"/>
+              <w:left w:w="85" w:type="dxa"/>
+              <w:bottom w:w="75" w:type="dxa"/>
+              <w:right w:w="85" w:type="dxa"/>
+            </w:tcMar>
+            <w:vAlign w:val="center"/>
+          </w:tcPr>
+          <w:p>
+            <w:pPr>
+              <w:pStyle w:val="TableBody"/>
+            </w:pPr>
+            <w:r>
+              <w:t>七类真实表达：主要内容、按章节梳理、概念、页码范围、第二章、无上下文这一章、仅目录。</w:t>
+            </w:r>
+          </w:p>
+        </w:tc>
+        <w:tc>
+          <w:tcPr>
+            <w:tcW w:w="3628" w:type="dxa"/>
+            <w:tcMar>
+              <w:top w:w="75" w:type="dxa"/>
+              <w:left w:w="85" w:type="dxa"/>
+              <w:bottom w:w="75" w:type="dxa"/>
+              <w:right w:w="85" w:type="dxa"/>
+            </w:tcMar>
+            <w:vAlign w:val="center"/>
+          </w:tcPr>
+          <w:p>
+            <w:pPr>
+              <w:pStyle w:val="TableBody"/>
+            </w:pPr>
+            <w:r>
+              <w:t xml:space="preserve">AiModelLiveIT.naturalLanguageSelectsReadingOperationAndScope </w:t>
+            </w:r>
+            <w:r>
+              <w:t>通过；模式分别为</w:t>
+            </w:r>
+            <w:r>
+              <w:t xml:space="preserve"> BRIEF</w:t>
+            </w:r>
+            <w:r>
+              <w:t>、</w:t>
+            </w:r>
+            <w:r>
+              <w:t>DETAILED</w:t>
+            </w:r>
+            <w:r>
+              <w:t>、</w:t>
+            </w:r>
+            <w:r>
+              <w:t>ASK</w:t>
+            </w:r>
+            <w:r>
+              <w:t>、</w:t>
+            </w:r>
+            <w:r>
+              <w:t>CHAPTER</w:t>
+            </w:r>
+            <w:r>
+              <w:t>、</w:t>
+            </w:r>
+            <w:r>
+              <w:t>CHAPTER</w:t>
+            </w:r>
+            <w:r>
+              <w:t>、</w:t>
+            </w:r>
+            <w:r>
+              <w:t>CLARIFY</w:t>
+            </w:r>
+            <w:r>
+              <w:t>、</w:t>
+            </w:r>
+            <w:r>
+              <w:t>OUTLINE</w:t>
+            </w:r>
+            <w:r>
+              <w:t>，页码</w:t>
+            </w:r>
+            <w:r>
+              <w:t xml:space="preserve"> 3-5</w:t>
+            </w:r>
+            <w:r>
+              <w:t>、章节</w:t>
+            </w:r>
+            <w:r>
+              <w:t xml:space="preserve"> methods</w:t>
+            </w:r>
+            <w:r>
+              <w:t>；</w:t>
+            </w:r>
+            <w:r>
+              <w:t>E02</w:t>
+            </w:r>
+            <w:r>
+              <w:t>。</w:t>
+            </w:r>
+          </w:p>
+        </w:tc>
+      </w:tr>
     </w:tbl>
     <w:p>
       <w:r>
@@ -15716,7 +16585,7 @@
       <w:pPr>
         <w:pStyle w:val="1"/>
       </w:pPr>
-      <w:bookmarkStart w:id="29" w:name="_Toc242965720"/>
+      <w:bookmarkStart w:id="29" w:name="_Toc242986743"/>
       <w:r>
         <w:t xml:space="preserve">7 </w:t>
       </w:r>
@@ -15729,7 +16598,7 @@
       <w:pPr>
         <w:pStyle w:val="21"/>
       </w:pPr>
-      <w:bookmarkStart w:id="30" w:name="_Toc242965721"/>
+      <w:bookmarkStart w:id="30" w:name="_Toc242986744"/>
       <w:r>
         <w:t xml:space="preserve">7.1 </w:t>
       </w:r>
@@ -16173,7 +17042,6 @@
               <w:pStyle w:val="TableBody"/>
             </w:pPr>
             <w:r>
-              <w:lastRenderedPageBreak/>
               <w:t>FE-01</w:t>
             </w:r>
             <w:r>
@@ -16360,16 +17228,28 @@
         <w:t>的</w:t>
       </w:r>
       <w:r>
-        <w:t xml:space="preserve"> 4 </w:t>
-      </w:r>
-      <w:r>
-        <w:t>项：合法引用可点击且</w:t>
+        <w:t xml:space="preserve"> 8 </w:t>
+      </w:r>
+      <w:r>
+        <w:t>项：引用与</w:t>
       </w:r>
       <w:r>
         <w:t xml:space="preserve"> HTML </w:t>
       </w:r>
       <w:r>
-        <w:t>转义、默认隐藏且开关保留输入、全文模式清除隐藏章节范围、加密历史密码可连续输入。</w:t>
+        <w:t>转义、欢迎生成一次及三个建议、建议通过</w:t>
+      </w:r>
+      <w:r>
+        <w:t xml:space="preserve"> AUTO </w:t>
+      </w:r>
+      <w:r>
+        <w:t>提交、输入法</w:t>
+      </w:r>
+      <w:r>
+        <w:t xml:space="preserve"> Enter</w:t>
+      </w:r>
+      <w:r>
+        <w:t>、目录返回保留草稿、无文件禁用建议、旧导入响应隔离和加密历史密码连续输入。</w:t>
       </w:r>
       <w:r>
         <w:t xml:space="preserve">E03 </w:t>
@@ -16378,7 +17258,7 @@
         <w:t>共</w:t>
       </w:r>
       <w:r>
-        <w:t xml:space="preserve"> 10 </w:t>
+        <w:t xml:space="preserve"> 14 </w:t>
       </w:r>
       <w:r>
         <w:t>项通过；</w:t>
@@ -16412,8 +17292,9 @@
       <w:pPr>
         <w:pStyle w:val="21"/>
       </w:pPr>
-      <w:bookmarkStart w:id="31" w:name="_Toc242965722"/>
-      <w:r>
+      <w:bookmarkStart w:id="31" w:name="_Toc242986745"/>
+      <w:r>
+        <w:lastRenderedPageBreak/>
         <w:t xml:space="preserve">7.2 </w:t>
       </w:r>
       <w:r>
@@ -16432,78 +17313,102 @@
         <w:t xml:space="preserve"> tests/e2e/ai.live.ts</w:t>
       </w:r>
       <w:r>
-        <w:t>：上传</w:t>
-      </w:r>
-      <w:r>
-        <w:t xml:space="preserve"> api-sample.pdf</w:t>
-      </w:r>
-      <w:r>
-        <w:t>，打开浮窗，提交</w:t>
+        <w:t>：导入</w:t>
+      </w:r>
+      <w:r>
+        <w:t xml:space="preserve"> api-sample.pdf </w:t>
+      </w:r>
+      <w:r>
+        <w:t>后打开浮窗，等待真实文档概览，验证恰好三个推荐问题且没有伪造用户消息；点击首项触发</w:t>
+      </w:r>
+      <w:r>
+        <w:t xml:space="preserve"> AUTO </w:t>
+      </w:r>
+      <w:r>
+        <w:t>摘要，再提问</w:t>
       </w:r>
       <w:r>
         <w:t xml:space="preserve"> Alpha </w:t>
       </w:r>
       <w:r>
-        <w:t>数值问题，读取真实流式回答，点击引用核对</w:t>
-      </w:r>
-      <w:r>
-        <w:t xml:space="preserve"> Alpha </w:t>
-      </w:r>
-      <w:r>
-        <w:t>原文及预览高亮；最小化、重开、刷新后恢复消息与</w:t>
-      </w:r>
-      <w:r>
-        <w:t xml:space="preserve"> PDF</w:t>
-      </w:r>
-      <w:r>
-        <w:t>，再重命名和搜索历史、生成简要摘要、指定第</w:t>
+        <w:t>数值并核对原文引用和预览高亮。随后验证最小化、重开、刷新恢复、历史重命名与搜索、越界页码澄清、指定第</w:t>
       </w:r>
       <w:r>
         <w:t xml:space="preserve"> 1 </w:t>
       </w:r>
       <w:r>
-        <w:t>页章节范围、停止、重试并追问数值。</w:t>
+        <w:t>页分析、停止重试以及回到全文的详细摘要。</w:t>
       </w:r>
     </w:p>
     <w:p>
       <w:r>
-        <w:t>预期结果：仅导入一次文档；问答与追问包含</w:t>
+        <w:t>预期结果：只导入一次文档、只生成一次欢迎内容，三个建议可见且欢迎标题不被滚动裁切；任务统一使用</w:t>
+      </w:r>
+      <w:r>
+        <w:t xml:space="preserve"> AUTO</w:t>
+      </w:r>
+      <w:r>
+        <w:t>，越界范围返回页数提示且没有引用，问答和全文摘要包含</w:t>
       </w:r>
       <w:r>
         <w:t xml:space="preserve"> 42</w:t>
       </w:r>
       <w:r>
-        <w:t>；引用存在且原文高亮；关闭和刷新保留会话；历史名称可搜索；停止为</w:t>
+        <w:t>。停止保留</w:t>
       </w:r>
       <w:r>
         <w:t xml:space="preserve"> STOPPED</w:t>
       </w:r>
       <w:r>
-        <w:t>，重试新增助手回答；浮窗不改变预览区尺寸，标签同排，</w:t>
+        <w:t>，重试完成；历史恢复不丢失文件和消息；</w:t>
       </w:r>
       <w:r>
         <w:t xml:space="preserve">960/1440/1920 px </w:t>
       </w:r>
       <w:r>
-        <w:t>不超出视口。实际结果：</w:t>
-      </w:r>
-      <w:r>
-        <w:t xml:space="preserve">2026-10-15 </w:t>
-      </w:r>
-      <w:r>
-        <w:t>复测全部断言通过，</w:t>
+        <w:t>浮窗不溢出且不改变预览区尺寸，推荐项实测字号</w:t>
+      </w:r>
+      <w:r>
+        <w:t xml:space="preserve"> 14 px</w:t>
+      </w:r>
+      <w:r>
+        <w:t>、字重</w:t>
+      </w:r>
+      <w:r>
+        <w:t xml:space="preserve"> 500</w:t>
+      </w:r>
+      <w:r>
+        <w:t>、行高</w:t>
+      </w:r>
+      <w:r>
+        <w:t xml:space="preserve"> 22 px</w:t>
+      </w:r>
+      <w:r>
+        <w:t>、点击高度至少</w:t>
+      </w:r>
+      <w:r>
+        <w:t xml:space="preserve"> 48 px</w:t>
+      </w:r>
+      <w:r>
+        <w:t>、文字对比度不低于</w:t>
+      </w:r>
+      <w:r>
+        <w:t xml:space="preserve"> 4.5:1</w:t>
+      </w:r>
+      <w:r>
+        <w:t>。实际结果：全部断言通过，</w:t>
       </w:r>
       <w:r>
         <w:t xml:space="preserve">1 </w:t>
       </w:r>
       <w:r>
-        <w:t>项流程测试耗时</w:t>
-      </w:r>
-      <w:r>
-        <w:t xml:space="preserve"> 24.3 </w:t>
-      </w:r>
-      <w:r>
-        <w:t>秒，见</w:t>
+        <w:t>项真实模型浏览器流程耗时</w:t>
+      </w:r>
+      <w:r>
+        <w:t xml:space="preserve"> 35.3s</w:t>
+      </w:r>
+      <w:r>
+        <w:t>，见</w:t>
       </w:r>
       <w:r>
         <w:t xml:space="preserve"> E06</w:t>
@@ -16522,7 +17427,6 @@
         <w:rPr>
           <w:noProof/>
         </w:rPr>
-        <w:lastRenderedPageBreak/>
         <w:drawing>
           <wp:inline distT="0" distB="0" distL="0" distR="0" wp14:anchorId="5D9449CF" wp14:editId="1CE07E7E">
             <wp:extent cx="5508000" cy="3825000"/>
@@ -16619,8 +17523,9 @@
       <w:pPr>
         <w:pStyle w:val="1"/>
       </w:pPr>
-      <w:bookmarkStart w:id="32" w:name="_Toc242965723"/>
-      <w:r>
+      <w:bookmarkStart w:id="32" w:name="_Toc242986746"/>
+      <w:r>
+        <w:lastRenderedPageBreak/>
         <w:t xml:space="preserve">8 </w:t>
       </w:r>
       <w:r>
@@ -16632,7 +17537,7 @@
       <w:pPr>
         <w:pStyle w:val="21"/>
       </w:pPr>
-      <w:bookmarkStart w:id="33" w:name="_Toc242965724"/>
+      <w:bookmarkStart w:id="33" w:name="_Toc242986747"/>
       <w:r>
         <w:t xml:space="preserve">8.1 </w:t>
       </w:r>
@@ -17007,7 +17912,6 @@
               <w:pStyle w:val="TableBody"/>
             </w:pPr>
             <w:r>
-              <w:lastRenderedPageBreak/>
               <w:t>DEF-06</w:t>
             </w:r>
           </w:p>
@@ -17088,7 +17992,7 @@
       <w:pPr>
         <w:pStyle w:val="21"/>
       </w:pPr>
-      <w:bookmarkStart w:id="34" w:name="_Toc242965725"/>
+      <w:bookmarkStart w:id="34" w:name="_Toc242986748"/>
       <w:r>
         <w:t xml:space="preserve">8.2 </w:t>
       </w:r>
@@ -17368,19 +18272,7 @@
               <w:pStyle w:val="TableBody"/>
             </w:pPr>
             <w:r>
-              <w:t>为</w:t>
-            </w:r>
-            <w:r>
-              <w:t xml:space="preserve"> .ai-tabs </w:t>
-            </w:r>
-            <w:r>
-              <w:t>指定横向；</w:t>
-            </w:r>
-            <w:r>
-              <w:t xml:space="preserve">E06 </w:t>
-            </w:r>
-            <w:r>
-              <w:t>同排断言通过。</w:t>
+              <w:t>旧版已修复横向排列；当前版本取消该标签组，以三个推荐问题和统一输入框替代。</w:t>
             </w:r>
           </w:p>
         </w:tc>
@@ -17530,19 +18422,19 @@
               <w:pStyle w:val="TableBody"/>
             </w:pPr>
             <w:r>
-              <w:t>清除范围并比较修订编号；</w:t>
+              <w:t>当前前端不发送隐藏范围，服务端从问题解析；异步结果校验修订编号。</w:t>
             </w:r>
             <w:r>
               <w:t xml:space="preserve">AI-UI-01 </w:t>
             </w:r>
             <w:r>
-              <w:t>及</w:t>
+              <w:t>的旧导入隔离及</w:t>
             </w:r>
             <w:r>
               <w:t xml:space="preserve"> E06 </w:t>
             </w:r>
             <w:r>
-              <w:t>通过。</w:t>
+              <w:t>全文回归通过。</w:t>
             </w:r>
           </w:p>
         </w:tc>
@@ -17640,6 +18532,7 @@
               <w:pStyle w:val="TableBody"/>
             </w:pPr>
             <w:r>
+              <w:lastRenderedPageBreak/>
               <w:t>AI-D06</w:t>
             </w:r>
           </w:p>
@@ -17686,19 +18579,13 @@
               <w:pStyle w:val="TableBody"/>
             </w:pPr>
             <w:r>
-              <w:t>同一浏览器求值内读取全部标签矩形，保持同排断言；首次</w:t>
-            </w:r>
-            <w:r>
-              <w:t xml:space="preserve"> E06 </w:t>
-            </w:r>
-            <w:r>
-              <w:t>失败后复测</w:t>
-            </w:r>
-            <w:r>
-              <w:t xml:space="preserve"> 1/1 </w:t>
-            </w:r>
-            <w:r>
-              <w:t>通过。</w:t>
+              <w:t>旧版改为同步测量后通过；当前标签已移除，</w:t>
+            </w:r>
+            <w:r>
+              <w:t xml:space="preserve">E06 </w:t>
+            </w:r>
+            <w:r>
+              <w:t>改为核对三条建议、欢迎标题与浮窗边界。</w:t>
             </w:r>
           </w:p>
         </w:tc>
@@ -17808,6 +18695,81 @@
           </w:p>
         </w:tc>
       </w:tr>
+      <w:tr>
+        <w:trPr>
+          <w:cantSplit/>
+          <w:jc w:val="center"/>
+        </w:trPr>
+        <w:tc>
+          <w:tcPr>
+            <w:tcW w:w="1134" w:type="dxa"/>
+            <w:tcMar>
+              <w:top w:w="75" w:type="dxa"/>
+              <w:left w:w="85" w:type="dxa"/>
+              <w:bottom w:w="75" w:type="dxa"/>
+              <w:right w:w="85" w:type="dxa"/>
+            </w:tcMar>
+            <w:vAlign w:val="center"/>
+          </w:tcPr>
+          <w:p>
+            <w:pPr>
+              <w:pStyle w:val="TableBody"/>
+            </w:pPr>
+            <w:r>
+              <w:t>AI-D08</w:t>
+            </w:r>
+          </w:p>
+        </w:tc>
+        <w:tc>
+          <w:tcPr>
+            <w:tcW w:w="3402" w:type="dxa"/>
+            <w:tcMar>
+              <w:top w:w="75" w:type="dxa"/>
+              <w:left w:w="85" w:type="dxa"/>
+              <w:bottom w:w="75" w:type="dxa"/>
+              <w:right w:w="85" w:type="dxa"/>
+            </w:tcMar>
+            <w:vAlign w:val="center"/>
+          </w:tcPr>
+          <w:p>
+            <w:pPr>
+              <w:pStyle w:val="TableBody"/>
+            </w:pPr>
+            <w:r>
+              <w:t>欢迎内容流式更新自动滚动，导致初始标题部分被遮挡。</w:t>
+            </w:r>
+          </w:p>
+        </w:tc>
+        <w:tc>
+          <w:tcPr>
+            <w:tcW w:w="4252" w:type="dxa"/>
+            <w:tcMar>
+              <w:top w:w="75" w:type="dxa"/>
+              <w:left w:w="85" w:type="dxa"/>
+              <w:bottom w:w="75" w:type="dxa"/>
+              <w:right w:w="85" w:type="dxa"/>
+            </w:tcMar>
+            <w:vAlign w:val="center"/>
+          </w:tcPr>
+          <w:p>
+            <w:pPr>
+              <w:pStyle w:val="TableBody"/>
+            </w:pPr>
+            <w:r>
+              <w:t xml:space="preserve">WELCOME </w:t>
+            </w:r>
+            <w:r>
+              <w:t>不自动滚动；消除空白段落并调整窗口高度。</w:t>
+            </w:r>
+            <w:r>
+              <w:t xml:space="preserve">E06 </w:t>
+            </w:r>
+            <w:r>
+              <w:t>标题及三个建议边界断言通过。</w:t>
+            </w:r>
+          </w:p>
+        </w:tc>
+      </w:tr>
     </w:tbl>
     <w:p>
       <w:r>
@@ -17818,7 +18780,7 @@
       <w:pPr>
         <w:pStyle w:val="1"/>
       </w:pPr>
-      <w:bookmarkStart w:id="35" w:name="_Toc242965726"/>
+      <w:bookmarkStart w:id="35" w:name="_Toc242986749"/>
       <w:r>
         <w:t xml:space="preserve">9 </w:t>
       </w:r>
@@ -17831,7 +18793,7 @@
       <w:pPr>
         <w:pStyle w:val="21"/>
       </w:pPr>
-      <w:bookmarkStart w:id="36" w:name="_Toc242965727"/>
+      <w:bookmarkStart w:id="36" w:name="_Toc242986750"/>
       <w:r>
         <w:t xml:space="preserve">9.1 </w:t>
       </w:r>
@@ -17842,18 +18804,14 @@
     </w:p>
     <w:p>
       <w:r>
-        <w:t>已执行用例支持本机版本的基础文档处理、单文档智能阅读、引用定位、生成控制和历史恢复功能进入使用验证。所有列明的最终执行结果为通过，异常场景按</w:t>
-      </w:r>
-      <w:r>
-        <w:lastRenderedPageBreak/>
-        <w:t>用例要求拒绝或进入可恢复终态。签名完整性不与证书信任混同；模型替身测试不与真实模型效果混同；历史独立密码学记录不计作本轮执行。</w:t>
+        <w:t>已执行用例支持本机版本的基础文档处理、单文档智能阅读、引用定位、生成控制和历史恢复功能进入使用验证。所有列明的最终执行结果为通过，异常场景按用例要求拒绝或进入可恢复终态。签名完整性不与证书信任混同；模型替身测试不与真实模型效果混同；历史独立密码学记录不计作本轮执行。</w:t>
       </w:r>
     </w:p>
     <w:p>
       <w:pPr>
         <w:pStyle w:val="21"/>
       </w:pPr>
-      <w:bookmarkStart w:id="37" w:name="_Toc242965728"/>
+      <w:bookmarkStart w:id="37" w:name="_Toc242986751"/>
       <w:r>
         <w:t xml:space="preserve">9.2 </w:t>
       </w:r>
@@ -18225,6 +19183,7 @@
               <w:pStyle w:val="TableBody"/>
             </w:pPr>
             <w:r>
+              <w:lastRenderedPageBreak/>
               <w:t>安全验证</w:t>
             </w:r>
           </w:p>
@@ -18460,7 +19419,7 @@
       <w:pPr>
         <w:pStyle w:val="1"/>
       </w:pPr>
-      <w:bookmarkStart w:id="38" w:name="_Toc242965729"/>
+      <w:bookmarkStart w:id="38" w:name="_Toc242986752"/>
       <w:r>
         <w:t xml:space="preserve">10 </w:t>
       </w:r>
@@ -19079,7 +20038,6 @@
               <w:spacing w:before="0" w:after="20" w:line="264" w:lineRule="auto"/>
             </w:pPr>
             <w:r>
-              <w:lastRenderedPageBreak/>
               <w:t>FR-10</w:t>
             </w:r>
           </w:p>
@@ -19920,6 +20878,7 @@
               <w:spacing w:before="0" w:after="20" w:line="264" w:lineRule="auto"/>
             </w:pPr>
             <w:r>
+              <w:lastRenderedPageBreak/>
               <w:t>A06</w:t>
             </w:r>
           </w:p>
@@ -20785,6 +21744,240 @@
             </w:r>
             <w:r>
               <w:t>AI-UI-01</w:t>
+            </w:r>
+          </w:p>
+        </w:tc>
+      </w:tr>
+      <w:tr>
+        <w:trPr>
+          <w:cantSplit/>
+          <w:jc w:val="center"/>
+        </w:trPr>
+        <w:tc>
+          <w:tcPr>
+            <w:tcW w:w="1332" w:type="dxa"/>
+            <w:tcMar>
+              <w:top w:w="50" w:type="dxa"/>
+              <w:left w:w="85" w:type="dxa"/>
+              <w:bottom w:w="50" w:type="dxa"/>
+              <w:right w:w="85" w:type="dxa"/>
+            </w:tcMar>
+            <w:vAlign w:val="center"/>
+          </w:tcPr>
+          <w:p>
+            <w:pPr>
+              <w:pStyle w:val="TableBody"/>
+              <w:spacing w:before="0" w:after="20" w:line="264" w:lineRule="auto"/>
+            </w:pPr>
+            <w:r>
+              <w:t>A08</w:t>
+            </w:r>
+          </w:p>
+        </w:tc>
+        <w:tc>
+          <w:tcPr>
+            <w:tcW w:w="1587" w:type="dxa"/>
+            <w:tcMar>
+              <w:top w:w="50" w:type="dxa"/>
+              <w:left w:w="85" w:type="dxa"/>
+              <w:bottom w:w="50" w:type="dxa"/>
+              <w:right w:w="85" w:type="dxa"/>
+            </w:tcMar>
+            <w:vAlign w:val="center"/>
+          </w:tcPr>
+          <w:p>
+            <w:pPr>
+              <w:pStyle w:val="TableBody"/>
+              <w:spacing w:before="0" w:after="20" w:line="264" w:lineRule="auto"/>
+            </w:pPr>
+            <w:r>
+              <w:t xml:space="preserve">D15/D10 </w:t>
+            </w:r>
+            <w:r>
+              <w:t>自然语言阅读</w:t>
+            </w:r>
+          </w:p>
+        </w:tc>
+        <w:tc>
+          <w:tcPr>
+            <w:tcW w:w="3175" w:type="dxa"/>
+            <w:tcMar>
+              <w:top w:w="50" w:type="dxa"/>
+              <w:left w:w="85" w:type="dxa"/>
+              <w:bottom w:w="50" w:type="dxa"/>
+              <w:right w:w="85" w:type="dxa"/>
+            </w:tcMar>
+            <w:vAlign w:val="center"/>
+          </w:tcPr>
+          <w:p>
+            <w:pPr>
+              <w:pStyle w:val="TableBody"/>
+              <w:spacing w:before="0" w:after="20" w:line="264" w:lineRule="auto"/>
+            </w:pPr>
+            <w:r>
+              <w:t>AiIntent.resolve</w:t>
+            </w:r>
+            <w:r>
+              <w:t>；</w:t>
+            </w:r>
+            <w:r>
+              <w:t>AiReading.generate</w:t>
+            </w:r>
+          </w:p>
+        </w:tc>
+        <w:tc>
+          <w:tcPr>
+            <w:tcW w:w="2693" w:type="dxa"/>
+            <w:tcMar>
+              <w:top w:w="50" w:type="dxa"/>
+              <w:left w:w="85" w:type="dxa"/>
+              <w:bottom w:w="50" w:type="dxa"/>
+              <w:right w:w="85" w:type="dxa"/>
+            </w:tcMar>
+            <w:vAlign w:val="center"/>
+          </w:tcPr>
+          <w:p>
+            <w:pPr>
+              <w:pStyle w:val="TableBody"/>
+              <w:spacing w:before="0" w:after="20" w:line="264" w:lineRule="auto"/>
+            </w:pPr>
+            <w:r>
+              <w:t>AI-INT-01</w:t>
+            </w:r>
+            <w:r>
+              <w:t>；</w:t>
+            </w:r>
+            <w:r>
+              <w:t>AI-API-17</w:t>
+            </w:r>
+            <w:r>
+              <w:t>～</w:t>
+            </w:r>
+            <w:r>
+              <w:t>19</w:t>
+            </w:r>
+            <w:r>
+              <w:t>；</w:t>
+            </w:r>
+            <w:r>
+              <w:t>AI-LIVE-02</w:t>
+            </w:r>
+          </w:p>
+        </w:tc>
+      </w:tr>
+      <w:tr>
+        <w:trPr>
+          <w:cantSplit/>
+          <w:jc w:val="center"/>
+        </w:trPr>
+        <w:tc>
+          <w:tcPr>
+            <w:tcW w:w="1332" w:type="dxa"/>
+            <w:tcMar>
+              <w:top w:w="50" w:type="dxa"/>
+              <w:left w:w="85" w:type="dxa"/>
+              <w:bottom w:w="50" w:type="dxa"/>
+              <w:right w:w="85" w:type="dxa"/>
+            </w:tcMar>
+            <w:vAlign w:val="center"/>
+          </w:tcPr>
+          <w:p>
+            <w:pPr>
+              <w:pStyle w:val="TableBody"/>
+              <w:spacing w:before="0" w:after="20" w:line="264" w:lineRule="auto"/>
+            </w:pPr>
+            <w:r>
+              <w:t>A09</w:t>
+            </w:r>
+          </w:p>
+        </w:tc>
+        <w:tc>
+          <w:tcPr>
+            <w:tcW w:w="1587" w:type="dxa"/>
+            <w:tcMar>
+              <w:top w:w="50" w:type="dxa"/>
+              <w:left w:w="85" w:type="dxa"/>
+              <w:bottom w:w="50" w:type="dxa"/>
+              <w:right w:w="85" w:type="dxa"/>
+            </w:tcMar>
+            <w:vAlign w:val="center"/>
+          </w:tcPr>
+          <w:p>
+            <w:pPr>
+              <w:pStyle w:val="TableBody"/>
+              <w:spacing w:before="0" w:after="20" w:line="264" w:lineRule="auto"/>
+            </w:pPr>
+            <w:r>
+              <w:t xml:space="preserve">D11/D13 </w:t>
+            </w:r>
+            <w:r>
+              <w:t>欢迎与建议</w:t>
+            </w:r>
+          </w:p>
+        </w:tc>
+        <w:tc>
+          <w:tcPr>
+            <w:tcW w:w="3175" w:type="dxa"/>
+            <w:tcMar>
+              <w:top w:w="50" w:type="dxa"/>
+              <w:left w:w="85" w:type="dxa"/>
+              <w:bottom w:w="50" w:type="dxa"/>
+              <w:right w:w="85" w:type="dxa"/>
+            </w:tcMar>
+            <w:vAlign w:val="center"/>
+          </w:tcPr>
+          <w:p>
+            <w:pPr>
+              <w:pStyle w:val="TableBody"/>
+              <w:spacing w:before="0" w:after="20" w:line="264" w:lineRule="auto"/>
+            </w:pPr>
+            <w:r>
+              <w:t>AiRuns.start</w:t>
+            </w:r>
+            <w:r>
+              <w:t>；</w:t>
+            </w:r>
+            <w:r>
+              <w:t>useAiAssistant</w:t>
+            </w:r>
+            <w:r>
+              <w:t>；</w:t>
+            </w:r>
+            <w:r>
+              <w:t>AiSuggestions</w:t>
+            </w:r>
+          </w:p>
+        </w:tc>
+        <w:tc>
+          <w:tcPr>
+            <w:tcW w:w="2693" w:type="dxa"/>
+            <w:tcMar>
+              <w:top w:w="50" w:type="dxa"/>
+              <w:left w:w="85" w:type="dxa"/>
+              <w:bottom w:w="50" w:type="dxa"/>
+              <w:right w:w="85" w:type="dxa"/>
+            </w:tcMar>
+            <w:vAlign w:val="center"/>
+          </w:tcPr>
+          <w:p>
+            <w:pPr>
+              <w:pStyle w:val="TableBody"/>
+              <w:spacing w:before="0" w:after="20" w:line="264" w:lineRule="auto"/>
+            </w:pPr>
+            <w:r>
+              <w:t>AI-API-16</w:t>
+            </w:r>
+            <w:r>
+              <w:t>；</w:t>
+            </w:r>
+            <w:r>
+              <w:t>AI-UI-01</w:t>
+            </w:r>
+            <w:r>
+              <w:t>；</w:t>
+            </w:r>
+            <w:r>
+              <w:t>AI-E2E-01</w:t>
             </w:r>
           </w:p>
         </w:tc>
@@ -22540,6 +23733,7 @@
     <w:qFormat/>
     <w:rsid w:val="00FC693F"/>
     <w:pPr>
+      <w:spacing w:before="0" w:after="0" w:line="240" w:lineRule="auto"/>
       <w:outlineLvl w:val="9"/>
     </w:pPr>
     <w:rPr>
@@ -32627,7 +33821,7 @@
   <w:style w:type="paragraph" w:customStyle="1" w:styleId="TOC11">
     <w:name w:val="TOC 11"/>
     <w:pPr>
-      <w:spacing w:after="0" w:line="264" w:lineRule="auto"/>
+      <w:spacing w:after="0" w:line="240" w:lineRule="auto"/>
     </w:pPr>
     <w:rPr>
       <w:rFonts w:ascii="Times New Roman" w:eastAsia="宋体" w:hAnsi="Times New Roman" w:cs="Times New Roman"/>
@@ -32638,7 +33832,7 @@
   <w:style w:type="paragraph" w:customStyle="1" w:styleId="TOC21">
     <w:name w:val="TOC 21"/>
     <w:pPr>
-      <w:spacing w:after="0" w:line="264" w:lineRule="auto"/>
+      <w:spacing w:after="0" w:line="240" w:lineRule="auto"/>
       <w:ind w:left="240"/>
     </w:pPr>
     <w:rPr>
@@ -32650,7 +33844,7 @@
   <w:style w:type="paragraph" w:customStyle="1" w:styleId="TOC31">
     <w:name w:val="TOC 31"/>
     <w:pPr>
-      <w:spacing w:after="0" w:line="264" w:lineRule="auto"/>
+      <w:spacing w:after="0" w:line="240" w:lineRule="auto"/>
       <w:ind w:left="480"/>
     </w:pPr>
     <w:rPr>
@@ -32668,7 +33862,7 @@
     <w:unhideWhenUsed/>
     <w:rsid w:val="00CA51C1"/>
     <w:pPr>
-      <w:spacing w:after="0" w:line="264" w:lineRule="auto"/>
+      <w:spacing w:after="0" w:line="240" w:lineRule="auto"/>
       <w:ind w:firstLineChars="0" w:firstLine="0"/>
     </w:pPr>
   </w:style>
@@ -32681,7 +33875,7 @@
     <w:unhideWhenUsed/>
     <w:rsid w:val="00CA51C1"/>
     <w:pPr>
-      <w:spacing w:after="0" w:line="264" w:lineRule="auto"/>
+      <w:spacing w:after="0" w:line="240" w:lineRule="auto"/>
       <w:ind w:left="240" w:firstLineChars="0" w:firstLine="0"/>
     </w:pPr>
   </w:style>

</xml_diff>